<commit_message>
Regenerate demo docx files after skills wiring
Verified all three demo reports (shuk, takan_19, pinui_binui) generate
without errors after the skill_loader migration.
</commit_message>
<xml_diff>
--- a/demo_pinui_binui.docx
+++ b/demo_pinui_binui.docx
@@ -30,7 +30,7 @@
                 <w:b/>
                 <w:bCs/>
               </w:rPr>
-              <w:t xml:space="preserve">חוות דעת — שומת מקרקעין — מלאה</w:t>
+              <w:t xml:space="preserve">חוות דעת - שומת מקרקעין — מלאה</w:t>
             </w:r>
           </w:p>
         </w:tc>
@@ -1008,7 +1008,7 @@
           <w:sz w:val="24"/>
           <w:szCs w:val="24"/>
         </w:rPr>
-        <w:t>נשוא חוות הדעת ממוקם ברחוב ביאליק, המהווה רחוב פנימי דו-סטרי.</w:t>
+        <w:t>רחוב הרצל הינו רחוב שכונתי שקט, דו-סטרי, המחבר בין רחוב ז'בוטינסקי בצפון לרחוב ביאליק בדרום. לאורכו בנייני מגורים בני 4-6 קומות, ללא מסחר. בקצהו הצפוני גן ילדים עירוני.</w:t>
       </w:r>
     </w:p>
     <w:p>
@@ -1467,7 +1467,7 @@
           <w:sz w:val="24"/>
           <w:szCs w:val="24"/>
         </w:rPr>
-        <w:t>היתר בנייה מספר 1985/4521 מתאריך 12/06/1985, אשר התיר בניין מגורים בן 8 קומות הכולל 32 יחידות דיור.</w:t>
+        <w:t>היתר בניה מספר 1985/4521 מתאריך 12/06/1985, אשר התיר בניין מגורים בן 8 קומות הכולל 32 יחידות דיור.</w:t>
       </w:r>
     </w:p>
     <w:p>
@@ -2490,7 +2490,7 @@
           <w:sz w:val="24"/>
           <w:szCs w:val="24"/>
         </w:rPr>
-        <w:t>בהתאם לתכניות בניין עיר שבתוקף החלקה מסווגת ביעוד 'מגורים ג' מיוחד'.</w:t>
+        <w:t>בהתאם לתכניות בניין עיר שבתוקף החלקה בה ממוקמת הדירה שבנדון מסווגת ביעוד 'מגורים ג' מיוחד'.</w:t>
       </w:r>
     </w:p>
     <w:p>
@@ -2517,7 +2517,7 @@
           <w:sz w:val="24"/>
           <w:szCs w:val="24"/>
         </w:rPr>
-        <w:t>הדירה שבנדון בנויה בהתאם להיתר בנייה משנת 1985.</w:t>
+        <w:t>הדירה שבנדון בנויה בהתאם להיתר בניה משנת 1985.</w:t>
       </w:r>
     </w:p>
     <w:p>
@@ -2590,7 +2590,7 @@
           <w:sz w:val="24"/>
           <w:szCs w:val="24"/>
         </w:rPr>
-        <w:t>החלקה נרשמה בפנקס הבתים המשותפים, באופן בו כל תת חלקה מהווה יחידה עצמאית.</w:t>
+        <w:t>החלקה בה ממוקמת הדירה שבנדון נרשמה בפנקס הבתים המשותפים, באופן בו כל תת חלקה מהווה יחידה עצמאית מבחינה משפטית.</w:t>
       </w:r>
     </w:p>
     <w:p>
@@ -2717,7 +2717,7 @@
           <w:sz w:val="24"/>
           <w:szCs w:val="24"/>
         </w:rPr>
-        <w:t>הובא בחשבון מצב שוק המקרקעין ומחירי נכסים דומים ורלוונטיים בסביבת הנכס.</w:t>
+        <w:t>הובא בחשבון מצב שוק המקרקעין ומחירי נכסים דומים ורלוונטיים בסביבת הנכס וסביב המועד הקובע לחוות הדעת.</w:t>
       </w:r>
     </w:p>
     <w:p>
@@ -3989,7 +3989,7 @@
           <w:sz w:val="24"/>
           <w:szCs w:val="24"/>
         </w:rPr>
-        <w:t>שומה זו הוכנה עבור מזמינה ולמטרתה בלבד. אין היא מהווה תחליף לייעוץ משפטי ואין להסתמך עליה לכל מטרה אחרת.</w:t>
+        <w:t>שומה זו הוכנה עבור מזמינה ולמטרתה בלבד. אין היא מהווה תחליף לייעוץ משפטי ואין להסתמך עליה לכל מטרה אחרת. השימוש בשומה נאסר על כל צד שלישי שהוא, אשר אינו המזמין ועורך השומה לא יהא אחראי להסתמכות כלשהי כאמור.</w:t>
       </w:r>
     </w:p>
     <w:sectPr>

</xml_diff>

<commit_message>
Align Word report visuals with the office's source format
Reworks docx_utils.py and report_generator.py so the generated reports
match the appraiser's hand-produced documents: A4 page size, David font,
Hebrew bidi document language, RTL tables (bidiVisual), branded
header/footer, a cover page, and a borderless property-details layout.
Also fixes the 5.0-rooms float rendering and updates the goldens.

Public API of docx_utils (make_rtl_doc, add_para, add_heading, add_bullet,
set_cell, make_table) and of report_generator (generate_report,
generate_report_bytes) is unchanged.
</commit_message>
<xml_diff>
--- a/demo_pinui_binui.docx
+++ b/demo_pinui_binui.docx
@@ -7,14 +7,126 @@
         <w:tblStyle w:val="TableGrid"/>
         <w:tblW w:type="auto" w:w="0"/>
         <w:tblLook w:firstColumn="1" w:firstRow="1" w:lastColumn="0" w:lastRow="0" w:noHBand="0" w:noVBand="1" w:val="04A0"/>
+        <w:bidiVisual/>
       </w:tblPr>
       <w:tblGrid>
-        <w:gridCol w:w="9406"/>
+        <w:gridCol w:w="8306"/>
       </w:tblGrid>
       <w:tr>
         <w:tc>
           <w:tcPr>
-            <w:tcW w:type="dxa" w:w="9406"/>
+            <w:tcW w:type="dxa" w:w="8306"/>
+            <w:shd w:val="clear" w:color="auto" w:fill="D9D9D9"/>
+          </w:tcPr>
+          <w:p>
+            <w:pPr>
+              <w:bidi w:val="1"/>
+              <w:spacing w:after="80"/>
+              <w:jc w:val="center"/>
+            </w:pPr>
+            <w:r>
+              <w:rPr>
+                <w:b/>
+                <w:rtl/>
+                <w:rFonts w:ascii="David" w:hAnsi="David" w:cs="David"/>
+                <w:sz w:val="32"/>
+                <w:szCs w:val="32"/>
+                <w:b/>
+                <w:bCs/>
+                <w:u w:val="single"/>
+              </w:rPr>
+              <w:t>חוות דעת - שומת מקרקעין מלאה</w:t>
+            </w:r>
+          </w:p>
+          <w:p>
+            <w:pPr>
+              <w:bidi w:val="1"/>
+              <w:spacing w:after="80"/>
+              <w:jc w:val="center"/>
+            </w:pPr>
+            <w:r>
+              <w:rPr>
+                <w:b/>
+                <w:rtl/>
+                <w:rFonts w:ascii="David" w:hAnsi="David" w:cs="David"/>
+                <w:sz w:val="28"/>
+                <w:szCs w:val="28"/>
+                <w:b/>
+                <w:bCs/>
+                <w:u w:val="single"/>
+              </w:rPr>
+              <w:t>הנדון: אומדן שווי דירת 4 חדרים</w:t>
+            </w:r>
+          </w:p>
+          <w:p>
+            <w:pPr>
+              <w:bidi w:val="1"/>
+              <w:spacing w:after="80"/>
+              <w:jc w:val="center"/>
+            </w:pPr>
+            <w:r>
+              <w:rPr>
+                <w:b/>
+                <w:rtl/>
+                <w:rFonts w:ascii="David" w:hAnsi="David" w:cs="David"/>
+                <w:sz w:val="28"/>
+                <w:szCs w:val="28"/>
+                <w:b/>
+                <w:bCs/>
+                <w:u w:val="single"/>
+              </w:rPr>
+              <w:t>תת חלקה 8, חלקה 27 בגוש 6130</w:t>
+            </w:r>
+          </w:p>
+          <w:p>
+            <w:pPr>
+              <w:bidi w:val="1"/>
+              <w:spacing w:after="80"/>
+              <w:jc w:val="center"/>
+            </w:pPr>
+            <w:r>
+              <w:rPr>
+                <w:b/>
+                <w:rtl/>
+                <w:rFonts w:ascii="David" w:hAnsi="David" w:cs="David"/>
+                <w:sz w:val="28"/>
+                <w:szCs w:val="28"/>
+                <w:b/>
+                <w:bCs/>
+                <w:u w:val="single"/>
+              </w:rPr>
+              <w:t>רחוב ביאליק 15, רמת גן</w:t>
+            </w:r>
+          </w:p>
+        </w:tc>
+      </w:tr>
+    </w:tbl>
+    <w:p>
+      <w:pPr>
+        <w:bidi w:val="1"/>
+        <w:spacing w:before="0" w:after="240"/>
+        <w:jc w:val="right"/>
+      </w:pPr>
+    </w:p>
+    <w:p>
+      <w:r>
+        <w:br w:type="page"/>
+      </w:r>
+    </w:p>
+    <w:tbl>
+      <w:tblPr>
+        <w:tblStyle w:val="TableGrid"/>
+        <w:tblW w:type="auto" w:w="0"/>
+        <w:tblLook w:firstColumn="1" w:firstRow="1" w:lastColumn="0" w:lastRow="0" w:noHBand="0" w:noVBand="1" w:val="04A0"/>
+        <w:bidiVisual/>
+      </w:tblPr>
+      <w:tblGrid>
+        <w:gridCol w:w="8306"/>
+      </w:tblGrid>
+      <w:tr>
+        <w:tc>
+          <w:tcPr>
+            <w:tcW w:type="dxa" w:w="8306"/>
           </w:tcPr>
           <w:p>
             <w:pPr>
@@ -24,7 +136,7 @@
             <w:r>
               <w:rPr>
                 <w:rtl/>
-                <w:rFonts w:ascii="Arial" w:hAnsi="Arial" w:cs="Arial"/>
+                <w:rFonts w:ascii="David" w:hAnsi="David" w:cs="David"/>
                 <w:sz w:val="32"/>
                 <w:szCs w:val="32"/>
                 <w:b/>
@@ -38,7 +150,7 @@
       <w:tr>
         <w:tc>
           <w:tcPr>
-            <w:tcW w:type="dxa" w:w="9406"/>
+            <w:tcW w:type="dxa" w:w="8306"/>
           </w:tcPr>
           <w:p>
             <w:pPr>
@@ -48,13 +160,13 @@
             <w:r>
               <w:rPr>
                 <w:rtl/>
-                <w:rFonts w:ascii="Arial" w:hAnsi="Arial" w:cs="Arial"/>
+                <w:rFonts w:ascii="David" w:hAnsi="David" w:cs="David"/>
                 <w:sz w:val="26"/>
                 <w:szCs w:val="26"/>
                 <w:b/>
                 <w:bCs/>
               </w:rPr>
-              <w:t xml:space="preserve">הנדון: אומדן שווי שוק בין קונה מרצון למוכר מרצון — פינוי-בינוי (שתי חלופות) — דירת 4.0 חדרים</w:t>
+              <w:t xml:space="preserve">הנדון: אומדן שווי שוק בין קונה מרצון למוכר מרצון — פינוי-בינוי (שתי חלופות) — דירת 4 חדרים</w:t>
             </w:r>
           </w:p>
         </w:tc>
@@ -62,7 +174,7 @@
       <w:tr>
         <w:tc>
           <w:tcPr>
-            <w:tcW w:type="dxa" w:w="9406"/>
+            <w:tcW w:type="dxa" w:w="8306"/>
           </w:tcPr>
           <w:p>
             <w:pPr>
@@ -72,7 +184,7 @@
             <w:r>
               <w:rPr>
                 <w:rtl/>
-                <w:rFonts w:ascii="Arial" w:hAnsi="Arial" w:cs="Arial"/>
+                <w:rFonts w:ascii="David" w:hAnsi="David" w:cs="David"/>
                 <w:sz w:val="24"/>
                 <w:szCs w:val="24"/>
               </w:rPr>
@@ -84,7 +196,7 @@
       <w:tr>
         <w:tc>
           <w:tcPr>
-            <w:tcW w:type="dxa" w:w="9406"/>
+            <w:tcW w:type="dxa" w:w="8306"/>
           </w:tcPr>
           <w:p>
             <w:pPr>
@@ -94,7 +206,7 @@
             <w:r>
               <w:rPr>
                 <w:rtl/>
-                <w:rFonts w:ascii="Arial" w:hAnsi="Arial" w:cs="Arial"/>
+                <w:rFonts w:ascii="David" w:hAnsi="David" w:cs="David"/>
                 <w:sz w:val="24"/>
                 <w:szCs w:val="24"/>
               </w:rPr>
@@ -121,7 +233,7 @@
         <w:rPr>
           <w:b w:val="0"/>
           <w:rtl/>
-          <w:rFonts w:ascii="Arial" w:hAnsi="Arial" w:cs="Arial"/>
+          <w:rFonts w:ascii="David" w:hAnsi="David" w:cs="David"/>
           <w:sz w:val="24"/>
           <w:szCs w:val="24"/>
         </w:rPr>
@@ -138,7 +250,7 @@
         <w:rPr>
           <w:b w:val="0"/>
           <w:rtl/>
-          <w:rFonts w:ascii="Arial" w:hAnsi="Arial" w:cs="Arial"/>
+          <w:rFonts w:ascii="David" w:hAnsi="David" w:cs="David"/>
           <w:sz w:val="24"/>
           <w:szCs w:val="24"/>
         </w:rPr>
@@ -155,7 +267,7 @@
         <w:rPr>
           <w:b w:val="0"/>
           <w:rtl/>
-          <w:rFonts w:ascii="Arial" w:hAnsi="Arial" w:cs="Arial"/>
+          <w:rFonts w:ascii="David" w:hAnsi="David" w:cs="David"/>
           <w:sz w:val="24"/>
           <w:szCs w:val="24"/>
         </w:rPr>
@@ -172,7 +284,7 @@
         <w:rPr>
           <w:b w:val="0"/>
           <w:rtl/>
-          <w:rFonts w:ascii="Arial" w:hAnsi="Arial" w:cs="Arial"/>
+          <w:rFonts w:ascii="David" w:hAnsi="David" w:cs="David"/>
           <w:sz w:val="24"/>
           <w:szCs w:val="24"/>
         </w:rPr>
@@ -189,7 +301,7 @@
         <w:rPr>
           <w:b w:val="0"/>
           <w:rtl/>
-          <w:rFonts w:ascii="Arial" w:hAnsi="Arial" w:cs="Arial"/>
+          <w:rFonts w:ascii="David" w:hAnsi="David" w:cs="David"/>
           <w:sz w:val="24"/>
           <w:szCs w:val="24"/>
         </w:rPr>
@@ -206,7 +318,7 @@
         <w:rPr>
           <w:b w:val="0"/>
           <w:rtl/>
-          <w:rFonts w:ascii="Arial" w:hAnsi="Arial" w:cs="Arial"/>
+          <w:rFonts w:ascii="David" w:hAnsi="David" w:cs="David"/>
           <w:sz w:val="24"/>
           <w:szCs w:val="24"/>
         </w:rPr>
@@ -228,688 +340,691 @@
         <w:rPr>
           <w:b/>
           <w:rtl/>
-          <w:rFonts w:ascii="Arial" w:hAnsi="Arial" w:cs="Arial"/>
-          <w:sz w:val="26"/>
-          <w:szCs w:val="26"/>
+          <w:rFonts w:ascii="David" w:hAnsi="David" w:cs="David"/>
+          <w:sz w:val="24"/>
+          <w:szCs w:val="24"/>
           <w:b/>
           <w:bCs/>
+          <w:u w:val="single"/>
         </w:rPr>
         <w:t>פרטי הנכס</w:t>
       </w:r>
     </w:p>
-    <w:tbl>
-      <w:tblPr>
-        <w:tblStyle w:val="TableGrid"/>
-        <w:tblW w:type="auto" w:w="0"/>
-        <w:tblLook w:firstColumn="1" w:firstRow="1" w:lastColumn="0" w:lastRow="0" w:noHBand="0" w:noVBand="1" w:val="04A0"/>
-      </w:tblPr>
-      <w:tblGrid>
-        <w:gridCol w:w="4703"/>
-        <w:gridCol w:w="4703"/>
-      </w:tblGrid>
-      <w:tr>
-        <w:tc>
-          <w:tcPr>
-            <w:tcW w:type="dxa" w:w="2551"/>
-          </w:tcPr>
-          <w:p>
-            <w:pPr>
-              <w:bidi w:val="1"/>
-              <w:jc w:val="right"/>
-            </w:pPr>
-            <w:r>
-              <w:rPr>
-                <w:rtl/>
-                <w:rFonts w:ascii="Arial" w:hAnsi="Arial" w:cs="Arial"/>
-                <w:sz w:val="24"/>
-                <w:szCs w:val="24"/>
-                <w:b/>
-                <w:bCs/>
-              </w:rPr>
-              <w:t xml:space="preserve">מטרת חוות הדעת</w:t>
-            </w:r>
-          </w:p>
-        </w:tc>
-        <w:tc>
-          <w:tcPr>
-            <w:tcW w:type="dxa" w:w="6520"/>
-          </w:tcPr>
-          <w:p>
-            <w:pPr>
-              <w:bidi w:val="1"/>
-              <w:jc w:val="right"/>
-            </w:pPr>
-            <w:r>
-              <w:rPr>
-                <w:rtl/>
-                <w:rFonts w:ascii="Arial" w:hAnsi="Arial" w:cs="Arial"/>
-                <w:sz w:val="24"/>
-                <w:szCs w:val="24"/>
-              </w:rPr>
-              <w:t xml:space="preserve">אומדן שווי שוק בין קונה מרצון למוכר מרצון — פינוי-בינוי (שתי חלופות)</w:t>
-            </w:r>
-          </w:p>
-        </w:tc>
-      </w:tr>
-      <w:tr>
-        <w:tc>
-          <w:tcPr>
-            <w:tcW w:type="dxa" w:w="2551"/>
-          </w:tcPr>
-          <w:p>
-            <w:pPr>
-              <w:bidi w:val="1"/>
-              <w:jc w:val="right"/>
-            </w:pPr>
-            <w:r>
-              <w:rPr>
-                <w:rtl/>
-                <w:rFonts w:ascii="Arial" w:hAnsi="Arial" w:cs="Arial"/>
-                <w:sz w:val="24"/>
-                <w:szCs w:val="24"/>
-                <w:b/>
-                <w:bCs/>
-              </w:rPr>
-              <w:t xml:space="preserve">מזמין חוות הדעת</w:t>
-            </w:r>
-          </w:p>
-        </w:tc>
-        <w:tc>
-          <w:tcPr>
-            <w:tcW w:type="dxa" w:w="6520"/>
-          </w:tcPr>
-          <w:p>
-            <w:pPr>
-              <w:bidi w:val="1"/>
-              <w:jc w:val="right"/>
-            </w:pPr>
-            <w:r>
-              <w:rPr>
-                <w:rtl/>
-                <w:rFonts w:ascii="Arial" w:hAnsi="Arial" w:cs="Arial"/>
-                <w:sz w:val="24"/>
-                <w:szCs w:val="24"/>
-              </w:rPr>
-              <w:t xml:space="preserve">ישראל ישראלי</w:t>
-            </w:r>
-          </w:p>
-        </w:tc>
-      </w:tr>
-      <w:tr>
-        <w:tc>
-          <w:tcPr>
-            <w:tcW w:type="dxa" w:w="2551"/>
-          </w:tcPr>
-          <w:p>
-            <w:pPr>
-              <w:bidi w:val="1"/>
-              <w:jc w:val="right"/>
-            </w:pPr>
-            <w:r>
-              <w:rPr>
-                <w:rtl/>
-                <w:rFonts w:ascii="Arial" w:hAnsi="Arial" w:cs="Arial"/>
-                <w:sz w:val="24"/>
-                <w:szCs w:val="24"/>
-                <w:b/>
-                <w:bCs/>
-              </w:rPr>
-              <w:t xml:space="preserve">בעלי הזכויות בנכס</w:t>
-            </w:r>
-          </w:p>
-        </w:tc>
-        <w:tc>
-          <w:tcPr>
-            <w:tcW w:type="dxa" w:w="6520"/>
-          </w:tcPr>
-          <w:p>
-            <w:pPr>
-              <w:bidi w:val="1"/>
-              <w:jc w:val="right"/>
-            </w:pPr>
-            <w:r>
-              <w:rPr>
-                <w:rtl/>
-                <w:rFonts w:ascii="Arial" w:hAnsi="Arial" w:cs="Arial"/>
-                <w:sz w:val="24"/>
-                <w:szCs w:val="24"/>
-              </w:rPr>
-              <w:t xml:space="preserve">ישראל ישראלי (1/1)</w:t>
-            </w:r>
-          </w:p>
-        </w:tc>
-      </w:tr>
-      <w:tr>
-        <w:tc>
-          <w:tcPr>
-            <w:tcW w:type="dxa" w:w="2551"/>
-          </w:tcPr>
-          <w:p>
-            <w:pPr>
-              <w:bidi w:val="1"/>
-              <w:jc w:val="right"/>
-            </w:pPr>
-            <w:r>
-              <w:rPr>
-                <w:rtl/>
-                <w:rFonts w:ascii="Arial" w:hAnsi="Arial" w:cs="Arial"/>
-                <w:sz w:val="24"/>
-                <w:szCs w:val="24"/>
-                <w:b/>
-                <w:bCs/>
-              </w:rPr>
-              <w:t xml:space="preserve">המועד הקובע</w:t>
-            </w:r>
-          </w:p>
-        </w:tc>
-        <w:tc>
-          <w:tcPr>
-            <w:tcW w:type="dxa" w:w="6520"/>
-          </w:tcPr>
-          <w:p>
-            <w:pPr>
-              <w:bidi w:val="1"/>
-              <w:jc w:val="right"/>
-            </w:pPr>
-            <w:r>
-              <w:rPr>
-                <w:rtl/>
-                <w:rFonts w:ascii="Arial" w:hAnsi="Arial" w:cs="Arial"/>
-                <w:sz w:val="24"/>
-                <w:szCs w:val="24"/>
-              </w:rPr>
-              <w:t xml:space="preserve">6 במאי 2025</w:t>
-            </w:r>
-          </w:p>
-        </w:tc>
-      </w:tr>
-      <w:tr>
-        <w:tc>
-          <w:tcPr>
-            <w:tcW w:type="dxa" w:w="2551"/>
-          </w:tcPr>
-          <w:p>
-            <w:pPr>
-              <w:bidi w:val="1"/>
-              <w:jc w:val="right"/>
-            </w:pPr>
-            <w:r>
-              <w:rPr>
-                <w:rtl/>
-                <w:rFonts w:ascii="Arial" w:hAnsi="Arial" w:cs="Arial"/>
-                <w:sz w:val="24"/>
-                <w:szCs w:val="24"/>
-                <w:b/>
-                <w:bCs/>
-              </w:rPr>
-              <w:t xml:space="preserve">מועד הביקור בנכס</w:t>
-            </w:r>
-          </w:p>
-        </w:tc>
-        <w:tc>
-          <w:tcPr>
-            <w:tcW w:type="dxa" w:w="6520"/>
-          </w:tcPr>
-          <w:p>
-            <w:pPr>
-              <w:bidi w:val="1"/>
-              <w:jc w:val="right"/>
-            </w:pPr>
-            <w:r>
-              <w:rPr>
-                <w:rtl/>
-                <w:rFonts w:ascii="Arial" w:hAnsi="Arial" w:cs="Arial"/>
-                <w:sz w:val="24"/>
-                <w:szCs w:val="24"/>
-              </w:rPr>
-              <w:t xml:space="preserve">01/05/2025</w:t>
-            </w:r>
-          </w:p>
-        </w:tc>
-      </w:tr>
-      <w:tr>
-        <w:tc>
-          <w:tcPr>
-            <w:tcW w:type="dxa" w:w="2551"/>
-          </w:tcPr>
-          <w:p>
-            <w:pPr>
-              <w:bidi w:val="1"/>
-              <w:jc w:val="right"/>
-            </w:pPr>
-            <w:r>
-              <w:rPr>
-                <w:rtl/>
-                <w:rFonts w:ascii="Arial" w:hAnsi="Arial" w:cs="Arial"/>
-                <w:sz w:val="24"/>
-                <w:szCs w:val="24"/>
-                <w:b/>
-                <w:bCs/>
-              </w:rPr>
-              <w:t xml:space="preserve">גוש</w:t>
-            </w:r>
-          </w:p>
-        </w:tc>
-        <w:tc>
-          <w:tcPr>
-            <w:tcW w:type="dxa" w:w="6520"/>
-          </w:tcPr>
-          <w:p>
-            <w:pPr>
-              <w:bidi w:val="1"/>
-              <w:jc w:val="right"/>
-            </w:pPr>
-            <w:r>
-              <w:rPr>
-                <w:rtl/>
-                <w:rFonts w:ascii="Arial" w:hAnsi="Arial" w:cs="Arial"/>
-                <w:sz w:val="24"/>
-                <w:szCs w:val="24"/>
-              </w:rPr>
-              <w:t xml:space="preserve">6130</w:t>
-            </w:r>
-          </w:p>
-        </w:tc>
-      </w:tr>
-      <w:tr>
-        <w:tc>
-          <w:tcPr>
-            <w:tcW w:type="dxa" w:w="2551"/>
-          </w:tcPr>
-          <w:p>
-            <w:pPr>
-              <w:bidi w:val="1"/>
-              <w:jc w:val="right"/>
-            </w:pPr>
-            <w:r>
-              <w:rPr>
-                <w:rtl/>
-                <w:rFonts w:ascii="Arial" w:hAnsi="Arial" w:cs="Arial"/>
-                <w:sz w:val="24"/>
-                <w:szCs w:val="24"/>
-                <w:b/>
-                <w:bCs/>
-              </w:rPr>
-              <w:t xml:space="preserve">חלקה</w:t>
-            </w:r>
-          </w:p>
-        </w:tc>
-        <w:tc>
-          <w:tcPr>
-            <w:tcW w:type="dxa" w:w="6520"/>
-          </w:tcPr>
-          <w:p>
-            <w:pPr>
-              <w:bidi w:val="1"/>
-              <w:jc w:val="right"/>
-            </w:pPr>
-            <w:r>
-              <w:rPr>
-                <w:rtl/>
-                <w:rFonts w:ascii="Arial" w:hAnsi="Arial" w:cs="Arial"/>
-                <w:sz w:val="24"/>
-                <w:szCs w:val="24"/>
-              </w:rPr>
-              <w:t xml:space="preserve">27</w:t>
-            </w:r>
-          </w:p>
-        </w:tc>
-      </w:tr>
-      <w:tr>
-        <w:tc>
-          <w:tcPr>
-            <w:tcW w:type="dxa" w:w="2551"/>
-          </w:tcPr>
-          <w:p>
-            <w:pPr>
-              <w:bidi w:val="1"/>
-              <w:jc w:val="right"/>
-            </w:pPr>
-            <w:r>
-              <w:rPr>
-                <w:rtl/>
-                <w:rFonts w:ascii="Arial" w:hAnsi="Arial" w:cs="Arial"/>
-                <w:sz w:val="24"/>
-                <w:szCs w:val="24"/>
-                <w:b/>
-                <w:bCs/>
-              </w:rPr>
-              <w:t xml:space="preserve">תת חלקה</w:t>
-            </w:r>
-          </w:p>
-        </w:tc>
-        <w:tc>
-          <w:tcPr>
-            <w:tcW w:type="dxa" w:w="6520"/>
-          </w:tcPr>
-          <w:p>
-            <w:pPr>
-              <w:bidi w:val="1"/>
-              <w:jc w:val="right"/>
-            </w:pPr>
-            <w:r>
-              <w:rPr>
-                <w:rtl/>
-                <w:rFonts w:ascii="Arial" w:hAnsi="Arial" w:cs="Arial"/>
-                <w:sz w:val="24"/>
-                <w:szCs w:val="24"/>
-              </w:rPr>
-              <w:t xml:space="preserve">8</w:t>
-            </w:r>
-          </w:p>
-        </w:tc>
-      </w:tr>
-      <w:tr>
-        <w:tc>
-          <w:tcPr>
-            <w:tcW w:type="dxa" w:w="2551"/>
-          </w:tcPr>
-          <w:p>
-            <w:pPr>
-              <w:bidi w:val="1"/>
-              <w:jc w:val="right"/>
-            </w:pPr>
-            <w:r>
-              <w:rPr>
-                <w:rtl/>
-                <w:rFonts w:ascii="Arial" w:hAnsi="Arial" w:cs="Arial"/>
-                <w:sz w:val="24"/>
-                <w:szCs w:val="24"/>
-                <w:b/>
-                <w:bCs/>
-              </w:rPr>
-              <w:t xml:space="preserve">הבניין בשלמות</w:t>
-            </w:r>
-          </w:p>
-        </w:tc>
-        <w:tc>
-          <w:tcPr>
-            <w:tcW w:type="dxa" w:w="6520"/>
-          </w:tcPr>
-          <w:p>
-            <w:pPr>
-              <w:bidi w:val="1"/>
-              <w:jc w:val="right"/>
-            </w:pPr>
-            <w:r>
-              <w:rPr>
-                <w:rtl/>
-                <w:rFonts w:ascii="Arial" w:hAnsi="Arial" w:cs="Arial"/>
-                <w:sz w:val="24"/>
-                <w:szCs w:val="24"/>
-              </w:rPr>
-              <w:t xml:space="preserve">בניין מגורים בן 8 קומות מעל קומת כניסה הכולל 32 יח"ד</w:t>
-            </w:r>
-          </w:p>
-        </w:tc>
-      </w:tr>
-      <w:tr>
-        <w:tc>
-          <w:tcPr>
-            <w:tcW w:type="dxa" w:w="2551"/>
-          </w:tcPr>
-          <w:p>
-            <w:pPr>
-              <w:bidi w:val="1"/>
-              <w:jc w:val="right"/>
-            </w:pPr>
-            <w:r>
-              <w:rPr>
-                <w:rtl/>
-                <w:rFonts w:ascii="Arial" w:hAnsi="Arial" w:cs="Arial"/>
-                <w:sz w:val="24"/>
-                <w:szCs w:val="24"/>
-                <w:b/>
-                <w:bCs/>
-              </w:rPr>
-              <w:t xml:space="preserve">הדירה שבנדון</w:t>
-            </w:r>
-          </w:p>
-        </w:tc>
-        <w:tc>
-          <w:tcPr>
-            <w:tcW w:type="dxa" w:w="6520"/>
-          </w:tcPr>
-          <w:p>
-            <w:pPr>
-              <w:bidi w:val="1"/>
-              <w:jc w:val="right"/>
-            </w:pPr>
-            <w:r>
-              <w:rPr>
-                <w:rtl/>
-                <w:rFonts w:ascii="Arial" w:hAnsi="Arial" w:cs="Arial"/>
-                <w:sz w:val="24"/>
-                <w:szCs w:val="24"/>
-                <w:b/>
-                <w:bCs/>
-              </w:rPr>
-              <w:t xml:space="preserve">דירת 4.0 חדרים הממוקמת בקומה ה-שלישית</w:t>
-            </w:r>
-          </w:p>
-        </w:tc>
-      </w:tr>
-      <w:tr>
-        <w:tc>
-          <w:tcPr>
-            <w:tcW w:type="dxa" w:w="2551"/>
-          </w:tcPr>
-          <w:p>
-            <w:pPr>
-              <w:bidi w:val="1"/>
-              <w:jc w:val="right"/>
-            </w:pPr>
-            <w:r>
-              <w:rPr>
-                <w:rtl/>
-                <w:rFonts w:ascii="Arial" w:hAnsi="Arial" w:cs="Arial"/>
-                <w:sz w:val="24"/>
-                <w:szCs w:val="24"/>
-                <w:b/>
-                <w:bCs/>
-              </w:rPr>
-              <w:t xml:space="preserve">שטח דירה רשום</w:t>
-            </w:r>
-          </w:p>
-        </w:tc>
-        <w:tc>
-          <w:tcPr>
-            <w:tcW w:type="dxa" w:w="6520"/>
-          </w:tcPr>
-          <w:p>
-            <w:pPr>
-              <w:bidi w:val="1"/>
-              <w:jc w:val="right"/>
-            </w:pPr>
-            <w:r>
-              <w:rPr>
-                <w:rtl/>
-                <w:rFonts w:ascii="Arial" w:hAnsi="Arial" w:cs="Arial"/>
-                <w:sz w:val="24"/>
-                <w:szCs w:val="24"/>
-              </w:rPr>
-              <w:t xml:space="preserve">94 מ"ר</w:t>
-            </w:r>
-          </w:p>
-        </w:tc>
-      </w:tr>
-      <w:tr>
-        <w:tc>
-          <w:tcPr>
-            <w:tcW w:type="dxa" w:w="2551"/>
-          </w:tcPr>
-          <w:p>
-            <w:pPr>
-              <w:bidi w:val="1"/>
-              <w:jc w:val="right"/>
-            </w:pPr>
-            <w:r>
-              <w:rPr>
-                <w:rtl/>
-                <w:rFonts w:ascii="Arial" w:hAnsi="Arial" w:cs="Arial"/>
-                <w:sz w:val="24"/>
-                <w:szCs w:val="24"/>
-                <w:b/>
-                <w:bCs/>
-              </w:rPr>
-              <w:t xml:space="preserve">שטח דירה בנוי</w:t>
-            </w:r>
-          </w:p>
-        </w:tc>
-        <w:tc>
-          <w:tcPr>
-            <w:tcW w:type="dxa" w:w="6520"/>
-          </w:tcPr>
-          <w:p>
-            <w:pPr>
-              <w:bidi w:val="1"/>
-              <w:jc w:val="right"/>
-            </w:pPr>
-            <w:r>
-              <w:rPr>
-                <w:rtl/>
-                <w:rFonts w:ascii="Arial" w:hAnsi="Arial" w:cs="Arial"/>
-                <w:sz w:val="24"/>
-                <w:szCs w:val="24"/>
-              </w:rPr>
-              <w:t xml:space="preserve">כ- 92 מ"ר</w:t>
-            </w:r>
-          </w:p>
-        </w:tc>
-      </w:tr>
-      <w:tr>
-        <w:tc>
-          <w:tcPr>
-            <w:tcW w:type="dxa" w:w="2551"/>
-          </w:tcPr>
-          <w:p>
-            <w:pPr>
-              <w:bidi w:val="1"/>
-              <w:jc w:val="right"/>
-            </w:pPr>
-            <w:r>
-              <w:rPr>
-                <w:rtl/>
-                <w:rFonts w:ascii="Arial" w:hAnsi="Arial" w:cs="Arial"/>
-                <w:sz w:val="24"/>
-                <w:szCs w:val="24"/>
-                <w:b/>
-                <w:bCs/>
-              </w:rPr>
-              <w:t xml:space="preserve">מיקום</w:t>
-            </w:r>
-          </w:p>
-        </w:tc>
-        <w:tc>
-          <w:tcPr>
-            <w:tcW w:type="dxa" w:w="6520"/>
-          </w:tcPr>
-          <w:p>
-            <w:pPr>
-              <w:bidi w:val="1"/>
-              <w:jc w:val="right"/>
-            </w:pPr>
-            <w:r>
-              <w:rPr>
-                <w:rtl/>
-                <w:rFonts w:ascii="Arial" w:hAnsi="Arial" w:cs="Arial"/>
-                <w:sz w:val="24"/>
-                <w:szCs w:val="24"/>
-              </w:rPr>
-              <w:t xml:space="preserve">רחוב ביאליק 15, רמת גן</w:t>
-            </w:r>
-          </w:p>
-        </w:tc>
-      </w:tr>
-      <w:tr>
-        <w:tc>
-          <w:tcPr>
-            <w:tcW w:type="dxa" w:w="2551"/>
-          </w:tcPr>
-          <w:p>
-            <w:pPr>
-              <w:bidi w:val="1"/>
-              <w:jc w:val="right"/>
-            </w:pPr>
-            <w:r>
-              <w:rPr>
-                <w:rtl/>
-                <w:rFonts w:ascii="Arial" w:hAnsi="Arial" w:cs="Arial"/>
-                <w:sz w:val="24"/>
-                <w:szCs w:val="24"/>
-                <w:b/>
-                <w:bCs/>
-              </w:rPr>
-              <w:t xml:space="preserve">זכויות</w:t>
-            </w:r>
-          </w:p>
-        </w:tc>
-        <w:tc>
-          <w:tcPr>
-            <w:tcW w:type="dxa" w:w="6520"/>
-          </w:tcPr>
-          <w:p>
-            <w:pPr>
-              <w:bidi w:val="1"/>
-              <w:jc w:val="right"/>
-            </w:pPr>
-            <w:r>
-              <w:rPr>
-                <w:rtl/>
-                <w:rFonts w:ascii="Arial" w:hAnsi="Arial" w:cs="Arial"/>
-                <w:sz w:val="24"/>
-                <w:szCs w:val="24"/>
-              </w:rPr>
-              <w:t xml:space="preserve">בעלות פרטית</w:t>
-            </w:r>
-          </w:p>
-        </w:tc>
-      </w:tr>
-      <w:tr>
-        <w:tc>
-          <w:tcPr>
-            <w:tcW w:type="dxa" w:w="2551"/>
-          </w:tcPr>
-          <w:p>
-            <w:pPr>
-              <w:bidi w:val="1"/>
-              <w:jc w:val="right"/>
-            </w:pPr>
-            <w:r>
-              <w:rPr>
-                <w:rtl/>
-                <w:rFonts w:ascii="Arial" w:hAnsi="Arial" w:cs="Arial"/>
-                <w:sz w:val="24"/>
-                <w:szCs w:val="24"/>
-                <w:b/>
-                <w:bCs/>
-              </w:rPr>
-              <w:t xml:space="preserve">הצמדות</w:t>
-            </w:r>
-          </w:p>
-        </w:tc>
-        <w:tc>
-          <w:tcPr>
-            <w:tcW w:type="dxa" w:w="6520"/>
-          </w:tcPr>
-          <w:p>
-            <w:pPr>
-              <w:bidi w:val="1"/>
-              <w:jc w:val="right"/>
-            </w:pPr>
-            <w:r>
-              <w:rPr>
-                <w:rtl/>
-                <w:rFonts w:ascii="Arial" w:hAnsi="Arial" w:cs="Arial"/>
-                <w:sz w:val="24"/>
-                <w:szCs w:val="24"/>
-              </w:rPr>
-              <w:t xml:space="preserve">חניה תת-קרקעית מס' 8, מחסן מס' 8 בקומת מרתף</w:t>
-            </w:r>
-          </w:p>
-        </w:tc>
-      </w:tr>
-    </w:tbl>
+    <w:p>
+      <w:pPr>
+        <w:bidi/>
+        <w:spacing w:after="40"/>
+        <w:jc w:val="right"/>
+        <w:tabs>
+          <w:tab w:val="left" w:pos="2636"/>
+          <w:tab w:val="left" w:pos="3203"/>
+        </w:tabs>
+      </w:pPr>
+      <w:r>
+        <w:rPr>
+          <w:b/>
+          <w:rtl/>
+          <w:rFonts w:ascii="David" w:hAnsi="David" w:cs="David"/>
+          <w:sz w:val="24"/>
+          <w:szCs w:val="24"/>
+          <w:b/>
+          <w:bCs/>
+        </w:rPr>
+        <w:t>מטרת חוות הדעת</w:t>
+      </w:r>
+      <w:r>
+        <w:rPr>
+          <w:b w:val="0"/>
+          <w:rtl/>
+          <w:rFonts w:ascii="David" w:hAnsi="David" w:cs="David"/>
+          <w:sz w:val="24"/>
+          <w:szCs w:val="24"/>
+        </w:rPr>
+        <w:tab/>
+        <w:t>:</w:t>
+        <w:tab/>
+      </w:r>
+      <w:r>
+        <w:rPr>
+          <w:b w:val="0"/>
+          <w:rtl/>
+          <w:rFonts w:ascii="David" w:hAnsi="David" w:cs="David"/>
+          <w:sz w:val="24"/>
+          <w:szCs w:val="24"/>
+        </w:rPr>
+        <w:t>אומדן שווי שוק בין קונה מרצון למוכר מרצון — פינוי-בינוי (שתי חלופות)</w:t>
+      </w:r>
+    </w:p>
+    <w:p>
+      <w:pPr>
+        <w:bidi/>
+        <w:spacing w:after="40"/>
+        <w:jc w:val="right"/>
+        <w:tabs>
+          <w:tab w:val="left" w:pos="2636"/>
+          <w:tab w:val="left" w:pos="3203"/>
+        </w:tabs>
+      </w:pPr>
+      <w:r>
+        <w:rPr>
+          <w:b/>
+          <w:rtl/>
+          <w:rFonts w:ascii="David" w:hAnsi="David" w:cs="David"/>
+          <w:sz w:val="24"/>
+          <w:szCs w:val="24"/>
+          <w:b/>
+          <w:bCs/>
+        </w:rPr>
+        <w:t>מזמין חוות הדעת</w:t>
+      </w:r>
+      <w:r>
+        <w:rPr>
+          <w:b w:val="0"/>
+          <w:rtl/>
+          <w:rFonts w:ascii="David" w:hAnsi="David" w:cs="David"/>
+          <w:sz w:val="24"/>
+          <w:szCs w:val="24"/>
+        </w:rPr>
+        <w:tab/>
+        <w:t>:</w:t>
+        <w:tab/>
+      </w:r>
+      <w:r>
+        <w:rPr>
+          <w:b w:val="0"/>
+          <w:rtl/>
+          <w:rFonts w:ascii="David" w:hAnsi="David" w:cs="David"/>
+          <w:sz w:val="24"/>
+          <w:szCs w:val="24"/>
+        </w:rPr>
+        <w:t>ישראל ישראלי</w:t>
+      </w:r>
+    </w:p>
+    <w:p>
+      <w:pPr>
+        <w:bidi/>
+        <w:spacing w:after="40"/>
+        <w:jc w:val="right"/>
+        <w:tabs>
+          <w:tab w:val="left" w:pos="2636"/>
+          <w:tab w:val="left" w:pos="3203"/>
+        </w:tabs>
+      </w:pPr>
+      <w:r>
+        <w:rPr>
+          <w:b/>
+          <w:rtl/>
+          <w:rFonts w:ascii="David" w:hAnsi="David" w:cs="David"/>
+          <w:sz w:val="24"/>
+          <w:szCs w:val="24"/>
+          <w:b/>
+          <w:bCs/>
+        </w:rPr>
+        <w:t>בעלי הזכויות בנכס</w:t>
+      </w:r>
+      <w:r>
+        <w:rPr>
+          <w:b w:val="0"/>
+          <w:rtl/>
+          <w:rFonts w:ascii="David" w:hAnsi="David" w:cs="David"/>
+          <w:sz w:val="24"/>
+          <w:szCs w:val="24"/>
+        </w:rPr>
+        <w:tab/>
+        <w:t>:</w:t>
+        <w:tab/>
+      </w:r>
+      <w:r>
+        <w:rPr>
+          <w:b w:val="0"/>
+          <w:rtl/>
+          <w:rFonts w:ascii="David" w:hAnsi="David" w:cs="David"/>
+          <w:sz w:val="24"/>
+          <w:szCs w:val="24"/>
+        </w:rPr>
+        <w:t>ישראל ישראלי (1/1)</w:t>
+      </w:r>
+    </w:p>
+    <w:p>
+      <w:pPr>
+        <w:bidi/>
+        <w:spacing w:after="40"/>
+        <w:jc w:val="right"/>
+        <w:tabs>
+          <w:tab w:val="left" w:pos="2636"/>
+          <w:tab w:val="left" w:pos="3203"/>
+        </w:tabs>
+      </w:pPr>
+      <w:r>
+        <w:rPr>
+          <w:b/>
+          <w:rtl/>
+          <w:rFonts w:ascii="David" w:hAnsi="David" w:cs="David"/>
+          <w:sz w:val="24"/>
+          <w:szCs w:val="24"/>
+          <w:b/>
+          <w:bCs/>
+        </w:rPr>
+        <w:t>המועד הקובע</w:t>
+      </w:r>
+      <w:r>
+        <w:rPr>
+          <w:b w:val="0"/>
+          <w:rtl/>
+          <w:rFonts w:ascii="David" w:hAnsi="David" w:cs="David"/>
+          <w:sz w:val="24"/>
+          <w:szCs w:val="24"/>
+        </w:rPr>
+        <w:tab/>
+        <w:t>:</w:t>
+        <w:tab/>
+      </w:r>
+      <w:r>
+        <w:rPr>
+          <w:b w:val="0"/>
+          <w:rtl/>
+          <w:rFonts w:ascii="David" w:hAnsi="David" w:cs="David"/>
+          <w:sz w:val="24"/>
+          <w:szCs w:val="24"/>
+        </w:rPr>
+        <w:t>6 במאי 2025</w:t>
+      </w:r>
+    </w:p>
+    <w:p>
+      <w:pPr>
+        <w:bidi/>
+        <w:spacing w:after="40"/>
+        <w:jc w:val="right"/>
+        <w:tabs>
+          <w:tab w:val="left" w:pos="2636"/>
+          <w:tab w:val="left" w:pos="3203"/>
+        </w:tabs>
+      </w:pPr>
+      <w:r>
+        <w:rPr>
+          <w:b/>
+          <w:rtl/>
+          <w:rFonts w:ascii="David" w:hAnsi="David" w:cs="David"/>
+          <w:sz w:val="24"/>
+          <w:szCs w:val="24"/>
+          <w:b/>
+          <w:bCs/>
+        </w:rPr>
+        <w:t>מועד הביקור בנכס</w:t>
+      </w:r>
+      <w:r>
+        <w:rPr>
+          <w:b w:val="0"/>
+          <w:rtl/>
+          <w:rFonts w:ascii="David" w:hAnsi="David" w:cs="David"/>
+          <w:sz w:val="24"/>
+          <w:szCs w:val="24"/>
+        </w:rPr>
+        <w:tab/>
+        <w:t>:</w:t>
+        <w:tab/>
+      </w:r>
+      <w:r>
+        <w:rPr>
+          <w:b w:val="0"/>
+          <w:rtl/>
+          <w:rFonts w:ascii="David" w:hAnsi="David" w:cs="David"/>
+          <w:sz w:val="24"/>
+          <w:szCs w:val="24"/>
+        </w:rPr>
+        <w:t>01/05/2025</w:t>
+      </w:r>
+    </w:p>
+    <w:p>
+      <w:pPr>
+        <w:bidi/>
+        <w:spacing w:after="40"/>
+        <w:jc w:val="right"/>
+        <w:tabs>
+          <w:tab w:val="left" w:pos="2636"/>
+          <w:tab w:val="left" w:pos="3203"/>
+        </w:tabs>
+      </w:pPr>
+      <w:r>
+        <w:rPr>
+          <w:b/>
+          <w:rtl/>
+          <w:rFonts w:ascii="David" w:hAnsi="David" w:cs="David"/>
+          <w:sz w:val="24"/>
+          <w:szCs w:val="24"/>
+          <w:b/>
+          <w:bCs/>
+        </w:rPr>
+        <w:t>גוש</w:t>
+      </w:r>
+      <w:r>
+        <w:rPr>
+          <w:b w:val="0"/>
+          <w:rtl/>
+          <w:rFonts w:ascii="David" w:hAnsi="David" w:cs="David"/>
+          <w:sz w:val="24"/>
+          <w:szCs w:val="24"/>
+        </w:rPr>
+        <w:tab/>
+        <w:t>:</w:t>
+        <w:tab/>
+      </w:r>
+      <w:r>
+        <w:rPr>
+          <w:b w:val="0"/>
+          <w:rtl/>
+          <w:rFonts w:ascii="David" w:hAnsi="David" w:cs="David"/>
+          <w:sz w:val="24"/>
+          <w:szCs w:val="24"/>
+        </w:rPr>
+        <w:t>6130</w:t>
+      </w:r>
+    </w:p>
+    <w:p>
+      <w:pPr>
+        <w:bidi/>
+        <w:spacing w:after="40"/>
+        <w:jc w:val="right"/>
+        <w:tabs>
+          <w:tab w:val="left" w:pos="2636"/>
+          <w:tab w:val="left" w:pos="3203"/>
+        </w:tabs>
+      </w:pPr>
+      <w:r>
+        <w:rPr>
+          <w:b/>
+          <w:rtl/>
+          <w:rFonts w:ascii="David" w:hAnsi="David" w:cs="David"/>
+          <w:sz w:val="24"/>
+          <w:szCs w:val="24"/>
+          <w:b/>
+          <w:bCs/>
+        </w:rPr>
+        <w:t>חלקה</w:t>
+      </w:r>
+      <w:r>
+        <w:rPr>
+          <w:b w:val="0"/>
+          <w:rtl/>
+          <w:rFonts w:ascii="David" w:hAnsi="David" w:cs="David"/>
+          <w:sz w:val="24"/>
+          <w:szCs w:val="24"/>
+        </w:rPr>
+        <w:tab/>
+        <w:t>:</w:t>
+        <w:tab/>
+      </w:r>
+      <w:r>
+        <w:rPr>
+          <w:b w:val="0"/>
+          <w:rtl/>
+          <w:rFonts w:ascii="David" w:hAnsi="David" w:cs="David"/>
+          <w:sz w:val="24"/>
+          <w:szCs w:val="24"/>
+        </w:rPr>
+        <w:t>27</w:t>
+      </w:r>
+    </w:p>
+    <w:p>
+      <w:pPr>
+        <w:bidi/>
+        <w:spacing w:after="40"/>
+        <w:jc w:val="right"/>
+        <w:tabs>
+          <w:tab w:val="left" w:pos="2636"/>
+          <w:tab w:val="left" w:pos="3203"/>
+        </w:tabs>
+      </w:pPr>
+      <w:r>
+        <w:rPr>
+          <w:b/>
+          <w:rtl/>
+          <w:rFonts w:ascii="David" w:hAnsi="David" w:cs="David"/>
+          <w:sz w:val="24"/>
+          <w:szCs w:val="24"/>
+          <w:b/>
+          <w:bCs/>
+        </w:rPr>
+        <w:t>תת חלקה</w:t>
+      </w:r>
+      <w:r>
+        <w:rPr>
+          <w:b w:val="0"/>
+          <w:rtl/>
+          <w:rFonts w:ascii="David" w:hAnsi="David" w:cs="David"/>
+          <w:sz w:val="24"/>
+          <w:szCs w:val="24"/>
+        </w:rPr>
+        <w:tab/>
+        <w:t>:</w:t>
+        <w:tab/>
+      </w:r>
+      <w:r>
+        <w:rPr>
+          <w:b w:val="0"/>
+          <w:rtl/>
+          <w:rFonts w:ascii="David" w:hAnsi="David" w:cs="David"/>
+          <w:sz w:val="24"/>
+          <w:szCs w:val="24"/>
+        </w:rPr>
+        <w:t>8</w:t>
+      </w:r>
+    </w:p>
+    <w:p>
+      <w:pPr>
+        <w:bidi/>
+        <w:spacing w:after="40"/>
+        <w:jc w:val="right"/>
+        <w:tabs>
+          <w:tab w:val="left" w:pos="2636"/>
+          <w:tab w:val="left" w:pos="3203"/>
+        </w:tabs>
+      </w:pPr>
+      <w:r>
+        <w:rPr>
+          <w:b/>
+          <w:rtl/>
+          <w:rFonts w:ascii="David" w:hAnsi="David" w:cs="David"/>
+          <w:sz w:val="24"/>
+          <w:szCs w:val="24"/>
+          <w:b/>
+          <w:bCs/>
+        </w:rPr>
+        <w:t>הבניין בשלמות</w:t>
+      </w:r>
+      <w:r>
+        <w:rPr>
+          <w:b w:val="0"/>
+          <w:rtl/>
+          <w:rFonts w:ascii="David" w:hAnsi="David" w:cs="David"/>
+          <w:sz w:val="24"/>
+          <w:szCs w:val="24"/>
+        </w:rPr>
+        <w:tab/>
+        <w:t>:</w:t>
+        <w:tab/>
+      </w:r>
+      <w:r>
+        <w:rPr>
+          <w:b w:val="0"/>
+          <w:rtl/>
+          <w:rFonts w:ascii="David" w:hAnsi="David" w:cs="David"/>
+          <w:sz w:val="24"/>
+          <w:szCs w:val="24"/>
+        </w:rPr>
+        <w:t>בניין מגורים בן 8 קומות מעל קומת כניסה הכולל 32 יח"ד</w:t>
+      </w:r>
+    </w:p>
+    <w:p>
+      <w:pPr>
+        <w:bidi/>
+        <w:spacing w:after="40"/>
+        <w:jc w:val="right"/>
+        <w:tabs>
+          <w:tab w:val="left" w:pos="2636"/>
+          <w:tab w:val="left" w:pos="3203"/>
+        </w:tabs>
+      </w:pPr>
+      <w:r>
+        <w:rPr>
+          <w:b/>
+          <w:rtl/>
+          <w:rFonts w:ascii="David" w:hAnsi="David" w:cs="David"/>
+          <w:sz w:val="24"/>
+          <w:szCs w:val="24"/>
+          <w:b/>
+          <w:bCs/>
+        </w:rPr>
+        <w:t>הדירה שבנדון</w:t>
+      </w:r>
+      <w:r>
+        <w:rPr>
+          <w:b w:val="0"/>
+          <w:rtl/>
+          <w:rFonts w:ascii="David" w:hAnsi="David" w:cs="David"/>
+          <w:sz w:val="24"/>
+          <w:szCs w:val="24"/>
+        </w:rPr>
+        <w:tab/>
+        <w:t>:</w:t>
+        <w:tab/>
+      </w:r>
+      <w:r>
+        <w:rPr>
+          <w:b w:val="0"/>
+          <w:rtl/>
+          <w:rFonts w:ascii="David" w:hAnsi="David" w:cs="David"/>
+          <w:sz w:val="24"/>
+          <w:szCs w:val="24"/>
+        </w:rPr>
+        <w:t>דירת 4 חדרים הממוקמת בקומה ה-שלישית</w:t>
+      </w:r>
+    </w:p>
+    <w:p>
+      <w:pPr>
+        <w:bidi/>
+        <w:spacing w:after="40"/>
+        <w:jc w:val="right"/>
+        <w:tabs>
+          <w:tab w:val="left" w:pos="2636"/>
+          <w:tab w:val="left" w:pos="3203"/>
+        </w:tabs>
+      </w:pPr>
+      <w:r>
+        <w:rPr>
+          <w:b/>
+          <w:rtl/>
+          <w:rFonts w:ascii="David" w:hAnsi="David" w:cs="David"/>
+          <w:sz w:val="24"/>
+          <w:szCs w:val="24"/>
+          <w:b/>
+          <w:bCs/>
+        </w:rPr>
+        <w:t>שטח דירה רשום</w:t>
+      </w:r>
+      <w:r>
+        <w:rPr>
+          <w:b w:val="0"/>
+          <w:rtl/>
+          <w:rFonts w:ascii="David" w:hAnsi="David" w:cs="David"/>
+          <w:sz w:val="24"/>
+          <w:szCs w:val="24"/>
+        </w:rPr>
+        <w:tab/>
+        <w:t>:</w:t>
+        <w:tab/>
+      </w:r>
+      <w:r>
+        <w:rPr>
+          <w:b w:val="0"/>
+          <w:rtl/>
+          <w:rFonts w:ascii="David" w:hAnsi="David" w:cs="David"/>
+          <w:sz w:val="24"/>
+          <w:szCs w:val="24"/>
+        </w:rPr>
+        <w:t>94 מ"ר</w:t>
+      </w:r>
+    </w:p>
+    <w:p>
+      <w:pPr>
+        <w:bidi/>
+        <w:spacing w:after="40"/>
+        <w:jc w:val="right"/>
+        <w:tabs>
+          <w:tab w:val="left" w:pos="2636"/>
+          <w:tab w:val="left" w:pos="3203"/>
+        </w:tabs>
+      </w:pPr>
+      <w:r>
+        <w:rPr>
+          <w:b/>
+          <w:rtl/>
+          <w:rFonts w:ascii="David" w:hAnsi="David" w:cs="David"/>
+          <w:sz w:val="24"/>
+          <w:szCs w:val="24"/>
+          <w:b/>
+          <w:bCs/>
+        </w:rPr>
+        <w:t>שטח דירה בנוי</w:t>
+      </w:r>
+      <w:r>
+        <w:rPr>
+          <w:b w:val="0"/>
+          <w:rtl/>
+          <w:rFonts w:ascii="David" w:hAnsi="David" w:cs="David"/>
+          <w:sz w:val="24"/>
+          <w:szCs w:val="24"/>
+        </w:rPr>
+        <w:tab/>
+        <w:t>:</w:t>
+        <w:tab/>
+      </w:r>
+      <w:r>
+        <w:rPr>
+          <w:b w:val="0"/>
+          <w:rtl/>
+          <w:rFonts w:ascii="David" w:hAnsi="David" w:cs="David"/>
+          <w:sz w:val="24"/>
+          <w:szCs w:val="24"/>
+        </w:rPr>
+        <w:t>כ- 92 מ"ר</w:t>
+      </w:r>
+    </w:p>
+    <w:p>
+      <w:pPr>
+        <w:bidi/>
+        <w:spacing w:after="40"/>
+        <w:jc w:val="right"/>
+        <w:tabs>
+          <w:tab w:val="left" w:pos="2636"/>
+          <w:tab w:val="left" w:pos="3203"/>
+        </w:tabs>
+      </w:pPr>
+      <w:r>
+        <w:rPr>
+          <w:b/>
+          <w:rtl/>
+          <w:rFonts w:ascii="David" w:hAnsi="David" w:cs="David"/>
+          <w:sz w:val="24"/>
+          <w:szCs w:val="24"/>
+          <w:b/>
+          <w:bCs/>
+        </w:rPr>
+        <w:t>מיקום</w:t>
+      </w:r>
+      <w:r>
+        <w:rPr>
+          <w:b w:val="0"/>
+          <w:rtl/>
+          <w:rFonts w:ascii="David" w:hAnsi="David" w:cs="David"/>
+          <w:sz w:val="24"/>
+          <w:szCs w:val="24"/>
+        </w:rPr>
+        <w:tab/>
+        <w:t>:</w:t>
+        <w:tab/>
+      </w:r>
+      <w:r>
+        <w:rPr>
+          <w:b w:val="0"/>
+          <w:rtl/>
+          <w:rFonts w:ascii="David" w:hAnsi="David" w:cs="David"/>
+          <w:sz w:val="24"/>
+          <w:szCs w:val="24"/>
+        </w:rPr>
+        <w:t>רחוב ביאליק 15, רמת גן</w:t>
+      </w:r>
+    </w:p>
+    <w:p>
+      <w:pPr>
+        <w:bidi/>
+        <w:spacing w:after="40"/>
+        <w:jc w:val="right"/>
+        <w:tabs>
+          <w:tab w:val="left" w:pos="2636"/>
+          <w:tab w:val="left" w:pos="3203"/>
+        </w:tabs>
+      </w:pPr>
+      <w:r>
+        <w:rPr>
+          <w:b/>
+          <w:rtl/>
+          <w:rFonts w:ascii="David" w:hAnsi="David" w:cs="David"/>
+          <w:sz w:val="24"/>
+          <w:szCs w:val="24"/>
+          <w:b/>
+          <w:bCs/>
+        </w:rPr>
+        <w:t>זכויות</w:t>
+      </w:r>
+      <w:r>
+        <w:rPr>
+          <w:b w:val="0"/>
+          <w:rtl/>
+          <w:rFonts w:ascii="David" w:hAnsi="David" w:cs="David"/>
+          <w:sz w:val="24"/>
+          <w:szCs w:val="24"/>
+        </w:rPr>
+        <w:tab/>
+        <w:t>:</w:t>
+        <w:tab/>
+      </w:r>
+      <w:r>
+        <w:rPr>
+          <w:b w:val="0"/>
+          <w:rtl/>
+          <w:rFonts w:ascii="David" w:hAnsi="David" w:cs="David"/>
+          <w:sz w:val="24"/>
+          <w:szCs w:val="24"/>
+        </w:rPr>
+        <w:t>בעלות פרטית</w:t>
+      </w:r>
+    </w:p>
+    <w:p>
+      <w:pPr>
+        <w:bidi/>
+        <w:spacing w:after="40"/>
+        <w:jc w:val="right"/>
+        <w:tabs>
+          <w:tab w:val="left" w:pos="2636"/>
+          <w:tab w:val="left" w:pos="3203"/>
+        </w:tabs>
+      </w:pPr>
+      <w:r>
+        <w:rPr>
+          <w:b/>
+          <w:rtl/>
+          <w:rFonts w:ascii="David" w:hAnsi="David" w:cs="David"/>
+          <w:sz w:val="24"/>
+          <w:szCs w:val="24"/>
+          <w:b/>
+          <w:bCs/>
+        </w:rPr>
+        <w:t>הצמדות</w:t>
+      </w:r>
+      <w:r>
+        <w:rPr>
+          <w:b w:val="0"/>
+          <w:rtl/>
+          <w:rFonts w:ascii="David" w:hAnsi="David" w:cs="David"/>
+          <w:sz w:val="24"/>
+          <w:szCs w:val="24"/>
+        </w:rPr>
+        <w:tab/>
+        <w:t>:</w:t>
+        <w:tab/>
+      </w:r>
+      <w:r>
+        <w:rPr>
+          <w:b w:val="0"/>
+          <w:rtl/>
+          <w:rFonts w:ascii="David" w:hAnsi="David" w:cs="David"/>
+          <w:sz w:val="24"/>
+          <w:szCs w:val="24"/>
+        </w:rPr>
+        <w:t>חניה תת-קרקעית מס' 8, מחסן מס' 8 בקומת מרתף</w:t>
+      </w:r>
+    </w:p>
     <w:p>
       <w:pPr>
         <w:bidi w:val="1"/>
@@ -932,11 +1047,12 @@
         <w:rPr>
           <w:b/>
           <w:rtl/>
-          <w:rFonts w:ascii="Arial" w:hAnsi="Arial" w:cs="Arial"/>
-          <w:sz w:val="28"/>
-          <w:szCs w:val="28"/>
+          <w:rFonts w:ascii="David" w:hAnsi="David" w:cs="David"/>
+          <w:sz w:val="24"/>
+          <w:szCs w:val="24"/>
           <w:b/>
           <w:bCs/>
+          <w:u w:val="single"/>
         </w:rPr>
         <w:t>תיאור הנכס והסביבה</w:t>
       </w:r>
@@ -951,11 +1067,12 @@
         <w:rPr>
           <w:b/>
           <w:rtl/>
-          <w:rFonts w:ascii="Arial" w:hAnsi="Arial" w:cs="Arial"/>
-          <w:sz w:val="26"/>
-          <w:szCs w:val="26"/>
+          <w:rFonts w:ascii="David" w:hAnsi="David" w:cs="David"/>
+          <w:sz w:val="24"/>
+          <w:szCs w:val="24"/>
           <w:b/>
           <w:bCs/>
+          <w:u w:val="single"/>
         </w:rPr>
         <w:t>תיאור הסביבה הכללית</w:t>
       </w:r>
@@ -970,7 +1087,7 @@
         <w:rPr>
           <w:b w:val="0"/>
           <w:rtl/>
-          <w:rFonts w:ascii="Arial" w:hAnsi="Arial" w:cs="Arial"/>
+          <w:rFonts w:ascii="David" w:hAnsi="David" w:cs="David"/>
           <w:sz w:val="24"/>
           <w:szCs w:val="24"/>
         </w:rPr>
@@ -987,7 +1104,7 @@
         <w:rPr>
           <w:b w:val="0"/>
           <w:rtl/>
-          <w:rFonts w:ascii="Arial" w:hAnsi="Arial" w:cs="Arial"/>
+          <w:rFonts w:ascii="David" w:hAnsi="David" w:cs="David"/>
           <w:sz w:val="24"/>
           <w:szCs w:val="24"/>
         </w:rPr>
@@ -1004,7 +1121,7 @@
         <w:rPr>
           <w:b w:val="0"/>
           <w:rtl/>
-          <w:rFonts w:ascii="Arial" w:hAnsi="Arial" w:cs="Arial"/>
+          <w:rFonts w:ascii="David" w:hAnsi="David" w:cs="David"/>
           <w:sz w:val="24"/>
           <w:szCs w:val="24"/>
         </w:rPr>
@@ -1021,7 +1138,7 @@
         <w:rPr>
           <w:b w:val="0"/>
           <w:rtl/>
-          <w:rFonts w:ascii="Arial" w:hAnsi="Arial" w:cs="Arial"/>
+          <w:rFonts w:ascii="David" w:hAnsi="David" w:cs="David"/>
           <w:sz w:val="24"/>
           <w:szCs w:val="24"/>
         </w:rPr>
@@ -1038,11 +1155,12 @@
         <w:rPr>
           <w:b/>
           <w:rtl/>
-          <w:rFonts w:ascii="Arial" w:hAnsi="Arial" w:cs="Arial"/>
-          <w:sz w:val="26"/>
-          <w:szCs w:val="26"/>
+          <w:rFonts w:ascii="David" w:hAnsi="David" w:cs="David"/>
+          <w:sz w:val="24"/>
+          <w:szCs w:val="24"/>
           <w:b/>
           <w:bCs/>
+          <w:u w:val="single"/>
         </w:rPr>
         <w:t>תיאור החלקה</w:t>
       </w:r>
@@ -1057,7 +1175,7 @@
         <w:rPr>
           <w:b w:val="0"/>
           <w:rtl/>
-          <w:rFonts w:ascii="Arial" w:hAnsi="Arial" w:cs="Arial"/>
+          <w:rFonts w:ascii="David" w:hAnsi="David" w:cs="David"/>
           <w:sz w:val="24"/>
           <w:szCs w:val="24"/>
         </w:rPr>
@@ -1069,10 +1187,11 @@
         <w:tblStyle w:val="TableGrid"/>
         <w:tblW w:type="auto" w:w="0"/>
         <w:tblLook w:firstColumn="1" w:firstRow="1" w:lastColumn="0" w:lastRow="0" w:noHBand="0" w:noVBand="1" w:val="04A0"/>
+        <w:bidiVisual/>
       </w:tblPr>
       <w:tblGrid>
-        <w:gridCol w:w="4703"/>
-        <w:gridCol w:w="4703"/>
+        <w:gridCol w:w="4153"/>
+        <w:gridCol w:w="4153"/>
       </w:tblGrid>
       <w:tr>
         <w:tc>
@@ -1087,7 +1206,7 @@
             <w:r>
               <w:rPr>
                 <w:rtl/>
-                <w:rFonts w:ascii="Arial" w:hAnsi="Arial" w:cs="Arial"/>
+                <w:rFonts w:ascii="David" w:hAnsi="David" w:cs="David"/>
                 <w:sz w:val="24"/>
                 <w:szCs w:val="24"/>
                 <w:b/>
@@ -1109,7 +1228,7 @@
             <w:r>
               <w:rPr>
                 <w:rtl/>
-                <w:rFonts w:ascii="Arial" w:hAnsi="Arial" w:cs="Arial"/>
+                <w:rFonts w:ascii="David" w:hAnsi="David" w:cs="David"/>
                 <w:sz w:val="24"/>
                 <w:szCs w:val="24"/>
               </w:rPr>
@@ -1131,7 +1250,7 @@
             <w:r>
               <w:rPr>
                 <w:rtl/>
-                <w:rFonts w:ascii="Arial" w:hAnsi="Arial" w:cs="Arial"/>
+                <w:rFonts w:ascii="David" w:hAnsi="David" w:cs="David"/>
                 <w:sz w:val="24"/>
                 <w:szCs w:val="24"/>
                 <w:b/>
@@ -1153,7 +1272,7 @@
             <w:r>
               <w:rPr>
                 <w:rtl/>
-                <w:rFonts w:ascii="Arial" w:hAnsi="Arial" w:cs="Arial"/>
+                <w:rFonts w:ascii="David" w:hAnsi="David" w:cs="David"/>
                 <w:sz w:val="24"/>
                 <w:szCs w:val="24"/>
               </w:rPr>
@@ -1175,7 +1294,7 @@
             <w:r>
               <w:rPr>
                 <w:rtl/>
-                <w:rFonts w:ascii="Arial" w:hAnsi="Arial" w:cs="Arial"/>
+                <w:rFonts w:ascii="David" w:hAnsi="David" w:cs="David"/>
                 <w:sz w:val="24"/>
                 <w:szCs w:val="24"/>
                 <w:b/>
@@ -1197,7 +1316,7 @@
             <w:r>
               <w:rPr>
                 <w:rtl/>
-                <w:rFonts w:ascii="Arial" w:hAnsi="Arial" w:cs="Arial"/>
+                <w:rFonts w:ascii="David" w:hAnsi="David" w:cs="David"/>
                 <w:sz w:val="24"/>
                 <w:szCs w:val="24"/>
               </w:rPr>
@@ -1219,7 +1338,7 @@
             <w:r>
               <w:rPr>
                 <w:rtl/>
-                <w:rFonts w:ascii="Arial" w:hAnsi="Arial" w:cs="Arial"/>
+                <w:rFonts w:ascii="David" w:hAnsi="David" w:cs="David"/>
                 <w:sz w:val="24"/>
                 <w:szCs w:val="24"/>
                 <w:b/>
@@ -1241,7 +1360,7 @@
             <w:r>
               <w:rPr>
                 <w:rtl/>
-                <w:rFonts w:ascii="Arial" w:hAnsi="Arial" w:cs="Arial"/>
+                <w:rFonts w:ascii="David" w:hAnsi="David" w:cs="David"/>
                 <w:sz w:val="24"/>
                 <w:szCs w:val="24"/>
               </w:rPr>
@@ -1268,7 +1387,7 @@
         <w:rPr>
           <w:b w:val="0"/>
           <w:rtl/>
-          <w:rFonts w:ascii="Arial" w:hAnsi="Arial" w:cs="Arial"/>
+          <w:rFonts w:ascii="David" w:hAnsi="David" w:cs="David"/>
           <w:sz w:val="24"/>
           <w:szCs w:val="24"/>
         </w:rPr>
@@ -1285,11 +1404,12 @@
         <w:rPr>
           <w:b/>
           <w:rtl/>
-          <w:rFonts w:ascii="Arial" w:hAnsi="Arial" w:cs="Arial"/>
-          <w:sz w:val="26"/>
-          <w:szCs w:val="26"/>
+          <w:rFonts w:ascii="David" w:hAnsi="David" w:cs="David"/>
+          <w:sz w:val="24"/>
+          <w:szCs w:val="24"/>
           <w:b/>
           <w:bCs/>
+          <w:u w:val="single"/>
         </w:rPr>
         <w:t>תיאור הדירה שבנדון</w:t>
       </w:r>
@@ -1304,13 +1424,13 @@
         <w:rPr>
           <w:b/>
           <w:rtl/>
-          <w:rFonts w:ascii="Arial" w:hAnsi="Arial" w:cs="Arial"/>
+          <w:rFonts w:ascii="David" w:hAnsi="David" w:cs="David"/>
           <w:sz w:val="24"/>
           <w:szCs w:val="24"/>
           <w:b/>
           <w:bCs/>
         </w:rPr>
-        <w:t>נשוא חוות הדעת מהווה דירה בת 4.0 חדרים אשר ממוקמת בקומה ה-שלישית של הבניין ופונה לכיוון מזרח ומערב.</w:t>
+        <w:t>נשוא חוות הדעת מהווה דירה בת 4 חדרים אשר ממוקמת בקומה ה-שלישית של הבניין ופונה לכיוון מזרח ומערב.</w:t>
       </w:r>
     </w:p>
     <w:p>
@@ -1323,7 +1443,7 @@
         <w:rPr>
           <w:b w:val="0"/>
           <w:rtl/>
-          <w:rFonts w:ascii="Arial" w:hAnsi="Arial" w:cs="Arial"/>
+          <w:rFonts w:ascii="David" w:hAnsi="David" w:cs="David"/>
           <w:sz w:val="24"/>
           <w:szCs w:val="24"/>
         </w:rPr>
@@ -1345,11 +1465,12 @@
         <w:rPr>
           <w:b/>
           <w:rtl/>
-          <w:rFonts w:ascii="Arial" w:hAnsi="Arial" w:cs="Arial"/>
-          <w:sz w:val="28"/>
-          <w:szCs w:val="28"/>
+          <w:rFonts w:ascii="David" w:hAnsi="David" w:cs="David"/>
+          <w:sz w:val="24"/>
+          <w:szCs w:val="24"/>
           <w:b/>
           <w:bCs/>
+          <w:u w:val="single"/>
         </w:rPr>
         <w:t>הרקע התכנוני</w:t>
       </w:r>
@@ -1364,11 +1485,12 @@
         <w:rPr>
           <w:b/>
           <w:rtl/>
-          <w:rFonts w:ascii="Arial" w:hAnsi="Arial" w:cs="Arial"/>
-          <w:sz w:val="26"/>
-          <w:szCs w:val="26"/>
+          <w:rFonts w:ascii="David" w:hAnsi="David" w:cs="David"/>
+          <w:sz w:val="24"/>
+          <w:szCs w:val="24"/>
           <w:b/>
           <w:bCs/>
+          <w:u w:val="single"/>
         </w:rPr>
         <w:t>א. תוכניות מתאר</w:t>
       </w:r>
@@ -1383,7 +1505,7 @@
         <w:rPr>
           <w:b w:val="0"/>
           <w:rtl/>
-          <w:rFonts w:ascii="Arial" w:hAnsi="Arial" w:cs="Arial"/>
+          <w:rFonts w:ascii="David" w:hAnsi="David" w:cs="David"/>
           <w:sz w:val="24"/>
           <w:szCs w:val="24"/>
         </w:rPr>
@@ -1400,7 +1522,7 @@
         <w:rPr>
           <w:b w:val="0"/>
           <w:rtl/>
-          <w:rFonts w:ascii="Arial" w:hAnsi="Arial" w:cs="Arial"/>
+          <w:rFonts w:ascii="David" w:hAnsi="David" w:cs="David"/>
           <w:sz w:val="24"/>
           <w:szCs w:val="24"/>
         </w:rPr>
@@ -1417,11 +1539,12 @@
         <w:rPr>
           <w:b/>
           <w:rtl/>
-          <w:rFonts w:ascii="Arial" w:hAnsi="Arial" w:cs="Arial"/>
-          <w:sz w:val="26"/>
-          <w:szCs w:val="26"/>
+          <w:rFonts w:ascii="David" w:hAnsi="David" w:cs="David"/>
+          <w:sz w:val="24"/>
+          <w:szCs w:val="24"/>
           <w:b/>
           <w:bCs/>
+          <w:u w:val="single"/>
         </w:rPr>
         <w:t>ב. רישוי</w:t>
       </w:r>
@@ -1436,7 +1559,7 @@
         <w:rPr>
           <w:b w:val="0"/>
           <w:rtl/>
-          <w:rFonts w:ascii="Arial" w:hAnsi="Arial" w:cs="Arial"/>
+          <w:rFonts w:ascii="David" w:hAnsi="David" w:cs="David"/>
           <w:sz w:val="24"/>
           <w:szCs w:val="24"/>
         </w:rPr>
@@ -1447,54 +1570,36 @@
       <w:pPr>
         <w:bidi w:val="1"/>
         <w:spacing w:after="80"/>
+        <w:ind w:left="283" w:right="283"/>
         <w:jc w:val="right"/>
       </w:pPr>
       <w:r>
         <w:rPr>
           <w:b w:val="0"/>
           <w:rtl/>
-          <w:rFonts w:ascii="Arial" w:hAnsi="Arial" w:cs="Arial"/>
+          <w:rFonts w:ascii="David" w:hAnsi="David" w:cs="David"/>
           <w:sz w:val="24"/>
           <w:szCs w:val="24"/>
         </w:rPr>
-        <w:t xml:space="preserve">• </w:t>
-      </w:r>
-      <w:r>
-        <w:rPr>
-          <w:b w:val="0"/>
-          <w:rtl/>
-          <w:rFonts w:ascii="Arial" w:hAnsi="Arial" w:cs="Arial"/>
-          <w:sz w:val="24"/>
-          <w:szCs w:val="24"/>
-        </w:rPr>
-        <w:t>היתר בניה מספר 1985/4521 מתאריך 12/06/1985, אשר התיר בניין מגורים בן 8 קומות הכולל 32 יחידות דיור.</w:t>
+        <w:t>• היתר בניה מספר 1985/4521 מתאריך 12/06/1985, אשר התיר בניין מגורים בן 8 קומות הכולל 32 יחידות דיור.</w:t>
       </w:r>
     </w:p>
     <w:p>
       <w:pPr>
         <w:bidi w:val="1"/>
         <w:spacing w:after="80"/>
+        <w:ind w:left="283" w:right="283"/>
         <w:jc w:val="right"/>
       </w:pPr>
       <w:r>
         <w:rPr>
           <w:b w:val="0"/>
           <w:rtl/>
-          <w:rFonts w:ascii="Arial" w:hAnsi="Arial" w:cs="Arial"/>
+          <w:rFonts w:ascii="David" w:hAnsi="David" w:cs="David"/>
           <w:sz w:val="24"/>
           <w:szCs w:val="24"/>
         </w:rPr>
-        <w:t xml:space="preserve">• </w:t>
-      </w:r>
-      <w:r>
-        <w:rPr>
-          <w:b w:val="0"/>
-          <w:rtl/>
-          <w:rFonts w:ascii="Arial" w:hAnsi="Arial" w:cs="Arial"/>
-          <w:sz w:val="24"/>
-          <w:szCs w:val="24"/>
-        </w:rPr>
-        <w:t>תעודת גמר מתאריך 03/11/1987.</w:t>
+        <w:t>• תעודת גמר מתאריך 03/11/1987.</w:t>
       </w:r>
     </w:p>
     <w:p>
@@ -1512,11 +1617,12 @@
         <w:rPr>
           <w:b/>
           <w:rtl/>
-          <w:rFonts w:ascii="Arial" w:hAnsi="Arial" w:cs="Arial"/>
-          <w:sz w:val="28"/>
-          <w:szCs w:val="28"/>
+          <w:rFonts w:ascii="David" w:hAnsi="David" w:cs="David"/>
+          <w:sz w:val="24"/>
+          <w:szCs w:val="24"/>
           <w:b/>
           <w:bCs/>
+          <w:u w:val="single"/>
         </w:rPr>
         <w:t>המצב המשפטי</w:t>
       </w:r>
@@ -1531,11 +1637,12 @@
         <w:rPr>
           <w:b/>
           <w:rtl/>
-          <w:rFonts w:ascii="Arial" w:hAnsi="Arial" w:cs="Arial"/>
-          <w:sz w:val="26"/>
-          <w:szCs w:val="26"/>
+          <w:rFonts w:ascii="David" w:hAnsi="David" w:cs="David"/>
+          <w:sz w:val="24"/>
+          <w:szCs w:val="24"/>
           <w:b/>
           <w:bCs/>
+          <w:u w:val="single"/>
         </w:rPr>
         <w:t>א. נסח רישום מקרקעין</w:t>
       </w:r>
@@ -1550,7 +1657,7 @@
         <w:rPr>
           <w:b w:val="0"/>
           <w:rtl/>
-          <w:rFonts w:ascii="Arial" w:hAnsi="Arial" w:cs="Arial"/>
+          <w:rFonts w:ascii="David" w:hAnsi="David" w:cs="David"/>
           <w:sz w:val="24"/>
           <w:szCs w:val="24"/>
         </w:rPr>
@@ -1562,10 +1669,11 @@
         <w:tblStyle w:val="TableGrid"/>
         <w:tblW w:type="auto" w:w="0"/>
         <w:tblLook w:firstColumn="1" w:firstRow="1" w:lastColumn="0" w:lastRow="0" w:noHBand="0" w:noVBand="1" w:val="04A0"/>
+        <w:bidiVisual/>
       </w:tblPr>
       <w:tblGrid>
-        <w:gridCol w:w="4703"/>
-        <w:gridCol w:w="4703"/>
+        <w:gridCol w:w="4153"/>
+        <w:gridCol w:w="4153"/>
       </w:tblGrid>
       <w:tr>
         <w:tc>
@@ -1580,7 +1688,7 @@
             <w:r>
               <w:rPr>
                 <w:rtl/>
-                <w:rFonts w:ascii="Arial" w:hAnsi="Arial" w:cs="Arial"/>
+                <w:rFonts w:ascii="David" w:hAnsi="David" w:cs="David"/>
                 <w:sz w:val="24"/>
                 <w:szCs w:val="24"/>
                 <w:b/>
@@ -1602,7 +1710,7 @@
             <w:r>
               <w:rPr>
                 <w:rtl/>
-                <w:rFonts w:ascii="Arial" w:hAnsi="Arial" w:cs="Arial"/>
+                <w:rFonts w:ascii="David" w:hAnsi="David" w:cs="David"/>
                 <w:sz w:val="24"/>
                 <w:szCs w:val="24"/>
               </w:rPr>
@@ -1624,7 +1732,7 @@
             <w:r>
               <w:rPr>
                 <w:rtl/>
-                <w:rFonts w:ascii="Arial" w:hAnsi="Arial" w:cs="Arial"/>
+                <w:rFonts w:ascii="David" w:hAnsi="David" w:cs="David"/>
                 <w:sz w:val="24"/>
                 <w:szCs w:val="24"/>
                 <w:b/>
@@ -1646,7 +1754,7 @@
             <w:r>
               <w:rPr>
                 <w:rtl/>
-                <w:rFonts w:ascii="Arial" w:hAnsi="Arial" w:cs="Arial"/>
+                <w:rFonts w:ascii="David" w:hAnsi="David" w:cs="David"/>
                 <w:sz w:val="24"/>
                 <w:szCs w:val="24"/>
               </w:rPr>
@@ -1668,7 +1776,7 @@
             <w:r>
               <w:rPr>
                 <w:rtl/>
-                <w:rFonts w:ascii="Arial" w:hAnsi="Arial" w:cs="Arial"/>
+                <w:rFonts w:ascii="David" w:hAnsi="David" w:cs="David"/>
                 <w:sz w:val="24"/>
                 <w:szCs w:val="24"/>
                 <w:b/>
@@ -1690,7 +1798,7 @@
             <w:r>
               <w:rPr>
                 <w:rtl/>
-                <w:rFonts w:ascii="Arial" w:hAnsi="Arial" w:cs="Arial"/>
+                <w:rFonts w:ascii="David" w:hAnsi="David" w:cs="David"/>
                 <w:sz w:val="24"/>
                 <w:szCs w:val="24"/>
               </w:rPr>
@@ -1712,7 +1820,7 @@
             <w:r>
               <w:rPr>
                 <w:rtl/>
-                <w:rFonts w:ascii="Arial" w:hAnsi="Arial" w:cs="Arial"/>
+                <w:rFonts w:ascii="David" w:hAnsi="David" w:cs="David"/>
                 <w:sz w:val="24"/>
                 <w:szCs w:val="24"/>
                 <w:b/>
@@ -1734,7 +1842,7 @@
             <w:r>
               <w:rPr>
                 <w:rtl/>
-                <w:rFonts w:ascii="Arial" w:hAnsi="Arial" w:cs="Arial"/>
+                <w:rFonts w:ascii="David" w:hAnsi="David" w:cs="David"/>
                 <w:sz w:val="24"/>
                 <w:szCs w:val="24"/>
               </w:rPr>
@@ -1756,7 +1864,7 @@
             <w:r>
               <w:rPr>
                 <w:rtl/>
-                <w:rFonts w:ascii="Arial" w:hAnsi="Arial" w:cs="Arial"/>
+                <w:rFonts w:ascii="David" w:hAnsi="David" w:cs="David"/>
                 <w:sz w:val="24"/>
                 <w:szCs w:val="24"/>
                 <w:b/>
@@ -1778,7 +1886,7 @@
             <w:r>
               <w:rPr>
                 <w:rtl/>
-                <w:rFonts w:ascii="Arial" w:hAnsi="Arial" w:cs="Arial"/>
+                <w:rFonts w:ascii="David" w:hAnsi="David" w:cs="David"/>
                 <w:sz w:val="24"/>
                 <w:szCs w:val="24"/>
               </w:rPr>
@@ -1800,7 +1908,7 @@
             <w:r>
               <w:rPr>
                 <w:rtl/>
-                <w:rFonts w:ascii="Arial" w:hAnsi="Arial" w:cs="Arial"/>
+                <w:rFonts w:ascii="David" w:hAnsi="David" w:cs="David"/>
                 <w:sz w:val="24"/>
                 <w:szCs w:val="24"/>
                 <w:b/>
@@ -1822,7 +1930,7 @@
             <w:r>
               <w:rPr>
                 <w:rtl/>
-                <w:rFonts w:ascii="Arial" w:hAnsi="Arial" w:cs="Arial"/>
+                <w:rFonts w:ascii="David" w:hAnsi="David" w:cs="David"/>
                 <w:sz w:val="24"/>
                 <w:szCs w:val="24"/>
               </w:rPr>
@@ -1844,7 +1952,7 @@
             <w:r>
               <w:rPr>
                 <w:rtl/>
-                <w:rFonts w:ascii="Arial" w:hAnsi="Arial" w:cs="Arial"/>
+                <w:rFonts w:ascii="David" w:hAnsi="David" w:cs="David"/>
                 <w:sz w:val="24"/>
                 <w:szCs w:val="24"/>
                 <w:b/>
@@ -1866,7 +1974,7 @@
             <w:r>
               <w:rPr>
                 <w:rtl/>
-                <w:rFonts w:ascii="Arial" w:hAnsi="Arial" w:cs="Arial"/>
+                <w:rFonts w:ascii="David" w:hAnsi="David" w:cs="David"/>
                 <w:sz w:val="24"/>
                 <w:szCs w:val="24"/>
               </w:rPr>
@@ -1888,7 +1996,7 @@
             <w:r>
               <w:rPr>
                 <w:rtl/>
-                <w:rFonts w:ascii="Arial" w:hAnsi="Arial" w:cs="Arial"/>
+                <w:rFonts w:ascii="David" w:hAnsi="David" w:cs="David"/>
                 <w:sz w:val="24"/>
                 <w:szCs w:val="24"/>
                 <w:b/>
@@ -1910,7 +2018,7 @@
             <w:r>
               <w:rPr>
                 <w:rtl/>
-                <w:rFonts w:ascii="Arial" w:hAnsi="Arial" w:cs="Arial"/>
+                <w:rFonts w:ascii="David" w:hAnsi="David" w:cs="David"/>
                 <w:sz w:val="24"/>
                 <w:szCs w:val="24"/>
               </w:rPr>
@@ -1937,11 +2045,12 @@
         <w:rPr>
           <w:b/>
           <w:rtl/>
-          <w:rFonts w:ascii="Arial" w:hAnsi="Arial" w:cs="Arial"/>
-          <w:sz w:val="26"/>
-          <w:szCs w:val="26"/>
+          <w:rFonts w:ascii="David" w:hAnsi="David" w:cs="David"/>
+          <w:sz w:val="24"/>
+          <w:szCs w:val="24"/>
           <w:b/>
           <w:bCs/>
+          <w:u w:val="single"/>
         </w:rPr>
         <w:t>ב. תשריט בית משותף</w:t>
       </w:r>
@@ -1956,7 +2065,7 @@
         <w:rPr>
           <w:b w:val="0"/>
           <w:rtl/>
-          <w:rFonts w:ascii="Arial" w:hAnsi="Arial" w:cs="Arial"/>
+          <w:rFonts w:ascii="David" w:hAnsi="David" w:cs="David"/>
           <w:sz w:val="24"/>
           <w:szCs w:val="24"/>
         </w:rPr>
@@ -1973,11 +2082,12 @@
         <w:rPr>
           <w:b/>
           <w:rtl/>
-          <w:rFonts w:ascii="Arial" w:hAnsi="Arial" w:cs="Arial"/>
-          <w:sz w:val="26"/>
-          <w:szCs w:val="26"/>
+          <w:rFonts w:ascii="David" w:hAnsi="David" w:cs="David"/>
+          <w:sz w:val="24"/>
+          <w:szCs w:val="24"/>
           <w:b/>
           <w:bCs/>
+          <w:u w:val="single"/>
         </w:rPr>
         <w:t>ג. הסכם שכירות</w:t>
       </w:r>
@@ -1992,7 +2102,7 @@
         <w:rPr>
           <w:b w:val="0"/>
           <w:rtl/>
-          <w:rFonts w:ascii="Arial" w:hAnsi="Arial" w:cs="Arial"/>
+          <w:rFonts w:ascii="David" w:hAnsi="David" w:cs="David"/>
           <w:sz w:val="24"/>
           <w:szCs w:val="24"/>
         </w:rPr>
@@ -2004,10 +2114,11 @@
         <w:tblStyle w:val="TableGrid"/>
         <w:tblW w:type="auto" w:w="0"/>
         <w:tblLook w:firstColumn="1" w:firstRow="1" w:lastColumn="0" w:lastRow="0" w:noHBand="0" w:noVBand="1" w:val="04A0"/>
+        <w:bidiVisual/>
       </w:tblPr>
       <w:tblGrid>
-        <w:gridCol w:w="4703"/>
-        <w:gridCol w:w="4703"/>
+        <w:gridCol w:w="4153"/>
+        <w:gridCol w:w="4153"/>
       </w:tblGrid>
       <w:tr>
         <w:tc>
@@ -2022,7 +2133,7 @@
             <w:r>
               <w:rPr>
                 <w:rtl/>
-                <w:rFonts w:ascii="Arial" w:hAnsi="Arial" w:cs="Arial"/>
+                <w:rFonts w:ascii="David" w:hAnsi="David" w:cs="David"/>
                 <w:sz w:val="24"/>
                 <w:szCs w:val="24"/>
                 <w:b/>
@@ -2044,7 +2155,7 @@
             <w:r>
               <w:rPr>
                 <w:rtl/>
-                <w:rFonts w:ascii="Arial" w:hAnsi="Arial" w:cs="Arial"/>
+                <w:rFonts w:ascii="David" w:hAnsi="David" w:cs="David"/>
                 <w:sz w:val="24"/>
                 <w:szCs w:val="24"/>
               </w:rPr>
@@ -2066,7 +2177,7 @@
             <w:r>
               <w:rPr>
                 <w:rtl/>
-                <w:rFonts w:ascii="Arial" w:hAnsi="Arial" w:cs="Arial"/>
+                <w:rFonts w:ascii="David" w:hAnsi="David" w:cs="David"/>
                 <w:sz w:val="24"/>
                 <w:szCs w:val="24"/>
                 <w:b/>
@@ -2088,7 +2199,7 @@
             <w:r>
               <w:rPr>
                 <w:rtl/>
-                <w:rFonts w:ascii="Arial" w:hAnsi="Arial" w:cs="Arial"/>
+                <w:rFonts w:ascii="David" w:hAnsi="David" w:cs="David"/>
                 <w:sz w:val="24"/>
                 <w:szCs w:val="24"/>
               </w:rPr>
@@ -2110,7 +2221,7 @@
             <w:r>
               <w:rPr>
                 <w:rtl/>
-                <w:rFonts w:ascii="Arial" w:hAnsi="Arial" w:cs="Arial"/>
+                <w:rFonts w:ascii="David" w:hAnsi="David" w:cs="David"/>
                 <w:sz w:val="24"/>
                 <w:szCs w:val="24"/>
                 <w:b/>
@@ -2132,7 +2243,7 @@
             <w:r>
               <w:rPr>
                 <w:rtl/>
-                <w:rFonts w:ascii="Arial" w:hAnsi="Arial" w:cs="Arial"/>
+                <w:rFonts w:ascii="David" w:hAnsi="David" w:cs="David"/>
                 <w:sz w:val="24"/>
                 <w:szCs w:val="24"/>
               </w:rPr>
@@ -2157,11 +2268,12 @@
         <w:rPr>
           <w:b/>
           <w:rtl/>
-          <w:rFonts w:ascii="Arial" w:hAnsi="Arial" w:cs="Arial"/>
-          <w:sz w:val="28"/>
-          <w:szCs w:val="28"/>
+          <w:rFonts w:ascii="David" w:hAnsi="David" w:cs="David"/>
+          <w:sz w:val="24"/>
+          <w:szCs w:val="24"/>
           <w:b/>
           <w:bCs/>
+          <w:u w:val="single"/>
         </w:rPr>
         <w:t>עקרונות ושיקולים, נתוני השוואה ושומה</w:t>
       </w:r>
@@ -2176,11 +2288,12 @@
         <w:rPr>
           <w:b/>
           <w:rtl/>
-          <w:rFonts w:ascii="Arial" w:hAnsi="Arial" w:cs="Arial"/>
-          <w:sz w:val="26"/>
-          <w:szCs w:val="26"/>
+          <w:rFonts w:ascii="David" w:hAnsi="David" w:cs="David"/>
+          <w:sz w:val="24"/>
+          <w:szCs w:val="24"/>
           <w:b/>
           <w:bCs/>
+          <w:u w:val="single"/>
         </w:rPr>
         <w:t>א. עקרונות, גורמים ושיקולים</w:t>
       </w:r>
@@ -2195,7 +2308,7 @@
         <w:rPr>
           <w:b/>
           <w:rtl/>
-          <w:rFonts w:ascii="Arial" w:hAnsi="Arial" w:cs="Arial"/>
+          <w:rFonts w:ascii="David" w:hAnsi="David" w:cs="David"/>
           <w:sz w:val="24"/>
           <w:szCs w:val="24"/>
           <w:b/>
@@ -2208,243 +2321,162 @@
       <w:pPr>
         <w:bidi w:val="1"/>
         <w:spacing w:after="80"/>
+        <w:ind w:left="283" w:right="283"/>
         <w:jc w:val="right"/>
       </w:pPr>
       <w:r>
         <w:rPr>
           <w:b w:val="0"/>
           <w:rtl/>
-          <w:rFonts w:ascii="Arial" w:hAnsi="Arial" w:cs="Arial"/>
+          <w:rFonts w:ascii="David" w:hAnsi="David" w:cs="David"/>
           <w:sz w:val="24"/>
           <w:szCs w:val="24"/>
         </w:rPr>
-        <w:t xml:space="preserve">• </w:t>
-      </w:r>
-      <w:r>
-        <w:rPr>
-          <w:b w:val="0"/>
-          <w:rtl/>
-          <w:rFonts w:ascii="Arial" w:hAnsi="Arial" w:cs="Arial"/>
-          <w:sz w:val="24"/>
-          <w:szCs w:val="24"/>
-        </w:rPr>
-        <w:t>מיקום הנכס: רחוב ביאליק 15, רמת גן.</w:t>
+        <w:t>• מיקום הנכס: רחוב ביאליק 15, רמת גן.</w:t>
       </w:r>
     </w:p>
     <w:p>
       <w:pPr>
         <w:bidi w:val="1"/>
         <w:spacing w:after="80"/>
+        <w:ind w:left="283" w:right="283"/>
         <w:jc w:val="right"/>
       </w:pPr>
       <w:r>
         <w:rPr>
           <w:b w:val="0"/>
           <w:rtl/>
-          <w:rFonts w:ascii="Arial" w:hAnsi="Arial" w:cs="Arial"/>
+          <w:rFonts w:ascii="David" w:hAnsi="David" w:cs="David"/>
           <w:sz w:val="24"/>
           <w:szCs w:val="24"/>
         </w:rPr>
-        <w:t xml:space="preserve">• </w:t>
-      </w:r>
-      <w:r>
-        <w:rPr>
-          <w:b w:val="0"/>
-          <w:rtl/>
-          <w:rFonts w:ascii="Arial" w:hAnsi="Arial" w:cs="Arial"/>
-          <w:sz w:val="24"/>
-          <w:szCs w:val="24"/>
-        </w:rPr>
-        <w:t>אופי הסביבה: נווה עופר ברמת גן.</w:t>
+        <w:t>• אופי הסביבה: נווה עופר ברמת גן.</w:t>
       </w:r>
     </w:p>
     <w:p>
       <w:pPr>
         <w:bidi w:val="1"/>
         <w:spacing w:after="80"/>
+        <w:ind w:left="283" w:right="283"/>
         <w:jc w:val="right"/>
       </w:pPr>
       <w:r>
         <w:rPr>
           <w:b w:val="0"/>
           <w:rtl/>
-          <w:rFonts w:ascii="Arial" w:hAnsi="Arial" w:cs="Arial"/>
+          <w:rFonts w:ascii="David" w:hAnsi="David" w:cs="David"/>
           <w:sz w:val="24"/>
           <w:szCs w:val="24"/>
         </w:rPr>
-        <w:t xml:space="preserve">• </w:t>
-      </w:r>
-      <w:r>
-        <w:rPr>
-          <w:b w:val="0"/>
-          <w:rtl/>
-          <w:rFonts w:ascii="Arial" w:hAnsi="Arial" w:cs="Arial"/>
-          <w:sz w:val="24"/>
-          <w:szCs w:val="24"/>
-        </w:rPr>
-        <w:t>שנת בניית הבניין: 1985. מספר יחידות הדיור בבניין: 32.</w:t>
+        <w:t>• שנת בניית הבניין: 1985. מספר יחידות הדיור בבניין: 32.</w:t>
       </w:r>
     </w:p>
     <w:p>
       <w:pPr>
         <w:bidi w:val="1"/>
         <w:spacing w:after="80"/>
+        <w:ind w:left="283" w:right="283"/>
         <w:jc w:val="right"/>
       </w:pPr>
       <w:r>
         <w:rPr>
           <w:b w:val="0"/>
           <w:rtl/>
-          <w:rFonts w:ascii="Arial" w:hAnsi="Arial" w:cs="Arial"/>
+          <w:rFonts w:ascii="David" w:hAnsi="David" w:cs="David"/>
           <w:sz w:val="24"/>
           <w:szCs w:val="24"/>
         </w:rPr>
-        <w:t xml:space="preserve">• </w:t>
-      </w:r>
-      <w:r>
-        <w:rPr>
-          <w:b w:val="0"/>
-          <w:rtl/>
-          <w:rFonts w:ascii="Arial" w:hAnsi="Arial" w:cs="Arial"/>
-          <w:sz w:val="24"/>
-          <w:szCs w:val="24"/>
-        </w:rPr>
-        <w:t>הדירה ממוקמת בקומה ה-שלישית, בת 4.0 חדרים, פונה לכיוון מזרח ומערב.</w:t>
+        <w:t>• הדירה ממוקמת בקומה ה-שלישית, בת 4 חדרים, פונה לכיוון מזרח ומערב.</w:t>
       </w:r>
     </w:p>
     <w:p>
       <w:pPr>
         <w:bidi w:val="1"/>
         <w:spacing w:after="80"/>
+        <w:ind w:left="283" w:right="283"/>
         <w:jc w:val="right"/>
       </w:pPr>
       <w:r>
         <w:rPr>
           <w:b w:val="0"/>
           <w:rtl/>
-          <w:rFonts w:ascii="Arial" w:hAnsi="Arial" w:cs="Arial"/>
+          <w:rFonts w:ascii="David" w:hAnsi="David" w:cs="David"/>
           <w:sz w:val="24"/>
           <w:szCs w:val="24"/>
         </w:rPr>
-        <w:t xml:space="preserve">• </w:t>
-      </w:r>
-      <w:r>
-        <w:rPr>
-          <w:b w:val="0"/>
-          <w:rtl/>
-          <w:rFonts w:ascii="Arial" w:hAnsi="Arial" w:cs="Arial"/>
-          <w:sz w:val="24"/>
-          <w:szCs w:val="24"/>
-        </w:rPr>
-        <w:t>שטח הדירה הבנוי הינו כ-92 מ"ר, ומרפסת בשטח כ-12 מ"ר.</w:t>
+        <w:t>• שטח הדירה הבנוי הינו כ-92 מ"ר, ומרפסת בשטח כ-12 מ"ר.</w:t>
       </w:r>
     </w:p>
     <w:p>
       <w:pPr>
         <w:bidi w:val="1"/>
         <w:spacing w:after="80"/>
+        <w:ind w:left="283" w:right="283"/>
         <w:jc w:val="right"/>
       </w:pPr>
       <w:r>
         <w:rPr>
           <w:b w:val="0"/>
           <w:rtl/>
-          <w:rFonts w:ascii="Arial" w:hAnsi="Arial" w:cs="Arial"/>
+          <w:rFonts w:ascii="David" w:hAnsi="David" w:cs="David"/>
           <w:sz w:val="24"/>
           <w:szCs w:val="24"/>
         </w:rPr>
-        <w:t xml:space="preserve">• </w:t>
-      </w:r>
-      <w:r>
-        <w:rPr>
-          <w:b w:val="0"/>
-          <w:rtl/>
-          <w:rFonts w:ascii="Arial" w:hAnsi="Arial" w:cs="Arial"/>
-          <w:sz w:val="24"/>
-          <w:szCs w:val="24"/>
-        </w:rPr>
-        <w:t>גובה פנים: כ-2.7 מ'.</w:t>
+        <w:t>• גובה פנים: כ-2.7 מ'.</w:t>
       </w:r>
     </w:p>
     <w:p>
       <w:pPr>
         <w:bidi w:val="1"/>
         <w:spacing w:after="80"/>
+        <w:ind w:left="283" w:right="283"/>
         <w:jc w:val="right"/>
       </w:pPr>
       <w:r>
         <w:rPr>
           <w:b w:val="0"/>
           <w:rtl/>
-          <w:rFonts w:ascii="Arial" w:hAnsi="Arial" w:cs="Arial"/>
+          <w:rFonts w:ascii="David" w:hAnsi="David" w:cs="David"/>
           <w:sz w:val="24"/>
           <w:szCs w:val="24"/>
         </w:rPr>
-        <w:t xml:space="preserve">• </w:t>
-      </w:r>
-      <w:r>
-        <w:rPr>
-          <w:b w:val="0"/>
-          <w:rtl/>
-          <w:rFonts w:ascii="Arial" w:hAnsi="Arial" w:cs="Arial"/>
-          <w:sz w:val="24"/>
-          <w:szCs w:val="24"/>
-        </w:rPr>
-        <w:t>הדירה בנויה בהתאם להיתר — מצב היתר.</w:t>
+        <w:t>• הדירה בנויה בהתאם להיתר — מצב היתר.</w:t>
       </w:r>
     </w:p>
     <w:p>
       <w:pPr>
         <w:bidi w:val="1"/>
         <w:spacing w:after="80"/>
+        <w:ind w:left="283" w:right="283"/>
         <w:jc w:val="right"/>
       </w:pPr>
       <w:r>
         <w:rPr>
           <w:b w:val="0"/>
           <w:rtl/>
-          <w:rFonts w:ascii="Arial" w:hAnsi="Arial" w:cs="Arial"/>
+          <w:rFonts w:ascii="David" w:hAnsi="David" w:cs="David"/>
           <w:sz w:val="24"/>
           <w:szCs w:val="24"/>
         </w:rPr>
-        <w:t xml:space="preserve">• </w:t>
-      </w:r>
-      <w:r>
-        <w:rPr>
-          <w:b w:val="0"/>
-          <w:rtl/>
-          <w:rFonts w:ascii="Arial" w:hAnsi="Arial" w:cs="Arial"/>
-          <w:sz w:val="24"/>
-          <w:szCs w:val="24"/>
-        </w:rPr>
-        <w:t>רמת גמר: טובה.</w:t>
+        <w:t>• רמת גמר: טובה.</w:t>
       </w:r>
     </w:p>
     <w:p>
       <w:pPr>
         <w:bidi w:val="1"/>
         <w:spacing w:after="80"/>
+        <w:ind w:left="283" w:right="283"/>
         <w:jc w:val="right"/>
       </w:pPr>
       <w:r>
         <w:rPr>
           <w:b w:val="0"/>
           <w:rtl/>
-          <w:rFonts w:ascii="Arial" w:hAnsi="Arial" w:cs="Arial"/>
+          <w:rFonts w:ascii="David" w:hAnsi="David" w:cs="David"/>
           <w:sz w:val="24"/>
           <w:szCs w:val="24"/>
         </w:rPr>
-        <w:t xml:space="preserve">• </w:t>
-      </w:r>
-      <w:r>
-        <w:rPr>
-          <w:b w:val="0"/>
-          <w:rtl/>
-          <w:rFonts w:ascii="Arial" w:hAnsi="Arial" w:cs="Arial"/>
-          <w:sz w:val="24"/>
-          <w:szCs w:val="24"/>
-        </w:rPr>
-        <w:t>הצמדות: חניה, מחסן.</w:t>
+        <w:t>• הצמדות: חניה, מחסן.</w:t>
       </w:r>
     </w:p>
     <w:p>
@@ -2457,7 +2489,7 @@
         <w:rPr>
           <w:b/>
           <w:rtl/>
-          <w:rFonts w:ascii="Arial" w:hAnsi="Arial" w:cs="Arial"/>
+          <w:rFonts w:ascii="David" w:hAnsi="David" w:cs="David"/>
           <w:sz w:val="24"/>
           <w:szCs w:val="24"/>
           <w:b/>
@@ -2470,81 +2502,54 @@
       <w:pPr>
         <w:bidi w:val="1"/>
         <w:spacing w:after="80"/>
+        <w:ind w:left="283" w:right="283"/>
         <w:jc w:val="right"/>
       </w:pPr>
       <w:r>
         <w:rPr>
           <w:b w:val="0"/>
           <w:rtl/>
-          <w:rFonts w:ascii="Arial" w:hAnsi="Arial" w:cs="Arial"/>
+          <w:rFonts w:ascii="David" w:hAnsi="David" w:cs="David"/>
           <w:sz w:val="24"/>
           <w:szCs w:val="24"/>
         </w:rPr>
-        <w:t xml:space="preserve">• </w:t>
-      </w:r>
-      <w:r>
-        <w:rPr>
-          <w:b w:val="0"/>
-          <w:rtl/>
-          <w:rFonts w:ascii="Arial" w:hAnsi="Arial" w:cs="Arial"/>
-          <w:sz w:val="24"/>
-          <w:szCs w:val="24"/>
-        </w:rPr>
-        <w:t>בהתאם לתכניות בניין עיר שבתוקף החלקה בה ממוקמת הדירה שבנדון מסווגת ביעוד 'מגורים ג' מיוחד'.</w:t>
+        <w:t>• בהתאם לתכניות בניין עיר שבתוקף החלקה בה ממוקמת הדירה שבנדון מסווגת ביעוד 'מגורים ג' מיוחד'.</w:t>
       </w:r>
     </w:p>
     <w:p>
       <w:pPr>
         <w:bidi w:val="1"/>
         <w:spacing w:after="80"/>
+        <w:ind w:left="283" w:right="283"/>
         <w:jc w:val="right"/>
       </w:pPr>
       <w:r>
         <w:rPr>
           <w:b w:val="0"/>
           <w:rtl/>
-          <w:rFonts w:ascii="Arial" w:hAnsi="Arial" w:cs="Arial"/>
+          <w:rFonts w:ascii="David" w:hAnsi="David" w:cs="David"/>
           <w:sz w:val="24"/>
           <w:szCs w:val="24"/>
         </w:rPr>
-        <w:t xml:space="preserve">• </w:t>
-      </w:r>
-      <w:r>
-        <w:rPr>
-          <w:b w:val="0"/>
-          <w:rtl/>
-          <w:rFonts w:ascii="Arial" w:hAnsi="Arial" w:cs="Arial"/>
-          <w:sz w:val="24"/>
-          <w:szCs w:val="24"/>
-        </w:rPr>
-        <w:t>הדירה שבנדון בנויה בהתאם להיתר בניה משנת 1985.</w:t>
+        <w:t>• הדירה שבנדון בנויה בהתאם להיתר בניה משנת 1985.</w:t>
       </w:r>
     </w:p>
     <w:p>
       <w:pPr>
         <w:bidi w:val="1"/>
         <w:spacing w:after="80"/>
+        <w:ind w:left="283" w:right="283"/>
         <w:jc w:val="right"/>
       </w:pPr>
       <w:r>
         <w:rPr>
           <w:b w:val="0"/>
           <w:rtl/>
-          <w:rFonts w:ascii="Arial" w:hAnsi="Arial" w:cs="Arial"/>
+          <w:rFonts w:ascii="David" w:hAnsi="David" w:cs="David"/>
           <w:sz w:val="24"/>
           <w:szCs w:val="24"/>
         </w:rPr>
-        <w:t xml:space="preserve">• </w:t>
-      </w:r>
-      <w:r>
-        <w:rPr>
-          <w:b w:val="0"/>
-          <w:rtl/>
-          <w:rFonts w:ascii="Arial" w:hAnsi="Arial" w:cs="Arial"/>
-          <w:sz w:val="24"/>
-          <w:szCs w:val="24"/>
-        </w:rPr>
-        <w:t>תעודת גמר לבניין ניתנה בשנת 1987.</w:t>
+        <w:t>• תעודת גמר לבניין ניתנה בשנת 1987.</w:t>
       </w:r>
     </w:p>
     <w:p>
@@ -2557,7 +2562,7 @@
         <w:rPr>
           <w:b/>
           <w:rtl/>
-          <w:rFonts w:ascii="Arial" w:hAnsi="Arial" w:cs="Arial"/>
+          <w:rFonts w:ascii="David" w:hAnsi="David" w:cs="David"/>
           <w:sz w:val="24"/>
           <w:szCs w:val="24"/>
           <w:b/>
@@ -2570,81 +2575,54 @@
       <w:pPr>
         <w:bidi w:val="1"/>
         <w:spacing w:after="80"/>
+        <w:ind w:left="283" w:right="283"/>
         <w:jc w:val="right"/>
       </w:pPr>
       <w:r>
         <w:rPr>
           <w:b w:val="0"/>
           <w:rtl/>
-          <w:rFonts w:ascii="Arial" w:hAnsi="Arial" w:cs="Arial"/>
+          <w:rFonts w:ascii="David" w:hAnsi="David" w:cs="David"/>
           <w:sz w:val="24"/>
           <w:szCs w:val="24"/>
         </w:rPr>
-        <w:t xml:space="preserve">• </w:t>
-      </w:r>
-      <w:r>
-        <w:rPr>
-          <w:b w:val="0"/>
-          <w:rtl/>
-          <w:rFonts w:ascii="Arial" w:hAnsi="Arial" w:cs="Arial"/>
-          <w:sz w:val="24"/>
-          <w:szCs w:val="24"/>
-        </w:rPr>
-        <w:t>החלקה בה ממוקמת הדירה שבנדון נרשמה בפנקס הבתים המשותפים, באופן בו כל תת חלקה מהווה יחידה עצמאית מבחינה משפטית.</w:t>
+        <w:t>• החלקה בה ממוקמת הדירה שבנדון נרשמה בפנקס הבתים המשותפים, באופן בו כל תת חלקה מהווה יחידה עצמאית מבחינה משפטית.</w:t>
       </w:r>
     </w:p>
     <w:p>
       <w:pPr>
         <w:bidi w:val="1"/>
         <w:spacing w:after="80"/>
+        <w:ind w:left="283" w:right="283"/>
         <w:jc w:val="right"/>
       </w:pPr>
       <w:r>
         <w:rPr>
           <w:b w:val="0"/>
           <w:rtl/>
-          <w:rFonts w:ascii="Arial" w:hAnsi="Arial" w:cs="Arial"/>
+          <w:rFonts w:ascii="David" w:hAnsi="David" w:cs="David"/>
           <w:sz w:val="24"/>
           <w:szCs w:val="24"/>
         </w:rPr>
-        <w:t xml:space="preserve">• </w:t>
-      </w:r>
-      <w:r>
-        <w:rPr>
-          <w:b w:val="0"/>
-          <w:rtl/>
-          <w:rFonts w:ascii="Arial" w:hAnsi="Arial" w:cs="Arial"/>
-          <w:sz w:val="24"/>
-          <w:szCs w:val="24"/>
-        </w:rPr>
-        <w:t>הדירה שבנדון רשומה על שם ישראל ישראלי (1/1).</w:t>
+        <w:t>• הדירה שבנדון רשומה על שם ישראל ישראלי (1/1).</w:t>
       </w:r>
     </w:p>
     <w:p>
       <w:pPr>
         <w:bidi w:val="1"/>
         <w:spacing w:after="80"/>
+        <w:ind w:left="283" w:right="283"/>
         <w:jc w:val="right"/>
       </w:pPr>
       <w:r>
         <w:rPr>
           <w:b w:val="0"/>
           <w:rtl/>
-          <w:rFonts w:ascii="Arial" w:hAnsi="Arial" w:cs="Arial"/>
+          <w:rFonts w:ascii="David" w:hAnsi="David" w:cs="David"/>
           <w:sz w:val="24"/>
           <w:szCs w:val="24"/>
         </w:rPr>
-        <w:t xml:space="preserve">• </w:t>
-      </w:r>
-      <w:r>
-        <w:rPr>
-          <w:b w:val="0"/>
-          <w:rtl/>
-          <w:rFonts w:ascii="Arial" w:hAnsi="Arial" w:cs="Arial"/>
-          <w:sz w:val="24"/>
-          <w:szCs w:val="24"/>
-        </w:rPr>
-        <w:t>נכון למועד הביקור, הדירה מושכרת בשכירות חופשית.</w:t>
+        <w:t>• נכון למועד הביקור, הדירה מושכרת בשכירות חופשית.</w:t>
       </w:r>
     </w:p>
     <w:p>
@@ -2657,7 +2635,7 @@
         <w:rPr>
           <w:b/>
           <w:rtl/>
-          <w:rFonts w:ascii="Arial" w:hAnsi="Arial" w:cs="Arial"/>
+          <w:rFonts w:ascii="David" w:hAnsi="David" w:cs="David"/>
           <w:sz w:val="24"/>
           <w:szCs w:val="24"/>
           <w:b/>
@@ -2670,54 +2648,36 @@
       <w:pPr>
         <w:bidi w:val="1"/>
         <w:spacing w:after="80"/>
+        <w:ind w:left="283" w:right="283"/>
         <w:jc w:val="right"/>
       </w:pPr>
       <w:r>
         <w:rPr>
           <w:b w:val="0"/>
           <w:rtl/>
-          <w:rFonts w:ascii="Arial" w:hAnsi="Arial" w:cs="Arial"/>
+          <w:rFonts w:ascii="David" w:hAnsi="David" w:cs="David"/>
           <w:sz w:val="24"/>
           <w:szCs w:val="24"/>
         </w:rPr>
-        <w:t xml:space="preserve">• </w:t>
-      </w:r>
-      <w:r>
-        <w:rPr>
-          <w:b w:val="0"/>
-          <w:rtl/>
-          <w:rFonts w:ascii="Arial" w:hAnsi="Arial" w:cs="Arial"/>
-          <w:sz w:val="24"/>
-          <w:szCs w:val="24"/>
-        </w:rPr>
-        <w:t>אומדן השווי נערך לנכס שבנדון כחופשי מכל הערה, חוב ושעבוד.</w:t>
+        <w:t>• אומדן השווי נערך לנכס שבנדון כחופשי מכל הערה, חוב ושעבוד.</w:t>
       </w:r>
     </w:p>
     <w:p>
       <w:pPr>
         <w:bidi w:val="1"/>
         <w:spacing w:after="80"/>
+        <w:ind w:left="283" w:right="283"/>
         <w:jc w:val="right"/>
       </w:pPr>
       <w:r>
         <w:rPr>
           <w:b w:val="0"/>
           <w:rtl/>
-          <w:rFonts w:ascii="Arial" w:hAnsi="Arial" w:cs="Arial"/>
+          <w:rFonts w:ascii="David" w:hAnsi="David" w:cs="David"/>
           <w:sz w:val="24"/>
           <w:szCs w:val="24"/>
         </w:rPr>
-        <w:t xml:space="preserve">• </w:t>
-      </w:r>
-      <w:r>
-        <w:rPr>
-          <w:b w:val="0"/>
-          <w:rtl/>
-          <w:rFonts w:ascii="Arial" w:hAnsi="Arial" w:cs="Arial"/>
-          <w:sz w:val="24"/>
-          <w:szCs w:val="24"/>
-        </w:rPr>
-        <w:t>הובא בחשבון מצב שוק המקרקעין ומחירי נכסים דומים ורלוונטיים בסביבת הנכס וסביב המועד הקובע לחוות הדעת.</w:t>
+        <w:t>• הובא בחשבון מצב שוק המקרקעין ומחירי נכסים דומים ורלוונטיים בסביבת הנכס וסביב המועד הקובע לחוות הדעת.</w:t>
       </w:r>
     </w:p>
     <w:p>
@@ -2737,11 +2697,12 @@
         <w:rPr>
           <w:b/>
           <w:rtl/>
-          <w:rFonts w:ascii="Arial" w:hAnsi="Arial" w:cs="Arial"/>
-          <w:sz w:val="26"/>
-          <w:szCs w:val="26"/>
+          <w:rFonts w:ascii="David" w:hAnsi="David" w:cs="David"/>
+          <w:sz w:val="24"/>
+          <w:szCs w:val="24"/>
           <w:b/>
           <w:bCs/>
+          <w:u w:val="single"/>
         </w:rPr>
         <w:t>ב. נתוני השוואה</w:t>
       </w:r>
@@ -2751,23 +2712,24 @@
         <w:tblStyle w:val="TableGrid"/>
         <w:tblW w:type="auto" w:w="0"/>
         <w:tblLook w:firstColumn="1" w:firstRow="1" w:lastColumn="0" w:lastRow="0" w:noHBand="0" w:noVBand="1" w:val="04A0"/>
+        <w:bidiVisual/>
       </w:tblPr>
       <w:tblGrid>
-        <w:gridCol w:w="941"/>
-        <w:gridCol w:w="941"/>
-        <w:gridCol w:w="941"/>
-        <w:gridCol w:w="941"/>
-        <w:gridCol w:w="941"/>
-        <w:gridCol w:w="941"/>
-        <w:gridCol w:w="941"/>
-        <w:gridCol w:w="941"/>
-        <w:gridCol w:w="941"/>
-        <w:gridCol w:w="941"/>
+        <w:gridCol w:w="831"/>
+        <w:gridCol w:w="831"/>
+        <w:gridCol w:w="831"/>
+        <w:gridCol w:w="831"/>
+        <w:gridCol w:w="831"/>
+        <w:gridCol w:w="831"/>
+        <w:gridCol w:w="831"/>
+        <w:gridCol w:w="831"/>
+        <w:gridCol w:w="831"/>
+        <w:gridCol w:w="831"/>
       </w:tblGrid>
       <w:tr>
         <w:tc>
           <w:tcPr>
-            <w:tcW w:type="dxa" w:w="941"/>
+            <w:tcW w:type="dxa" w:w="831"/>
           </w:tcPr>
           <w:p>
             <w:pPr>
@@ -2777,7 +2739,7 @@
             <w:r>
               <w:rPr>
                 <w:rtl/>
-                <w:rFonts w:ascii="Arial" w:hAnsi="Arial" w:cs="Arial"/>
+                <w:rFonts w:ascii="David" w:hAnsi="David" w:cs="David"/>
                 <w:sz w:val="20"/>
                 <w:szCs w:val="20"/>
                 <w:b/>
@@ -2789,7 +2751,7 @@
         </w:tc>
         <w:tc>
           <w:tcPr>
-            <w:tcW w:type="dxa" w:w="941"/>
+            <w:tcW w:type="dxa" w:w="831"/>
           </w:tcPr>
           <w:p>
             <w:pPr>
@@ -2799,7 +2761,7 @@
             <w:r>
               <w:rPr>
                 <w:rtl/>
-                <w:rFonts w:ascii="Arial" w:hAnsi="Arial" w:cs="Arial"/>
+                <w:rFonts w:ascii="David" w:hAnsi="David" w:cs="David"/>
                 <w:sz w:val="20"/>
                 <w:szCs w:val="20"/>
                 <w:b/>
@@ -2811,7 +2773,7 @@
         </w:tc>
         <w:tc>
           <w:tcPr>
-            <w:tcW w:type="dxa" w:w="941"/>
+            <w:tcW w:type="dxa" w:w="831"/>
           </w:tcPr>
           <w:p>
             <w:pPr>
@@ -2821,7 +2783,7 @@
             <w:r>
               <w:rPr>
                 <w:rtl/>
-                <w:rFonts w:ascii="Arial" w:hAnsi="Arial" w:cs="Arial"/>
+                <w:rFonts w:ascii="David" w:hAnsi="David" w:cs="David"/>
                 <w:sz w:val="20"/>
                 <w:szCs w:val="20"/>
                 <w:b/>
@@ -2833,7 +2795,7 @@
         </w:tc>
         <w:tc>
           <w:tcPr>
-            <w:tcW w:type="dxa" w:w="941"/>
+            <w:tcW w:type="dxa" w:w="831"/>
           </w:tcPr>
           <w:p>
             <w:pPr>
@@ -2843,7 +2805,7 @@
             <w:r>
               <w:rPr>
                 <w:rtl/>
-                <w:rFonts w:ascii="Arial" w:hAnsi="Arial" w:cs="Arial"/>
+                <w:rFonts w:ascii="David" w:hAnsi="David" w:cs="David"/>
                 <w:sz w:val="20"/>
                 <w:szCs w:val="20"/>
                 <w:b/>
@@ -2855,7 +2817,7 @@
         </w:tc>
         <w:tc>
           <w:tcPr>
-            <w:tcW w:type="dxa" w:w="941"/>
+            <w:tcW w:type="dxa" w:w="831"/>
           </w:tcPr>
           <w:p>
             <w:pPr>
@@ -2865,7 +2827,7 @@
             <w:r>
               <w:rPr>
                 <w:rtl/>
-                <w:rFonts w:ascii="Arial" w:hAnsi="Arial" w:cs="Arial"/>
+                <w:rFonts w:ascii="David" w:hAnsi="David" w:cs="David"/>
                 <w:sz w:val="20"/>
                 <w:szCs w:val="20"/>
                 <w:b/>
@@ -2877,7 +2839,7 @@
         </w:tc>
         <w:tc>
           <w:tcPr>
-            <w:tcW w:type="dxa" w:w="941"/>
+            <w:tcW w:type="dxa" w:w="831"/>
           </w:tcPr>
           <w:p>
             <w:pPr>
@@ -2887,7 +2849,7 @@
             <w:r>
               <w:rPr>
                 <w:rtl/>
-                <w:rFonts w:ascii="Arial" w:hAnsi="Arial" w:cs="Arial"/>
+                <w:rFonts w:ascii="David" w:hAnsi="David" w:cs="David"/>
                 <w:sz w:val="20"/>
                 <w:szCs w:val="20"/>
                 <w:b/>
@@ -2899,7 +2861,7 @@
         </w:tc>
         <w:tc>
           <w:tcPr>
-            <w:tcW w:type="dxa" w:w="941"/>
+            <w:tcW w:type="dxa" w:w="831"/>
           </w:tcPr>
           <w:p>
             <w:pPr>
@@ -2909,7 +2871,7 @@
             <w:r>
               <w:rPr>
                 <w:rtl/>
-                <w:rFonts w:ascii="Arial" w:hAnsi="Arial" w:cs="Arial"/>
+                <w:rFonts w:ascii="David" w:hAnsi="David" w:cs="David"/>
                 <w:sz w:val="20"/>
                 <w:szCs w:val="20"/>
                 <w:b/>
@@ -2921,7 +2883,7 @@
         </w:tc>
         <w:tc>
           <w:tcPr>
-            <w:tcW w:type="dxa" w:w="941"/>
+            <w:tcW w:type="dxa" w:w="831"/>
           </w:tcPr>
           <w:p>
             <w:pPr>
@@ -2931,7 +2893,7 @@
             <w:r>
               <w:rPr>
                 <w:rtl/>
-                <w:rFonts w:ascii="Arial" w:hAnsi="Arial" w:cs="Arial"/>
+                <w:rFonts w:ascii="David" w:hAnsi="David" w:cs="David"/>
                 <w:sz w:val="20"/>
                 <w:szCs w:val="20"/>
                 <w:b/>
@@ -2943,7 +2905,7 @@
         </w:tc>
         <w:tc>
           <w:tcPr>
-            <w:tcW w:type="dxa" w:w="941"/>
+            <w:tcW w:type="dxa" w:w="831"/>
           </w:tcPr>
           <w:p>
             <w:pPr>
@@ -2953,7 +2915,7 @@
             <w:r>
               <w:rPr>
                 <w:rtl/>
-                <w:rFonts w:ascii="Arial" w:hAnsi="Arial" w:cs="Arial"/>
+                <w:rFonts w:ascii="David" w:hAnsi="David" w:cs="David"/>
                 <w:sz w:val="20"/>
                 <w:szCs w:val="20"/>
                 <w:b/>
@@ -2965,7 +2927,7 @@
         </w:tc>
         <w:tc>
           <w:tcPr>
-            <w:tcW w:type="dxa" w:w="941"/>
+            <w:tcW w:type="dxa" w:w="831"/>
           </w:tcPr>
           <w:p>
             <w:pPr>
@@ -2975,7 +2937,7 @@
             <w:r>
               <w:rPr>
                 <w:rtl/>
-                <w:rFonts w:ascii="Arial" w:hAnsi="Arial" w:cs="Arial"/>
+                <w:rFonts w:ascii="David" w:hAnsi="David" w:cs="David"/>
                 <w:sz w:val="20"/>
                 <w:szCs w:val="20"/>
                 <w:b/>
@@ -2989,7 +2951,7 @@
       <w:tr>
         <w:tc>
           <w:tcPr>
-            <w:tcW w:type="dxa" w:w="941"/>
+            <w:tcW w:type="dxa" w:w="831"/>
           </w:tcPr>
           <w:p>
             <w:pPr>
@@ -2999,7 +2961,7 @@
             <w:r>
               <w:rPr>
                 <w:rtl/>
-                <w:rFonts w:ascii="Arial" w:hAnsi="Arial" w:cs="Arial"/>
+                <w:rFonts w:ascii="David" w:hAnsi="David" w:cs="David"/>
                 <w:sz w:val="20"/>
                 <w:szCs w:val="20"/>
               </w:rPr>
@@ -3009,7 +2971,7 @@
         </w:tc>
         <w:tc>
           <w:tcPr>
-            <w:tcW w:type="dxa" w:w="941"/>
+            <w:tcW w:type="dxa" w:w="831"/>
           </w:tcPr>
           <w:p>
             <w:pPr>
@@ -3019,7 +2981,7 @@
             <w:r>
               <w:rPr>
                 <w:rtl/>
-                <w:rFonts w:ascii="Arial" w:hAnsi="Arial" w:cs="Arial"/>
+                <w:rFonts w:ascii="David" w:hAnsi="David" w:cs="David"/>
                 <w:sz w:val="20"/>
                 <w:szCs w:val="20"/>
               </w:rPr>
@@ -3029,7 +2991,7 @@
         </w:tc>
         <w:tc>
           <w:tcPr>
-            <w:tcW w:type="dxa" w:w="941"/>
+            <w:tcW w:type="dxa" w:w="831"/>
           </w:tcPr>
           <w:p>
             <w:pPr>
@@ -3039,7 +3001,7 @@
             <w:r>
               <w:rPr>
                 <w:rtl/>
-                <w:rFonts w:ascii="Arial" w:hAnsi="Arial" w:cs="Arial"/>
+                <w:rFonts w:ascii="David" w:hAnsi="David" w:cs="David"/>
                 <w:sz w:val="20"/>
                 <w:szCs w:val="20"/>
               </w:rPr>
@@ -3049,7 +3011,7 @@
         </w:tc>
         <w:tc>
           <w:tcPr>
-            <w:tcW w:type="dxa" w:w="941"/>
+            <w:tcW w:type="dxa" w:w="831"/>
           </w:tcPr>
           <w:p>
             <w:pPr>
@@ -3059,7 +3021,7 @@
             <w:r>
               <w:rPr>
                 <w:rtl/>
-                <w:rFonts w:ascii="Arial" w:hAnsi="Arial" w:cs="Arial"/>
+                <w:rFonts w:ascii="David" w:hAnsi="David" w:cs="David"/>
                 <w:sz w:val="20"/>
                 <w:szCs w:val="20"/>
               </w:rPr>
@@ -3069,7 +3031,7 @@
         </w:tc>
         <w:tc>
           <w:tcPr>
-            <w:tcW w:type="dxa" w:w="941"/>
+            <w:tcW w:type="dxa" w:w="831"/>
           </w:tcPr>
           <w:p>
             <w:pPr>
@@ -3079,7 +3041,7 @@
             <w:r>
               <w:rPr>
                 <w:rtl/>
-                <w:rFonts w:ascii="Arial" w:hAnsi="Arial" w:cs="Arial"/>
+                <w:rFonts w:ascii="David" w:hAnsi="David" w:cs="David"/>
                 <w:sz w:val="20"/>
                 <w:szCs w:val="20"/>
               </w:rPr>
@@ -3089,7 +3051,7 @@
         </w:tc>
         <w:tc>
           <w:tcPr>
-            <w:tcW w:type="dxa" w:w="941"/>
+            <w:tcW w:type="dxa" w:w="831"/>
           </w:tcPr>
           <w:p>
             <w:pPr>
@@ -3099,7 +3061,7 @@
             <w:r>
               <w:rPr>
                 <w:rtl/>
-                <w:rFonts w:ascii="Arial" w:hAnsi="Arial" w:cs="Arial"/>
+                <w:rFonts w:ascii="David" w:hAnsi="David" w:cs="David"/>
                 <w:sz w:val="20"/>
                 <w:szCs w:val="20"/>
               </w:rPr>
@@ -3109,7 +3071,7 @@
         </w:tc>
         <w:tc>
           <w:tcPr>
-            <w:tcW w:type="dxa" w:w="941"/>
+            <w:tcW w:type="dxa" w:w="831"/>
           </w:tcPr>
           <w:p>
             <w:pPr>
@@ -3119,7 +3081,7 @@
             <w:r>
               <w:rPr>
                 <w:rtl/>
-                <w:rFonts w:ascii="Arial" w:hAnsi="Arial" w:cs="Arial"/>
+                <w:rFonts w:ascii="David" w:hAnsi="David" w:cs="David"/>
                 <w:sz w:val="20"/>
                 <w:szCs w:val="20"/>
               </w:rPr>
@@ -3129,7 +3091,7 @@
         </w:tc>
         <w:tc>
           <w:tcPr>
-            <w:tcW w:type="dxa" w:w="941"/>
+            <w:tcW w:type="dxa" w:w="831"/>
           </w:tcPr>
           <w:p>
             <w:pPr>
@@ -3139,7 +3101,7 @@
             <w:r>
               <w:rPr>
                 <w:rtl/>
-                <w:rFonts w:ascii="Arial" w:hAnsi="Arial" w:cs="Arial"/>
+                <w:rFonts w:ascii="David" w:hAnsi="David" w:cs="David"/>
                 <w:sz w:val="20"/>
                 <w:szCs w:val="20"/>
               </w:rPr>
@@ -3149,7 +3111,7 @@
         </w:tc>
         <w:tc>
           <w:tcPr>
-            <w:tcW w:type="dxa" w:w="941"/>
+            <w:tcW w:type="dxa" w:w="831"/>
           </w:tcPr>
           <w:p>
             <w:pPr>
@@ -3159,7 +3121,7 @@
             <w:r>
               <w:rPr>
                 <w:rtl/>
-                <w:rFonts w:ascii="Arial" w:hAnsi="Arial" w:cs="Arial"/>
+                <w:rFonts w:ascii="David" w:hAnsi="David" w:cs="David"/>
                 <w:sz w:val="20"/>
                 <w:szCs w:val="20"/>
               </w:rPr>
@@ -3169,7 +3131,7 @@
         </w:tc>
         <w:tc>
           <w:tcPr>
-            <w:tcW w:type="dxa" w:w="941"/>
+            <w:tcW w:type="dxa" w:w="831"/>
           </w:tcPr>
           <w:p>
             <w:pPr>
@@ -3179,7 +3141,7 @@
             <w:r>
               <w:rPr>
                 <w:rtl/>
-                <w:rFonts w:ascii="Arial" w:hAnsi="Arial" w:cs="Arial"/>
+                <w:rFonts w:ascii="David" w:hAnsi="David" w:cs="David"/>
                 <w:sz w:val="20"/>
                 <w:szCs w:val="20"/>
               </w:rPr>
@@ -3191,7 +3153,7 @@
       <w:tr>
         <w:tc>
           <w:tcPr>
-            <w:tcW w:type="dxa" w:w="941"/>
+            <w:tcW w:type="dxa" w:w="831"/>
           </w:tcPr>
           <w:p>
             <w:pPr>
@@ -3201,7 +3163,7 @@
             <w:r>
               <w:rPr>
                 <w:rtl/>
-                <w:rFonts w:ascii="Arial" w:hAnsi="Arial" w:cs="Arial"/>
+                <w:rFonts w:ascii="David" w:hAnsi="David" w:cs="David"/>
                 <w:sz w:val="20"/>
                 <w:szCs w:val="20"/>
               </w:rPr>
@@ -3211,7 +3173,7 @@
         </w:tc>
         <w:tc>
           <w:tcPr>
-            <w:tcW w:type="dxa" w:w="941"/>
+            <w:tcW w:type="dxa" w:w="831"/>
           </w:tcPr>
           <w:p>
             <w:pPr>
@@ -3221,7 +3183,7 @@
             <w:r>
               <w:rPr>
                 <w:rtl/>
-                <w:rFonts w:ascii="Arial" w:hAnsi="Arial" w:cs="Arial"/>
+                <w:rFonts w:ascii="David" w:hAnsi="David" w:cs="David"/>
                 <w:sz w:val="20"/>
                 <w:szCs w:val="20"/>
               </w:rPr>
@@ -3231,7 +3193,7 @@
         </w:tc>
         <w:tc>
           <w:tcPr>
-            <w:tcW w:type="dxa" w:w="941"/>
+            <w:tcW w:type="dxa" w:w="831"/>
           </w:tcPr>
           <w:p>
             <w:pPr>
@@ -3241,7 +3203,7 @@
             <w:r>
               <w:rPr>
                 <w:rtl/>
-                <w:rFonts w:ascii="Arial" w:hAnsi="Arial" w:cs="Arial"/>
+                <w:rFonts w:ascii="David" w:hAnsi="David" w:cs="David"/>
                 <w:sz w:val="20"/>
                 <w:szCs w:val="20"/>
               </w:rPr>
@@ -3251,7 +3213,7 @@
         </w:tc>
         <w:tc>
           <w:tcPr>
-            <w:tcW w:type="dxa" w:w="941"/>
+            <w:tcW w:type="dxa" w:w="831"/>
           </w:tcPr>
           <w:p>
             <w:pPr>
@@ -3261,7 +3223,7 @@
             <w:r>
               <w:rPr>
                 <w:rtl/>
-                <w:rFonts w:ascii="Arial" w:hAnsi="Arial" w:cs="Arial"/>
+                <w:rFonts w:ascii="David" w:hAnsi="David" w:cs="David"/>
                 <w:sz w:val="20"/>
                 <w:szCs w:val="20"/>
               </w:rPr>
@@ -3271,7 +3233,7 @@
         </w:tc>
         <w:tc>
           <w:tcPr>
-            <w:tcW w:type="dxa" w:w="941"/>
+            <w:tcW w:type="dxa" w:w="831"/>
           </w:tcPr>
           <w:p>
             <w:pPr>
@@ -3281,7 +3243,7 @@
             <w:r>
               <w:rPr>
                 <w:rtl/>
-                <w:rFonts w:ascii="Arial" w:hAnsi="Arial" w:cs="Arial"/>
+                <w:rFonts w:ascii="David" w:hAnsi="David" w:cs="David"/>
                 <w:sz w:val="20"/>
                 <w:szCs w:val="20"/>
               </w:rPr>
@@ -3291,7 +3253,7 @@
         </w:tc>
         <w:tc>
           <w:tcPr>
-            <w:tcW w:type="dxa" w:w="941"/>
+            <w:tcW w:type="dxa" w:w="831"/>
           </w:tcPr>
           <w:p>
             <w:pPr>
@@ -3301,7 +3263,7 @@
             <w:r>
               <w:rPr>
                 <w:rtl/>
-                <w:rFonts w:ascii="Arial" w:hAnsi="Arial" w:cs="Arial"/>
+                <w:rFonts w:ascii="David" w:hAnsi="David" w:cs="David"/>
                 <w:sz w:val="20"/>
                 <w:szCs w:val="20"/>
               </w:rPr>
@@ -3311,7 +3273,7 @@
         </w:tc>
         <w:tc>
           <w:tcPr>
-            <w:tcW w:type="dxa" w:w="941"/>
+            <w:tcW w:type="dxa" w:w="831"/>
           </w:tcPr>
           <w:p>
             <w:pPr>
@@ -3321,7 +3283,7 @@
             <w:r>
               <w:rPr>
                 <w:rtl/>
-                <w:rFonts w:ascii="Arial" w:hAnsi="Arial" w:cs="Arial"/>
+                <w:rFonts w:ascii="David" w:hAnsi="David" w:cs="David"/>
                 <w:sz w:val="20"/>
                 <w:szCs w:val="20"/>
               </w:rPr>
@@ -3331,7 +3293,7 @@
         </w:tc>
         <w:tc>
           <w:tcPr>
-            <w:tcW w:type="dxa" w:w="941"/>
+            <w:tcW w:type="dxa" w:w="831"/>
           </w:tcPr>
           <w:p>
             <w:pPr>
@@ -3341,7 +3303,7 @@
             <w:r>
               <w:rPr>
                 <w:rtl/>
-                <w:rFonts w:ascii="Arial" w:hAnsi="Arial" w:cs="Arial"/>
+                <w:rFonts w:ascii="David" w:hAnsi="David" w:cs="David"/>
                 <w:sz w:val="20"/>
                 <w:szCs w:val="20"/>
               </w:rPr>
@@ -3351,7 +3313,7 @@
         </w:tc>
         <w:tc>
           <w:tcPr>
-            <w:tcW w:type="dxa" w:w="941"/>
+            <w:tcW w:type="dxa" w:w="831"/>
           </w:tcPr>
           <w:p>
             <w:pPr>
@@ -3361,7 +3323,7 @@
             <w:r>
               <w:rPr>
                 <w:rtl/>
-                <w:rFonts w:ascii="Arial" w:hAnsi="Arial" w:cs="Arial"/>
+                <w:rFonts w:ascii="David" w:hAnsi="David" w:cs="David"/>
                 <w:sz w:val="20"/>
                 <w:szCs w:val="20"/>
               </w:rPr>
@@ -3371,7 +3333,7 @@
         </w:tc>
         <w:tc>
           <w:tcPr>
-            <w:tcW w:type="dxa" w:w="941"/>
+            <w:tcW w:type="dxa" w:w="831"/>
           </w:tcPr>
           <w:p>
             <w:pPr>
@@ -3381,7 +3343,7 @@
             <w:r>
               <w:rPr>
                 <w:rtl/>
-                <w:rFonts w:ascii="Arial" w:hAnsi="Arial" w:cs="Arial"/>
+                <w:rFonts w:ascii="David" w:hAnsi="David" w:cs="David"/>
                 <w:sz w:val="20"/>
                 <w:szCs w:val="20"/>
               </w:rPr>
@@ -3393,7 +3355,7 @@
       <w:tr>
         <w:tc>
           <w:tcPr>
-            <w:tcW w:type="dxa" w:w="941"/>
+            <w:tcW w:type="dxa" w:w="831"/>
           </w:tcPr>
           <w:p>
             <w:pPr>
@@ -3403,7 +3365,7 @@
             <w:r>
               <w:rPr>
                 <w:rtl/>
-                <w:rFonts w:ascii="Arial" w:hAnsi="Arial" w:cs="Arial"/>
+                <w:rFonts w:ascii="David" w:hAnsi="David" w:cs="David"/>
                 <w:sz w:val="20"/>
                 <w:szCs w:val="20"/>
               </w:rPr>
@@ -3413,7 +3375,7 @@
         </w:tc>
         <w:tc>
           <w:tcPr>
-            <w:tcW w:type="dxa" w:w="941"/>
+            <w:tcW w:type="dxa" w:w="831"/>
           </w:tcPr>
           <w:p>
             <w:pPr>
@@ -3423,7 +3385,7 @@
             <w:r>
               <w:rPr>
                 <w:rtl/>
-                <w:rFonts w:ascii="Arial" w:hAnsi="Arial" w:cs="Arial"/>
+                <w:rFonts w:ascii="David" w:hAnsi="David" w:cs="David"/>
                 <w:sz w:val="20"/>
                 <w:szCs w:val="20"/>
               </w:rPr>
@@ -3433,7 +3395,7 @@
         </w:tc>
         <w:tc>
           <w:tcPr>
-            <w:tcW w:type="dxa" w:w="941"/>
+            <w:tcW w:type="dxa" w:w="831"/>
           </w:tcPr>
           <w:p>
             <w:pPr>
@@ -3443,7 +3405,7 @@
             <w:r>
               <w:rPr>
                 <w:rtl/>
-                <w:rFonts w:ascii="Arial" w:hAnsi="Arial" w:cs="Arial"/>
+                <w:rFonts w:ascii="David" w:hAnsi="David" w:cs="David"/>
                 <w:sz w:val="20"/>
                 <w:szCs w:val="20"/>
               </w:rPr>
@@ -3453,7 +3415,7 @@
         </w:tc>
         <w:tc>
           <w:tcPr>
-            <w:tcW w:type="dxa" w:w="941"/>
+            <w:tcW w:type="dxa" w:w="831"/>
           </w:tcPr>
           <w:p>
             <w:pPr>
@@ -3463,7 +3425,7 @@
             <w:r>
               <w:rPr>
                 <w:rtl/>
-                <w:rFonts w:ascii="Arial" w:hAnsi="Arial" w:cs="Arial"/>
+                <w:rFonts w:ascii="David" w:hAnsi="David" w:cs="David"/>
                 <w:sz w:val="20"/>
                 <w:szCs w:val="20"/>
               </w:rPr>
@@ -3473,7 +3435,7 @@
         </w:tc>
         <w:tc>
           <w:tcPr>
-            <w:tcW w:type="dxa" w:w="941"/>
+            <w:tcW w:type="dxa" w:w="831"/>
           </w:tcPr>
           <w:p>
             <w:pPr>
@@ -3483,7 +3445,7 @@
             <w:r>
               <w:rPr>
                 <w:rtl/>
-                <w:rFonts w:ascii="Arial" w:hAnsi="Arial" w:cs="Arial"/>
+                <w:rFonts w:ascii="David" w:hAnsi="David" w:cs="David"/>
                 <w:sz w:val="20"/>
                 <w:szCs w:val="20"/>
               </w:rPr>
@@ -3493,7 +3455,7 @@
         </w:tc>
         <w:tc>
           <w:tcPr>
-            <w:tcW w:type="dxa" w:w="941"/>
+            <w:tcW w:type="dxa" w:w="831"/>
           </w:tcPr>
           <w:p>
             <w:pPr>
@@ -3503,7 +3465,7 @@
             <w:r>
               <w:rPr>
                 <w:rtl/>
-                <w:rFonts w:ascii="Arial" w:hAnsi="Arial" w:cs="Arial"/>
+                <w:rFonts w:ascii="David" w:hAnsi="David" w:cs="David"/>
                 <w:sz w:val="20"/>
                 <w:szCs w:val="20"/>
               </w:rPr>
@@ -3513,7 +3475,7 @@
         </w:tc>
         <w:tc>
           <w:tcPr>
-            <w:tcW w:type="dxa" w:w="941"/>
+            <w:tcW w:type="dxa" w:w="831"/>
           </w:tcPr>
           <w:p>
             <w:pPr>
@@ -3523,7 +3485,7 @@
             <w:r>
               <w:rPr>
                 <w:rtl/>
-                <w:rFonts w:ascii="Arial" w:hAnsi="Arial" w:cs="Arial"/>
+                <w:rFonts w:ascii="David" w:hAnsi="David" w:cs="David"/>
                 <w:sz w:val="20"/>
                 <w:szCs w:val="20"/>
               </w:rPr>
@@ -3533,7 +3495,7 @@
         </w:tc>
         <w:tc>
           <w:tcPr>
-            <w:tcW w:type="dxa" w:w="941"/>
+            <w:tcW w:type="dxa" w:w="831"/>
           </w:tcPr>
           <w:p>
             <w:pPr>
@@ -3543,7 +3505,7 @@
             <w:r>
               <w:rPr>
                 <w:rtl/>
-                <w:rFonts w:ascii="Arial" w:hAnsi="Arial" w:cs="Arial"/>
+                <w:rFonts w:ascii="David" w:hAnsi="David" w:cs="David"/>
                 <w:sz w:val="20"/>
                 <w:szCs w:val="20"/>
               </w:rPr>
@@ -3553,7 +3515,7 @@
         </w:tc>
         <w:tc>
           <w:tcPr>
-            <w:tcW w:type="dxa" w:w="941"/>
+            <w:tcW w:type="dxa" w:w="831"/>
           </w:tcPr>
           <w:p>
             <w:pPr>
@@ -3563,7 +3525,7 @@
             <w:r>
               <w:rPr>
                 <w:rtl/>
-                <w:rFonts w:ascii="Arial" w:hAnsi="Arial" w:cs="Arial"/>
+                <w:rFonts w:ascii="David" w:hAnsi="David" w:cs="David"/>
                 <w:sz w:val="20"/>
                 <w:szCs w:val="20"/>
               </w:rPr>
@@ -3573,7 +3535,7 @@
         </w:tc>
         <w:tc>
           <w:tcPr>
-            <w:tcW w:type="dxa" w:w="941"/>
+            <w:tcW w:type="dxa" w:w="831"/>
           </w:tcPr>
           <w:p>
             <w:pPr>
@@ -3583,7 +3545,7 @@
             <w:r>
               <w:rPr>
                 <w:rtl/>
-                <w:rFonts w:ascii="Arial" w:hAnsi="Arial" w:cs="Arial"/>
+                <w:rFonts w:ascii="David" w:hAnsi="David" w:cs="David"/>
                 <w:sz w:val="20"/>
                 <w:szCs w:val="20"/>
               </w:rPr>
@@ -3595,7 +3557,7 @@
       <w:tr>
         <w:tc>
           <w:tcPr>
-            <w:tcW w:type="dxa" w:w="941"/>
+            <w:tcW w:type="dxa" w:w="831"/>
           </w:tcPr>
           <w:p>
             <w:pPr>
@@ -3605,7 +3567,7 @@
             <w:r>
               <w:rPr>
                 <w:rtl/>
-                <w:rFonts w:ascii="Arial" w:hAnsi="Arial" w:cs="Arial"/>
+                <w:rFonts w:ascii="David" w:hAnsi="David" w:cs="David"/>
                 <w:sz w:val="20"/>
                 <w:szCs w:val="20"/>
               </w:rPr>
@@ -3615,7 +3577,7 @@
         </w:tc>
         <w:tc>
           <w:tcPr>
-            <w:tcW w:type="dxa" w:w="941"/>
+            <w:tcW w:type="dxa" w:w="831"/>
           </w:tcPr>
           <w:p>
             <w:pPr>
@@ -3625,7 +3587,7 @@
             <w:r>
               <w:rPr>
                 <w:rtl/>
-                <w:rFonts w:ascii="Arial" w:hAnsi="Arial" w:cs="Arial"/>
+                <w:rFonts w:ascii="David" w:hAnsi="David" w:cs="David"/>
                 <w:sz w:val="20"/>
                 <w:szCs w:val="20"/>
               </w:rPr>
@@ -3635,7 +3597,7 @@
         </w:tc>
         <w:tc>
           <w:tcPr>
-            <w:tcW w:type="dxa" w:w="941"/>
+            <w:tcW w:type="dxa" w:w="831"/>
           </w:tcPr>
           <w:p>
             <w:pPr>
@@ -3645,7 +3607,7 @@
             <w:r>
               <w:rPr>
                 <w:rtl/>
-                <w:rFonts w:ascii="Arial" w:hAnsi="Arial" w:cs="Arial"/>
+                <w:rFonts w:ascii="David" w:hAnsi="David" w:cs="David"/>
                 <w:sz w:val="20"/>
                 <w:szCs w:val="20"/>
               </w:rPr>
@@ -3655,7 +3617,7 @@
         </w:tc>
         <w:tc>
           <w:tcPr>
-            <w:tcW w:type="dxa" w:w="941"/>
+            <w:tcW w:type="dxa" w:w="831"/>
           </w:tcPr>
           <w:p>
             <w:pPr>
@@ -3665,7 +3627,7 @@
             <w:r>
               <w:rPr>
                 <w:rtl/>
-                <w:rFonts w:ascii="Arial" w:hAnsi="Arial" w:cs="Arial"/>
+                <w:rFonts w:ascii="David" w:hAnsi="David" w:cs="David"/>
                 <w:sz w:val="20"/>
                 <w:szCs w:val="20"/>
               </w:rPr>
@@ -3675,7 +3637,7 @@
         </w:tc>
         <w:tc>
           <w:tcPr>
-            <w:tcW w:type="dxa" w:w="941"/>
+            <w:tcW w:type="dxa" w:w="831"/>
           </w:tcPr>
           <w:p>
             <w:pPr>
@@ -3685,7 +3647,7 @@
             <w:r>
               <w:rPr>
                 <w:rtl/>
-                <w:rFonts w:ascii="Arial" w:hAnsi="Arial" w:cs="Arial"/>
+                <w:rFonts w:ascii="David" w:hAnsi="David" w:cs="David"/>
                 <w:sz w:val="20"/>
                 <w:szCs w:val="20"/>
               </w:rPr>
@@ -3695,7 +3657,7 @@
         </w:tc>
         <w:tc>
           <w:tcPr>
-            <w:tcW w:type="dxa" w:w="941"/>
+            <w:tcW w:type="dxa" w:w="831"/>
           </w:tcPr>
           <w:p>
             <w:pPr>
@@ -3705,7 +3667,7 @@
             <w:r>
               <w:rPr>
                 <w:rtl/>
-                <w:rFonts w:ascii="Arial" w:hAnsi="Arial" w:cs="Arial"/>
+                <w:rFonts w:ascii="David" w:hAnsi="David" w:cs="David"/>
                 <w:sz w:val="20"/>
                 <w:szCs w:val="20"/>
               </w:rPr>
@@ -3715,7 +3677,7 @@
         </w:tc>
         <w:tc>
           <w:tcPr>
-            <w:tcW w:type="dxa" w:w="941"/>
+            <w:tcW w:type="dxa" w:w="831"/>
           </w:tcPr>
           <w:p>
             <w:pPr>
@@ -3725,7 +3687,7 @@
             <w:r>
               <w:rPr>
                 <w:rtl/>
-                <w:rFonts w:ascii="Arial" w:hAnsi="Arial" w:cs="Arial"/>
+                <w:rFonts w:ascii="David" w:hAnsi="David" w:cs="David"/>
                 <w:sz w:val="20"/>
                 <w:szCs w:val="20"/>
               </w:rPr>
@@ -3735,7 +3697,7 @@
         </w:tc>
         <w:tc>
           <w:tcPr>
-            <w:tcW w:type="dxa" w:w="941"/>
+            <w:tcW w:type="dxa" w:w="831"/>
           </w:tcPr>
           <w:p>
             <w:pPr>
@@ -3745,7 +3707,7 @@
             <w:r>
               <w:rPr>
                 <w:rtl/>
-                <w:rFonts w:ascii="Arial" w:hAnsi="Arial" w:cs="Arial"/>
+                <w:rFonts w:ascii="David" w:hAnsi="David" w:cs="David"/>
                 <w:sz w:val="20"/>
                 <w:szCs w:val="20"/>
               </w:rPr>
@@ -3755,7 +3717,7 @@
         </w:tc>
         <w:tc>
           <w:tcPr>
-            <w:tcW w:type="dxa" w:w="941"/>
+            <w:tcW w:type="dxa" w:w="831"/>
           </w:tcPr>
           <w:p>
             <w:pPr>
@@ -3765,7 +3727,7 @@
             <w:r>
               <w:rPr>
                 <w:rtl/>
-                <w:rFonts w:ascii="Arial" w:hAnsi="Arial" w:cs="Arial"/>
+                <w:rFonts w:ascii="David" w:hAnsi="David" w:cs="David"/>
                 <w:sz w:val="20"/>
                 <w:szCs w:val="20"/>
               </w:rPr>
@@ -3775,7 +3737,7 @@
         </w:tc>
         <w:tc>
           <w:tcPr>
-            <w:tcW w:type="dxa" w:w="941"/>
+            <w:tcW w:type="dxa" w:w="831"/>
           </w:tcPr>
           <w:p>
             <w:pPr>
@@ -3785,7 +3747,7 @@
             <w:r>
               <w:rPr>
                 <w:rtl/>
-                <w:rFonts w:ascii="Arial" w:hAnsi="Arial" w:cs="Arial"/>
+                <w:rFonts w:ascii="David" w:hAnsi="David" w:cs="David"/>
                 <w:sz w:val="20"/>
                 <w:szCs w:val="20"/>
               </w:rPr>
@@ -3812,7 +3774,7 @@
         <w:rPr>
           <w:b w:val="0"/>
           <w:rtl/>
-          <w:rFonts w:ascii="Arial" w:hAnsi="Arial" w:cs="Arial"/>
+          <w:rFonts w:ascii="David" w:hAnsi="David" w:cs="David"/>
           <w:sz w:val="24"/>
           <w:szCs w:val="24"/>
         </w:rPr>
@@ -3836,11 +3798,12 @@
         <w:rPr>
           <w:b/>
           <w:rtl/>
-          <w:rFonts w:ascii="Arial" w:hAnsi="Arial" w:cs="Arial"/>
-          <w:sz w:val="26"/>
-          <w:szCs w:val="26"/>
+          <w:rFonts w:ascii="David" w:hAnsi="David" w:cs="David"/>
+          <w:sz w:val="24"/>
+          <w:szCs w:val="24"/>
           <w:b/>
           <w:bCs/>
+          <w:u w:val="single"/>
         </w:rPr>
         <w:t>ג. שומה</w:t>
       </w:r>
@@ -3855,7 +3818,7 @@
         <w:rPr>
           <w:b w:val="0"/>
           <w:rtl/>
-          <w:rFonts w:ascii="Arial" w:hAnsi="Arial" w:cs="Arial"/>
+          <w:rFonts w:ascii="David" w:hAnsi="David" w:cs="David"/>
           <w:sz w:val="24"/>
           <w:szCs w:val="24"/>
         </w:rPr>
@@ -3872,7 +3835,7 @@
         <w:rPr>
           <w:b/>
           <w:rtl/>
-          <w:rFonts w:ascii="Arial" w:hAnsi="Arial" w:cs="Arial"/>
+          <w:rFonts w:ascii="David" w:hAnsi="David" w:cs="David"/>
           <w:sz w:val="26"/>
           <w:szCs w:val="26"/>
           <w:b/>
@@ -3891,7 +3854,7 @@
         <w:rPr>
           <w:b w:val="0"/>
           <w:rtl/>
-          <w:rFonts w:ascii="Arial" w:hAnsi="Arial" w:cs="Arial"/>
+          <w:rFonts w:ascii="David" w:hAnsi="David" w:cs="David"/>
           <w:sz w:val="24"/>
           <w:szCs w:val="24"/>
         </w:rPr>
@@ -3908,7 +3871,7 @@
         <w:rPr>
           <w:b w:val="0"/>
           <w:rtl/>
-          <w:rFonts w:ascii="Arial" w:hAnsi="Arial" w:cs="Arial"/>
+          <w:rFonts w:ascii="David" w:hAnsi="David" w:cs="David"/>
           <w:sz w:val="24"/>
           <w:szCs w:val="24"/>
         </w:rPr>
@@ -3932,11 +3895,12 @@
         <w:rPr>
           <w:b/>
           <w:rtl/>
-          <w:rFonts w:ascii="Arial" w:hAnsi="Arial" w:cs="Arial"/>
-          <w:sz w:val="26"/>
-          <w:szCs w:val="26"/>
+          <w:rFonts w:ascii="David" w:hAnsi="David" w:cs="David"/>
+          <w:sz w:val="24"/>
+          <w:szCs w:val="24"/>
           <w:b/>
           <w:bCs/>
+          <w:u w:val="single"/>
         </w:rPr>
         <w:t>הצהרות</w:t>
       </w:r>
@@ -3951,7 +3915,7 @@
         <w:rPr>
           <w:b w:val="0"/>
           <w:rtl/>
-          <w:rFonts w:ascii="Arial" w:hAnsi="Arial" w:cs="Arial"/>
+          <w:rFonts w:ascii="David" w:hAnsi="David" w:cs="David"/>
           <w:sz w:val="24"/>
           <w:szCs w:val="24"/>
         </w:rPr>
@@ -3968,7 +3932,7 @@
         <w:rPr>
           <w:b w:val="0"/>
           <w:rtl/>
-          <w:rFonts w:ascii="Arial" w:hAnsi="Arial" w:cs="Arial"/>
+          <w:rFonts w:ascii="David" w:hAnsi="David" w:cs="David"/>
           <w:sz w:val="24"/>
           <w:szCs w:val="24"/>
         </w:rPr>
@@ -3985,7 +3949,7 @@
         <w:rPr>
           <w:b w:val="0"/>
           <w:rtl/>
-          <w:rFonts w:ascii="Arial" w:hAnsi="Arial" w:cs="Arial"/>
+          <w:rFonts w:ascii="David" w:hAnsi="David" w:cs="David"/>
           <w:sz w:val="24"/>
           <w:szCs w:val="24"/>
         </w:rPr>
@@ -3993,13 +3957,68 @@
       </w:r>
     </w:p>
     <w:sectPr>
-      <w:pgSz w:w="12240" w:h="15840"/>
-      <w:pgMar w:top="1417" w:right="1417" w:bottom="1417" w:left="1417" w:header="720" w:footer="720" w:gutter="0"/>
       <w:cols w:space="720"/>
       <w:docGrid w:linePitch="360"/>
+      <w:headerReference w:type="default" r:id="rId9"/>
+      <w:headerReference w:type="first" r:id="rId10"/>
+      <w:footerReference w:type="default" r:id="rId11"/>
+      <w:footerReference w:type="first" r:id="rId12"/>
+      <w:pgSz w:w="11906" w:h="16838"/>
+      <w:pgMar w:top="1440" w:right="1800" w:bottom="1440" w:left="1800" w:header="708" w:footer="1020" w:gutter="0"/>
+      <w:bidi/>
+      <w:rtlGutter/>
+      <w:titlePg/>
     </w:sectPr>
   </w:body>
 </w:document>
+</file>
+
+<file path=word/footer1.xml><?xml version="1.0" encoding="utf-8"?>
+<w:ftr xmlns:m="http://schemas.openxmlformats.org/officeDocument/2006/math" xmlns:mc="http://schemas.openxmlformats.org/markup-compatibility/2006" xmlns:mo="http://schemas.microsoft.com/office/mac/office/2008/main" xmlns:mv="urn:schemas-microsoft-com:mac:vml" xmlns:o="urn:schemas-microsoft-com:office:office" xmlns:r="http://schemas.openxmlformats.org/officeDocument/2006/relationships" xmlns:v="urn:schemas-microsoft-com:vml" xmlns:w10="urn:schemas-microsoft-com:office:word" xmlns:w14="http://schemas.microsoft.com/office/word/2010/wordml" xmlns:w="http://schemas.openxmlformats.org/wordprocessingml/2006/main" xmlns:wne="http://schemas.microsoft.com/office/word/2006/wordml" xmlns:wp14="http://schemas.microsoft.com/office/word/2010/wordprocessingDrawing" xmlns:wp="http://schemas.openxmlformats.org/drawingml/2006/wordprocessingDrawing" xmlns:wpc="http://schemas.microsoft.com/office/word/2010/wordprocessingCanvas" xmlns:wpg="http://schemas.microsoft.com/office/word/2010/wordprocessingGroup" xmlns:wpi="http://schemas.microsoft.com/office/word/2010/wordprocessingInk" xmlns:wps="http://schemas.microsoft.com/office/word/2010/wordprocessingShape" mc:Ignorable="w14 wp14">
+  <w:p>
+    <w:pPr>
+      <w:pStyle w:val="Footer"/>
+      <w:bidi w:val="1"/>
+      <w:jc w:val="center"/>
+    </w:pPr>
+  </w:p>
+</w:ftr>
+</file>
+
+<file path=word/footer2.xml><?xml version="1.0" encoding="utf-8"?>
+<w:ftr xmlns:m="http://schemas.openxmlformats.org/officeDocument/2006/math" xmlns:mc="http://schemas.openxmlformats.org/markup-compatibility/2006" xmlns:mo="http://schemas.microsoft.com/office/mac/office/2008/main" xmlns:mv="urn:schemas-microsoft-com:mac:vml" xmlns:o="urn:schemas-microsoft-com:office:office" xmlns:r="http://schemas.openxmlformats.org/officeDocument/2006/relationships" xmlns:v="urn:schemas-microsoft-com:vml" xmlns:w10="urn:schemas-microsoft-com:office:word" xmlns:w14="http://schemas.microsoft.com/office/word/2010/wordml" xmlns:w="http://schemas.openxmlformats.org/wordprocessingml/2006/main" xmlns:wne="http://schemas.microsoft.com/office/word/2006/wordml" xmlns:wp14="http://schemas.microsoft.com/office/word/2010/wordprocessingDrawing" xmlns:wp="http://schemas.openxmlformats.org/drawingml/2006/wordprocessingDrawing" xmlns:wpc="http://schemas.microsoft.com/office/word/2010/wordprocessingCanvas" xmlns:wpg="http://schemas.microsoft.com/office/word/2010/wordprocessingGroup" xmlns:wpi="http://schemas.microsoft.com/office/word/2010/wordprocessingInk" xmlns:wps="http://schemas.microsoft.com/office/word/2010/wordprocessingShape" mc:Ignorable="w14 wp14">
+  <w:p>
+    <w:pPr>
+      <w:pStyle w:val="Footer"/>
+      <w:bidi w:val="1"/>
+      <w:jc w:val="center"/>
+    </w:pPr>
+  </w:p>
+</w:ftr>
+</file>
+
+<file path=word/header1.xml><?xml version="1.0" encoding="utf-8"?>
+<w:hdr xmlns:m="http://schemas.openxmlformats.org/officeDocument/2006/math" xmlns:mc="http://schemas.openxmlformats.org/markup-compatibility/2006" xmlns:mo="http://schemas.microsoft.com/office/mac/office/2008/main" xmlns:mv="urn:schemas-microsoft-com:mac:vml" xmlns:o="urn:schemas-microsoft-com:office:office" xmlns:r="http://schemas.openxmlformats.org/officeDocument/2006/relationships" xmlns:v="urn:schemas-microsoft-com:vml" xmlns:w10="urn:schemas-microsoft-com:office:word" xmlns:w14="http://schemas.microsoft.com/office/word/2010/wordml" xmlns:w="http://schemas.openxmlformats.org/wordprocessingml/2006/main" xmlns:wne="http://schemas.microsoft.com/office/word/2006/wordml" xmlns:wp14="http://schemas.microsoft.com/office/word/2010/wordprocessingDrawing" xmlns:wp="http://schemas.openxmlformats.org/drawingml/2006/wordprocessingDrawing" xmlns:wpc="http://schemas.microsoft.com/office/word/2010/wordprocessingCanvas" xmlns:wpg="http://schemas.microsoft.com/office/word/2010/wordprocessingGroup" xmlns:wpi="http://schemas.microsoft.com/office/word/2010/wordprocessingInk" xmlns:wps="http://schemas.microsoft.com/office/word/2010/wordprocessingShape" mc:Ignorable="w14 wp14">
+  <w:p>
+    <w:pPr>
+      <w:pStyle w:val="Header"/>
+      <w:bidi w:val="1"/>
+      <w:jc w:val="center"/>
+    </w:pPr>
+  </w:p>
+</w:hdr>
+</file>
+
+<file path=word/header2.xml><?xml version="1.0" encoding="utf-8"?>
+<w:hdr xmlns:m="http://schemas.openxmlformats.org/officeDocument/2006/math" xmlns:mc="http://schemas.openxmlformats.org/markup-compatibility/2006" xmlns:mo="http://schemas.microsoft.com/office/mac/office/2008/main" xmlns:mv="urn:schemas-microsoft-com:mac:vml" xmlns:o="urn:schemas-microsoft-com:office:office" xmlns:r="http://schemas.openxmlformats.org/officeDocument/2006/relationships" xmlns:v="urn:schemas-microsoft-com:vml" xmlns:w10="urn:schemas-microsoft-com:office:word" xmlns:w14="http://schemas.microsoft.com/office/word/2010/wordml" xmlns:w="http://schemas.openxmlformats.org/wordprocessingml/2006/main" xmlns:wne="http://schemas.microsoft.com/office/word/2006/wordml" xmlns:wp14="http://schemas.microsoft.com/office/word/2010/wordprocessingDrawing" xmlns:wp="http://schemas.openxmlformats.org/drawingml/2006/wordprocessingDrawing" xmlns:wpc="http://schemas.microsoft.com/office/word/2010/wordprocessingCanvas" xmlns:wpg="http://schemas.microsoft.com/office/word/2010/wordprocessingGroup" xmlns:wpi="http://schemas.microsoft.com/office/word/2010/wordprocessingInk" xmlns:wps="http://schemas.microsoft.com/office/word/2010/wordprocessingShape" mc:Ignorable="w14 wp14">
+  <w:p>
+    <w:pPr>
+      <w:pStyle w:val="Header"/>
+      <w:bidi w:val="1"/>
+      <w:jc w:val="center"/>
+    </w:pPr>
+  </w:p>
+</w:hdr>
 </file>
 
 <file path=word/numbering.xml><?xml version="1.0" encoding="utf-8"?>
@@ -4370,7 +4389,7 @@
       <w:jc w:val="right"/>
     </w:pPr>
     <w:rPr>
-      <w:rFonts w:ascii="Arial" w:hAnsi="Arial" w:cs="Arial"/>
+      <w:rFonts w:ascii="David" w:hAnsi="David" w:cs="David"/>
       <w:sz w:val="24"/>
       <w:szCs w:val="24"/>
     </w:rPr>

</xml_diff>

<commit_message>
Fix RTL alignment, dedupe cover, recenter details block
Round-2 visual fixes after opening the round-1 output in Word:

- Drop paragraph-level <w:bidi/> everywhere (Normal style, _apply_rtl_para,
  set_cell, add_field_line). With section-level bidi + per-run <w:rtl/>,
  jc=right now resolves to physical-right instead of being flipped to
  logical-end (physical-left). Fixes the letter header lines that were
  rendering LTR.
- Remove the gray title table from _section_01_title; it was a duplicate
  of the cover-page box. Section 01 is now just the letter body.
- Shorten the cover-page subject line to a fixed
  "הנדון: אומדן שווי דירת מגורים" so it fits on one line inside the box.
- Add a 1800 DXA right indent to add_field_line so the
  label/colon/value block sits visually centered on the page instead of
  hugging the right margin.
- Clarify the address field in shuma.html with a (רחוב, מספר, עיר) hint
  and a literal-address placeholder.
</commit_message>
<xml_diff>
--- a/demo_pinui_binui.docx
+++ b/demo_pinui_binui.docx
@@ -20,7 +20,6 @@
           </w:tcPr>
           <w:p>
             <w:pPr>
-              <w:bidi w:val="1"/>
               <w:spacing w:after="80"/>
               <w:jc w:val="center"/>
             </w:pPr>
@@ -40,7 +39,6 @@
           </w:p>
           <w:p>
             <w:pPr>
-              <w:bidi w:val="1"/>
               <w:spacing w:after="80"/>
               <w:jc w:val="center"/>
             </w:pPr>
@@ -55,12 +53,11 @@
                 <w:bCs/>
                 <w:u w:val="single"/>
               </w:rPr>
-              <w:t>הנדון: אומדן שווי דירת 4 חדרים</w:t>
+              <w:t>הנדון: אומדן שווי דירת מגורים</w:t>
             </w:r>
           </w:p>
           <w:p>
             <w:pPr>
-              <w:bidi w:val="1"/>
               <w:spacing w:after="80"/>
               <w:jc w:val="center"/>
             </w:pPr>
@@ -80,7 +77,6 @@
           </w:p>
           <w:p>
             <w:pPr>
-              <w:bidi w:val="1"/>
               <w:spacing w:after="80"/>
               <w:jc w:val="center"/>
             </w:pPr>
@@ -103,7 +99,6 @@
     </w:tbl>
     <w:p>
       <w:pPr>
-        <w:bidi w:val="1"/>
         <w:spacing w:before="0" w:after="240"/>
         <w:jc w:val="right"/>
       </w:pPr>
@@ -113,119 +108,8 @@
         <w:br w:type="page"/>
       </w:r>
     </w:p>
-    <w:tbl>
-      <w:tblPr>
-        <w:tblStyle w:val="TableGrid"/>
-        <w:tblW w:type="auto" w:w="0"/>
-        <w:tblLook w:firstColumn="1" w:firstRow="1" w:lastColumn="0" w:lastRow="0" w:noHBand="0" w:noVBand="1" w:val="04A0"/>
-        <w:bidiVisual/>
-      </w:tblPr>
-      <w:tblGrid>
-        <w:gridCol w:w="8306"/>
-      </w:tblGrid>
-      <w:tr>
-        <w:tc>
-          <w:tcPr>
-            <w:tcW w:type="dxa" w:w="8306"/>
-          </w:tcPr>
-          <w:p>
-            <w:pPr>
-              <w:bidi w:val="1"/>
-              <w:jc w:val="right"/>
-            </w:pPr>
-            <w:r>
-              <w:rPr>
-                <w:rtl/>
-                <w:rFonts w:ascii="David" w:hAnsi="David" w:cs="David"/>
-                <w:sz w:val="32"/>
-                <w:szCs w:val="32"/>
-                <w:b/>
-                <w:bCs/>
-              </w:rPr>
-              <w:t xml:space="preserve">חוות דעת - שומת מקרקעין — מלאה</w:t>
-            </w:r>
-          </w:p>
-        </w:tc>
-      </w:tr>
-      <w:tr>
-        <w:tc>
-          <w:tcPr>
-            <w:tcW w:type="dxa" w:w="8306"/>
-          </w:tcPr>
-          <w:p>
-            <w:pPr>
-              <w:bidi w:val="1"/>
-              <w:jc w:val="right"/>
-            </w:pPr>
-            <w:r>
-              <w:rPr>
-                <w:rtl/>
-                <w:rFonts w:ascii="David" w:hAnsi="David" w:cs="David"/>
-                <w:sz w:val="26"/>
-                <w:szCs w:val="26"/>
-                <w:b/>
-                <w:bCs/>
-              </w:rPr>
-              <w:t xml:space="preserve">הנדון: אומדן שווי שוק בין קונה מרצון למוכר מרצון — פינוי-בינוי (שתי חלופות) — דירת 4 חדרים</w:t>
-            </w:r>
-          </w:p>
-        </w:tc>
-      </w:tr>
-      <w:tr>
-        <w:tc>
-          <w:tcPr>
-            <w:tcW w:type="dxa" w:w="8306"/>
-          </w:tcPr>
-          <w:p>
-            <w:pPr>
-              <w:bidi w:val="1"/>
-              <w:jc w:val="right"/>
-            </w:pPr>
-            <w:r>
-              <w:rPr>
-                <w:rtl/>
-                <w:rFonts w:ascii="David" w:hAnsi="David" w:cs="David"/>
-                <w:sz w:val="24"/>
-                <w:szCs w:val="24"/>
-              </w:rPr>
-              <w:t xml:space="preserve">גוש 6130, חלקה 27, תת חלקה 8</w:t>
-            </w:r>
-          </w:p>
-        </w:tc>
-      </w:tr>
-      <w:tr>
-        <w:tc>
-          <w:tcPr>
-            <w:tcW w:type="dxa" w:w="8306"/>
-          </w:tcPr>
-          <w:p>
-            <w:pPr>
-              <w:bidi w:val="1"/>
-              <w:jc w:val="right"/>
-            </w:pPr>
-            <w:r>
-              <w:rPr>
-                <w:rtl/>
-                <w:rFonts w:ascii="David" w:hAnsi="David" w:cs="David"/>
-                <w:sz w:val="24"/>
-                <w:szCs w:val="24"/>
-              </w:rPr>
-              <w:t xml:space="preserve">רחוב ביאליק 15, רמת גן</w:t>
-            </w:r>
-          </w:p>
-        </w:tc>
-      </w:tr>
-    </w:tbl>
     <w:p>
       <w:pPr>
-        <w:bidi w:val="1"/>
-        <w:spacing w:before="0" w:after="240"/>
-        <w:jc w:val="right"/>
-      </w:pPr>
-    </w:p>
-    <w:p>
-      <w:pPr>
-        <w:bidi w:val="1"/>
         <w:spacing w:before="0" w:after="80"/>
         <w:jc w:val="right"/>
       </w:pPr>
@@ -242,7 +126,6 @@
     </w:p>
     <w:p>
       <w:pPr>
-        <w:bidi w:val="1"/>
         <w:spacing w:before="0" w:after="240"/>
         <w:jc w:val="right"/>
       </w:pPr>
@@ -259,7 +142,6 @@
     </w:p>
     <w:p>
       <w:pPr>
-        <w:bidi w:val="1"/>
         <w:spacing w:before="0" w:after="40"/>
         <w:jc w:val="right"/>
       </w:pPr>
@@ -276,7 +158,6 @@
     </w:p>
     <w:p>
       <w:pPr>
-        <w:bidi w:val="1"/>
         <w:spacing w:before="0" w:after="40"/>
         <w:jc w:val="right"/>
       </w:pPr>
@@ -293,7 +174,6 @@
     </w:p>
     <w:p>
       <w:pPr>
-        <w:bidi w:val="1"/>
         <w:spacing w:before="0" w:after="240"/>
         <w:jc w:val="right"/>
       </w:pPr>
@@ -310,7 +190,6 @@
     </w:p>
     <w:p>
       <w:pPr>
-        <w:bidi w:val="1"/>
         <w:spacing w:before="0" w:after="160"/>
         <w:jc w:val="right"/>
       </w:pPr>
@@ -332,7 +211,6 @@
     </w:p>
     <w:p>
       <w:pPr>
-        <w:bidi w:val="1"/>
         <w:spacing w:before="200" w:after="120"/>
         <w:jc w:val="right"/>
       </w:pPr>
@@ -352,9 +230,9 @@
     </w:p>
     <w:p>
       <w:pPr>
-        <w:bidi/>
+        <w:jc w:val="right"/>
         <w:spacing w:after="40"/>
-        <w:jc w:val="right"/>
+        <w:ind w:right="1800"/>
         <w:tabs>
           <w:tab w:val="left" w:pos="2636"/>
           <w:tab w:val="left" w:pos="3203"/>
@@ -397,9 +275,9 @@
     </w:p>
     <w:p>
       <w:pPr>
-        <w:bidi/>
+        <w:jc w:val="right"/>
         <w:spacing w:after="40"/>
-        <w:jc w:val="right"/>
+        <w:ind w:right="1800"/>
         <w:tabs>
           <w:tab w:val="left" w:pos="2636"/>
           <w:tab w:val="left" w:pos="3203"/>
@@ -442,9 +320,9 @@
     </w:p>
     <w:p>
       <w:pPr>
-        <w:bidi/>
+        <w:jc w:val="right"/>
         <w:spacing w:after="40"/>
-        <w:jc w:val="right"/>
+        <w:ind w:right="1800"/>
         <w:tabs>
           <w:tab w:val="left" w:pos="2636"/>
           <w:tab w:val="left" w:pos="3203"/>
@@ -487,9 +365,9 @@
     </w:p>
     <w:p>
       <w:pPr>
-        <w:bidi/>
+        <w:jc w:val="right"/>
         <w:spacing w:after="40"/>
-        <w:jc w:val="right"/>
+        <w:ind w:right="1800"/>
         <w:tabs>
           <w:tab w:val="left" w:pos="2636"/>
           <w:tab w:val="left" w:pos="3203"/>
@@ -532,9 +410,9 @@
     </w:p>
     <w:p>
       <w:pPr>
-        <w:bidi/>
+        <w:jc w:val="right"/>
         <w:spacing w:after="40"/>
-        <w:jc w:val="right"/>
+        <w:ind w:right="1800"/>
         <w:tabs>
           <w:tab w:val="left" w:pos="2636"/>
           <w:tab w:val="left" w:pos="3203"/>
@@ -577,9 +455,9 @@
     </w:p>
     <w:p>
       <w:pPr>
-        <w:bidi/>
+        <w:jc w:val="right"/>
         <w:spacing w:after="40"/>
-        <w:jc w:val="right"/>
+        <w:ind w:right="1800"/>
         <w:tabs>
           <w:tab w:val="left" w:pos="2636"/>
           <w:tab w:val="left" w:pos="3203"/>
@@ -622,9 +500,9 @@
     </w:p>
     <w:p>
       <w:pPr>
-        <w:bidi/>
+        <w:jc w:val="right"/>
         <w:spacing w:after="40"/>
-        <w:jc w:val="right"/>
+        <w:ind w:right="1800"/>
         <w:tabs>
           <w:tab w:val="left" w:pos="2636"/>
           <w:tab w:val="left" w:pos="3203"/>
@@ -667,9 +545,9 @@
     </w:p>
     <w:p>
       <w:pPr>
-        <w:bidi/>
+        <w:jc w:val="right"/>
         <w:spacing w:after="40"/>
-        <w:jc w:val="right"/>
+        <w:ind w:right="1800"/>
         <w:tabs>
           <w:tab w:val="left" w:pos="2636"/>
           <w:tab w:val="left" w:pos="3203"/>
@@ -712,9 +590,9 @@
     </w:p>
     <w:p>
       <w:pPr>
-        <w:bidi/>
+        <w:jc w:val="right"/>
         <w:spacing w:after="40"/>
-        <w:jc w:val="right"/>
+        <w:ind w:right="1800"/>
         <w:tabs>
           <w:tab w:val="left" w:pos="2636"/>
           <w:tab w:val="left" w:pos="3203"/>
@@ -757,9 +635,9 @@
     </w:p>
     <w:p>
       <w:pPr>
-        <w:bidi/>
+        <w:jc w:val="right"/>
         <w:spacing w:after="40"/>
-        <w:jc w:val="right"/>
+        <w:ind w:right="1800"/>
         <w:tabs>
           <w:tab w:val="left" w:pos="2636"/>
           <w:tab w:val="left" w:pos="3203"/>
@@ -802,9 +680,9 @@
     </w:p>
     <w:p>
       <w:pPr>
-        <w:bidi/>
+        <w:jc w:val="right"/>
         <w:spacing w:after="40"/>
-        <w:jc w:val="right"/>
+        <w:ind w:right="1800"/>
         <w:tabs>
           <w:tab w:val="left" w:pos="2636"/>
           <w:tab w:val="left" w:pos="3203"/>
@@ -847,9 +725,9 @@
     </w:p>
     <w:p>
       <w:pPr>
-        <w:bidi/>
+        <w:jc w:val="right"/>
         <w:spacing w:after="40"/>
-        <w:jc w:val="right"/>
+        <w:ind w:right="1800"/>
         <w:tabs>
           <w:tab w:val="left" w:pos="2636"/>
           <w:tab w:val="left" w:pos="3203"/>
@@ -892,9 +770,9 @@
     </w:p>
     <w:p>
       <w:pPr>
-        <w:bidi/>
+        <w:jc w:val="right"/>
         <w:spacing w:after="40"/>
-        <w:jc w:val="right"/>
+        <w:ind w:right="1800"/>
         <w:tabs>
           <w:tab w:val="left" w:pos="2636"/>
           <w:tab w:val="left" w:pos="3203"/>
@@ -937,9 +815,9 @@
     </w:p>
     <w:p>
       <w:pPr>
-        <w:bidi/>
+        <w:jc w:val="right"/>
         <w:spacing w:after="40"/>
-        <w:jc w:val="right"/>
+        <w:ind w:right="1800"/>
         <w:tabs>
           <w:tab w:val="left" w:pos="2636"/>
           <w:tab w:val="left" w:pos="3203"/>
@@ -982,9 +860,9 @@
     </w:p>
     <w:p>
       <w:pPr>
-        <w:bidi/>
+        <w:jc w:val="right"/>
         <w:spacing w:after="40"/>
-        <w:jc w:val="right"/>
+        <w:ind w:right="1800"/>
         <w:tabs>
           <w:tab w:val="left" w:pos="2636"/>
           <w:tab w:val="left" w:pos="3203"/>
@@ -1027,7 +905,6 @@
     </w:p>
     <w:p>
       <w:pPr>
-        <w:bidi w:val="1"/>
         <w:spacing w:before="0" w:after="120"/>
         <w:jc w:val="right"/>
       </w:pPr>
@@ -1039,7 +916,6 @@
     </w:p>
     <w:p>
       <w:pPr>
-        <w:bidi w:val="1"/>
         <w:spacing w:before="200" w:after="120"/>
         <w:jc w:val="right"/>
       </w:pPr>
@@ -1059,7 +935,6 @@
     </w:p>
     <w:p>
       <w:pPr>
-        <w:bidi w:val="1"/>
         <w:spacing w:before="200" w:after="120"/>
         <w:jc w:val="right"/>
       </w:pPr>
@@ -1079,7 +954,6 @@
     </w:p>
     <w:p>
       <w:pPr>
-        <w:bidi w:val="1"/>
         <w:spacing w:before="0" w:after="120"/>
         <w:jc w:val="right"/>
       </w:pPr>
@@ -1096,7 +970,6 @@
     </w:p>
     <w:p>
       <w:pPr>
-        <w:bidi w:val="1"/>
         <w:spacing w:before="0" w:after="120"/>
         <w:jc w:val="right"/>
       </w:pPr>
@@ -1113,7 +986,6 @@
     </w:p>
     <w:p>
       <w:pPr>
-        <w:bidi w:val="1"/>
         <w:spacing w:before="0" w:after="120"/>
         <w:jc w:val="right"/>
       </w:pPr>
@@ -1130,7 +1002,6 @@
     </w:p>
     <w:p>
       <w:pPr>
-        <w:bidi w:val="1"/>
         <w:spacing w:before="0" w:after="120"/>
         <w:jc w:val="right"/>
       </w:pPr>
@@ -1147,7 +1018,6 @@
     </w:p>
     <w:p>
       <w:pPr>
-        <w:bidi w:val="1"/>
         <w:spacing w:before="200" w:after="120"/>
         <w:jc w:val="right"/>
       </w:pPr>
@@ -1167,7 +1037,6 @@
     </w:p>
     <w:p>
       <w:pPr>
-        <w:bidi w:val="1"/>
         <w:spacing w:before="0" w:after="120"/>
         <w:jc w:val="right"/>
       </w:pPr>
@@ -1200,7 +1069,6 @@
           </w:tcPr>
           <w:p>
             <w:pPr>
-              <w:bidi w:val="1"/>
               <w:jc w:val="right"/>
             </w:pPr>
             <w:r>
@@ -1222,7 +1090,6 @@
           </w:tcPr>
           <w:p>
             <w:pPr>
-              <w:bidi w:val="1"/>
               <w:jc w:val="right"/>
             </w:pPr>
             <w:r>
@@ -1244,7 +1111,6 @@
           </w:tcPr>
           <w:p>
             <w:pPr>
-              <w:bidi w:val="1"/>
               <w:jc w:val="right"/>
             </w:pPr>
             <w:r>
@@ -1266,7 +1132,6 @@
           </w:tcPr>
           <w:p>
             <w:pPr>
-              <w:bidi w:val="1"/>
               <w:jc w:val="right"/>
             </w:pPr>
             <w:r>
@@ -1288,7 +1153,6 @@
           </w:tcPr>
           <w:p>
             <w:pPr>
-              <w:bidi w:val="1"/>
               <w:jc w:val="right"/>
             </w:pPr>
             <w:r>
@@ -1310,7 +1174,6 @@
           </w:tcPr>
           <w:p>
             <w:pPr>
-              <w:bidi w:val="1"/>
               <w:jc w:val="right"/>
             </w:pPr>
             <w:r>
@@ -1332,7 +1195,6 @@
           </w:tcPr>
           <w:p>
             <w:pPr>
-              <w:bidi w:val="1"/>
               <w:jc w:val="right"/>
             </w:pPr>
             <w:r>
@@ -1354,7 +1216,6 @@
           </w:tcPr>
           <w:p>
             <w:pPr>
-              <w:bidi w:val="1"/>
               <w:jc w:val="right"/>
             </w:pPr>
             <w:r>
@@ -1372,14 +1233,12 @@
     </w:tbl>
     <w:p>
       <w:pPr>
-        <w:bidi w:val="1"/>
         <w:spacing w:before="0" w:after="120"/>
         <w:jc w:val="right"/>
       </w:pPr>
     </w:p>
     <w:p>
       <w:pPr>
-        <w:bidi w:val="1"/>
         <w:spacing w:before="0" w:after="120"/>
         <w:jc w:val="right"/>
       </w:pPr>
@@ -1396,7 +1255,6 @@
     </w:p>
     <w:p>
       <w:pPr>
-        <w:bidi w:val="1"/>
         <w:spacing w:before="200" w:after="120"/>
         <w:jc w:val="right"/>
       </w:pPr>
@@ -1416,7 +1274,6 @@
     </w:p>
     <w:p>
       <w:pPr>
-        <w:bidi w:val="1"/>
         <w:spacing w:before="0" w:after="120"/>
         <w:jc w:val="right"/>
       </w:pPr>
@@ -1435,7 +1292,6 @@
     </w:p>
     <w:p>
       <w:pPr>
-        <w:bidi w:val="1"/>
         <w:spacing w:before="0" w:after="120"/>
         <w:jc w:val="right"/>
       </w:pPr>
@@ -1457,7 +1313,6 @@
     </w:p>
     <w:p>
       <w:pPr>
-        <w:bidi w:val="1"/>
         <w:spacing w:before="200" w:after="120"/>
         <w:jc w:val="right"/>
       </w:pPr>
@@ -1477,7 +1332,6 @@
     </w:p>
     <w:p>
       <w:pPr>
-        <w:bidi w:val="1"/>
         <w:spacing w:before="200" w:after="120"/>
         <w:jc w:val="right"/>
       </w:pPr>
@@ -1497,7 +1351,6 @@
     </w:p>
     <w:p>
       <w:pPr>
-        <w:bidi w:val="1"/>
         <w:spacing w:before="0" w:after="120"/>
         <w:jc w:val="right"/>
       </w:pPr>
@@ -1514,7 +1367,6 @@
     </w:p>
     <w:p>
       <w:pPr>
-        <w:bidi w:val="1"/>
         <w:spacing w:before="0" w:after="120"/>
         <w:jc w:val="right"/>
       </w:pPr>
@@ -1531,7 +1383,6 @@
     </w:p>
     <w:p>
       <w:pPr>
-        <w:bidi w:val="1"/>
         <w:spacing w:before="200" w:after="120"/>
         <w:jc w:val="right"/>
       </w:pPr>
@@ -1551,7 +1402,6 @@
     </w:p>
     <w:p>
       <w:pPr>
-        <w:bidi w:val="1"/>
         <w:spacing w:before="0" w:after="120"/>
         <w:jc w:val="right"/>
       </w:pPr>
@@ -1568,7 +1418,6 @@
     </w:p>
     <w:p>
       <w:pPr>
-        <w:bidi w:val="1"/>
         <w:spacing w:after="80"/>
         <w:ind w:left="283" w:right="283"/>
         <w:jc w:val="right"/>
@@ -1586,7 +1435,6 @@
     </w:p>
     <w:p>
       <w:pPr>
-        <w:bidi w:val="1"/>
         <w:spacing w:after="80"/>
         <w:ind w:left="283" w:right="283"/>
         <w:jc w:val="right"/>
@@ -1609,7 +1457,6 @@
     </w:p>
     <w:p>
       <w:pPr>
-        <w:bidi w:val="1"/>
         <w:spacing w:before="200" w:after="120"/>
         <w:jc w:val="right"/>
       </w:pPr>
@@ -1629,7 +1476,6 @@
     </w:p>
     <w:p>
       <w:pPr>
-        <w:bidi w:val="1"/>
         <w:spacing w:before="200" w:after="120"/>
         <w:jc w:val="right"/>
       </w:pPr>
@@ -1649,7 +1495,6 @@
     </w:p>
     <w:p>
       <w:pPr>
-        <w:bidi w:val="1"/>
         <w:spacing w:before="0" w:after="120"/>
         <w:jc w:val="right"/>
       </w:pPr>
@@ -1682,7 +1527,6 @@
           </w:tcPr>
           <w:p>
             <w:pPr>
-              <w:bidi w:val="1"/>
               <w:jc w:val="right"/>
             </w:pPr>
             <w:r>
@@ -1704,7 +1548,6 @@
           </w:tcPr>
           <w:p>
             <w:pPr>
-              <w:bidi w:val="1"/>
               <w:jc w:val="right"/>
             </w:pPr>
             <w:r>
@@ -1726,7 +1569,6 @@
           </w:tcPr>
           <w:p>
             <w:pPr>
-              <w:bidi w:val="1"/>
               <w:jc w:val="right"/>
             </w:pPr>
             <w:r>
@@ -1748,7 +1590,6 @@
           </w:tcPr>
           <w:p>
             <w:pPr>
-              <w:bidi w:val="1"/>
               <w:jc w:val="right"/>
             </w:pPr>
             <w:r>
@@ -1770,7 +1611,6 @@
           </w:tcPr>
           <w:p>
             <w:pPr>
-              <w:bidi w:val="1"/>
               <w:jc w:val="right"/>
             </w:pPr>
             <w:r>
@@ -1792,7 +1632,6 @@
           </w:tcPr>
           <w:p>
             <w:pPr>
-              <w:bidi w:val="1"/>
               <w:jc w:val="right"/>
             </w:pPr>
             <w:r>
@@ -1814,7 +1653,6 @@
           </w:tcPr>
           <w:p>
             <w:pPr>
-              <w:bidi w:val="1"/>
               <w:jc w:val="right"/>
             </w:pPr>
             <w:r>
@@ -1836,7 +1674,6 @@
           </w:tcPr>
           <w:p>
             <w:pPr>
-              <w:bidi w:val="1"/>
               <w:jc w:val="right"/>
             </w:pPr>
             <w:r>
@@ -1858,7 +1695,6 @@
           </w:tcPr>
           <w:p>
             <w:pPr>
-              <w:bidi w:val="1"/>
               <w:jc w:val="right"/>
             </w:pPr>
             <w:r>
@@ -1880,7 +1716,6 @@
           </w:tcPr>
           <w:p>
             <w:pPr>
-              <w:bidi w:val="1"/>
               <w:jc w:val="right"/>
             </w:pPr>
             <w:r>
@@ -1902,7 +1737,6 @@
           </w:tcPr>
           <w:p>
             <w:pPr>
-              <w:bidi w:val="1"/>
               <w:jc w:val="right"/>
             </w:pPr>
             <w:r>
@@ -1924,7 +1758,6 @@
           </w:tcPr>
           <w:p>
             <w:pPr>
-              <w:bidi w:val="1"/>
               <w:jc w:val="right"/>
             </w:pPr>
             <w:r>
@@ -1946,7 +1779,6 @@
           </w:tcPr>
           <w:p>
             <w:pPr>
-              <w:bidi w:val="1"/>
               <w:jc w:val="right"/>
             </w:pPr>
             <w:r>
@@ -1968,7 +1800,6 @@
           </w:tcPr>
           <w:p>
             <w:pPr>
-              <w:bidi w:val="1"/>
               <w:jc w:val="right"/>
             </w:pPr>
             <w:r>
@@ -1990,7 +1821,6 @@
           </w:tcPr>
           <w:p>
             <w:pPr>
-              <w:bidi w:val="1"/>
               <w:jc w:val="right"/>
             </w:pPr>
             <w:r>
@@ -2012,7 +1842,6 @@
           </w:tcPr>
           <w:p>
             <w:pPr>
-              <w:bidi w:val="1"/>
               <w:jc w:val="right"/>
             </w:pPr>
             <w:r>
@@ -2030,14 +1859,12 @@
     </w:tbl>
     <w:p>
       <w:pPr>
-        <w:bidi w:val="1"/>
         <w:spacing w:before="0" w:after="120"/>
         <w:jc w:val="right"/>
       </w:pPr>
     </w:p>
     <w:p>
       <w:pPr>
-        <w:bidi w:val="1"/>
         <w:spacing w:before="200" w:after="120"/>
         <w:jc w:val="right"/>
       </w:pPr>
@@ -2057,7 +1884,6 @@
     </w:p>
     <w:p>
       <w:pPr>
-        <w:bidi w:val="1"/>
         <w:spacing w:before="0" w:after="120"/>
         <w:jc w:val="right"/>
       </w:pPr>
@@ -2074,7 +1900,6 @@
     </w:p>
     <w:p>
       <w:pPr>
-        <w:bidi w:val="1"/>
         <w:spacing w:before="200" w:after="120"/>
         <w:jc w:val="right"/>
       </w:pPr>
@@ -2094,7 +1919,6 @@
     </w:p>
     <w:p>
       <w:pPr>
-        <w:bidi w:val="1"/>
         <w:spacing w:before="0" w:after="120"/>
         <w:jc w:val="right"/>
       </w:pPr>
@@ -2127,7 +1951,6 @@
           </w:tcPr>
           <w:p>
             <w:pPr>
-              <w:bidi w:val="1"/>
               <w:jc w:val="right"/>
             </w:pPr>
             <w:r>
@@ -2149,7 +1972,6 @@
           </w:tcPr>
           <w:p>
             <w:pPr>
-              <w:bidi w:val="1"/>
               <w:jc w:val="right"/>
             </w:pPr>
             <w:r>
@@ -2171,7 +1993,6 @@
           </w:tcPr>
           <w:p>
             <w:pPr>
-              <w:bidi w:val="1"/>
               <w:jc w:val="right"/>
             </w:pPr>
             <w:r>
@@ -2193,7 +2014,6 @@
           </w:tcPr>
           <w:p>
             <w:pPr>
-              <w:bidi w:val="1"/>
               <w:jc w:val="right"/>
             </w:pPr>
             <w:r>
@@ -2215,7 +2035,6 @@
           </w:tcPr>
           <w:p>
             <w:pPr>
-              <w:bidi w:val="1"/>
               <w:jc w:val="right"/>
             </w:pPr>
             <w:r>
@@ -2237,7 +2056,6 @@
           </w:tcPr>
           <w:p>
             <w:pPr>
-              <w:bidi w:val="1"/>
               <w:jc w:val="right"/>
             </w:pPr>
             <w:r>
@@ -2260,7 +2078,6 @@
     </w:p>
     <w:p>
       <w:pPr>
-        <w:bidi w:val="1"/>
         <w:spacing w:before="200" w:after="120"/>
         <w:jc w:val="right"/>
       </w:pPr>
@@ -2280,7 +2097,6 @@
     </w:p>
     <w:p>
       <w:pPr>
-        <w:bidi w:val="1"/>
         <w:spacing w:before="200" w:after="120"/>
         <w:jc w:val="right"/>
       </w:pPr>
@@ -2300,7 +2116,6 @@
     </w:p>
     <w:p>
       <w:pPr>
-        <w:bidi w:val="1"/>
         <w:spacing w:before="0" w:after="120"/>
         <w:jc w:val="right"/>
       </w:pPr>
@@ -2319,7 +2134,6 @@
     </w:p>
     <w:p>
       <w:pPr>
-        <w:bidi w:val="1"/>
         <w:spacing w:after="80"/>
         <w:ind w:left="283" w:right="283"/>
         <w:jc w:val="right"/>
@@ -2337,7 +2151,6 @@
     </w:p>
     <w:p>
       <w:pPr>
-        <w:bidi w:val="1"/>
         <w:spacing w:after="80"/>
         <w:ind w:left="283" w:right="283"/>
         <w:jc w:val="right"/>
@@ -2355,7 +2168,6 @@
     </w:p>
     <w:p>
       <w:pPr>
-        <w:bidi w:val="1"/>
         <w:spacing w:after="80"/>
         <w:ind w:left="283" w:right="283"/>
         <w:jc w:val="right"/>
@@ -2373,7 +2185,6 @@
     </w:p>
     <w:p>
       <w:pPr>
-        <w:bidi w:val="1"/>
         <w:spacing w:after="80"/>
         <w:ind w:left="283" w:right="283"/>
         <w:jc w:val="right"/>
@@ -2391,7 +2202,6 @@
     </w:p>
     <w:p>
       <w:pPr>
-        <w:bidi w:val="1"/>
         <w:spacing w:after="80"/>
         <w:ind w:left="283" w:right="283"/>
         <w:jc w:val="right"/>
@@ -2409,7 +2219,6 @@
     </w:p>
     <w:p>
       <w:pPr>
-        <w:bidi w:val="1"/>
         <w:spacing w:after="80"/>
         <w:ind w:left="283" w:right="283"/>
         <w:jc w:val="right"/>
@@ -2427,7 +2236,6 @@
     </w:p>
     <w:p>
       <w:pPr>
-        <w:bidi w:val="1"/>
         <w:spacing w:after="80"/>
         <w:ind w:left="283" w:right="283"/>
         <w:jc w:val="right"/>
@@ -2445,7 +2253,6 @@
     </w:p>
     <w:p>
       <w:pPr>
-        <w:bidi w:val="1"/>
         <w:spacing w:after="80"/>
         <w:ind w:left="283" w:right="283"/>
         <w:jc w:val="right"/>
@@ -2463,7 +2270,6 @@
     </w:p>
     <w:p>
       <w:pPr>
-        <w:bidi w:val="1"/>
         <w:spacing w:after="80"/>
         <w:ind w:left="283" w:right="283"/>
         <w:jc w:val="right"/>
@@ -2481,7 +2287,6 @@
     </w:p>
     <w:p>
       <w:pPr>
-        <w:bidi w:val="1"/>
         <w:spacing w:before="120" w:after="120"/>
         <w:jc w:val="right"/>
       </w:pPr>
@@ -2500,7 +2305,6 @@
     </w:p>
     <w:p>
       <w:pPr>
-        <w:bidi w:val="1"/>
         <w:spacing w:after="80"/>
         <w:ind w:left="283" w:right="283"/>
         <w:jc w:val="right"/>
@@ -2518,7 +2322,6 @@
     </w:p>
     <w:p>
       <w:pPr>
-        <w:bidi w:val="1"/>
         <w:spacing w:after="80"/>
         <w:ind w:left="283" w:right="283"/>
         <w:jc w:val="right"/>
@@ -2536,7 +2339,6 @@
     </w:p>
     <w:p>
       <w:pPr>
-        <w:bidi w:val="1"/>
         <w:spacing w:after="80"/>
         <w:ind w:left="283" w:right="283"/>
         <w:jc w:val="right"/>
@@ -2554,7 +2356,6 @@
     </w:p>
     <w:p>
       <w:pPr>
-        <w:bidi w:val="1"/>
         <w:spacing w:before="120" w:after="120"/>
         <w:jc w:val="right"/>
       </w:pPr>
@@ -2573,7 +2374,6 @@
     </w:p>
     <w:p>
       <w:pPr>
-        <w:bidi w:val="1"/>
         <w:spacing w:after="80"/>
         <w:ind w:left="283" w:right="283"/>
         <w:jc w:val="right"/>
@@ -2591,7 +2391,6 @@
     </w:p>
     <w:p>
       <w:pPr>
-        <w:bidi w:val="1"/>
         <w:spacing w:after="80"/>
         <w:ind w:left="283" w:right="283"/>
         <w:jc w:val="right"/>
@@ -2609,7 +2408,6 @@
     </w:p>
     <w:p>
       <w:pPr>
-        <w:bidi w:val="1"/>
         <w:spacing w:after="80"/>
         <w:ind w:left="283" w:right="283"/>
         <w:jc w:val="right"/>
@@ -2627,7 +2425,6 @@
     </w:p>
     <w:p>
       <w:pPr>
-        <w:bidi w:val="1"/>
         <w:spacing w:before="120" w:after="120"/>
         <w:jc w:val="right"/>
       </w:pPr>
@@ -2646,7 +2443,6 @@
     </w:p>
     <w:p>
       <w:pPr>
-        <w:bidi w:val="1"/>
         <w:spacing w:after="80"/>
         <w:ind w:left="283" w:right="283"/>
         <w:jc w:val="right"/>
@@ -2664,7 +2460,6 @@
     </w:p>
     <w:p>
       <w:pPr>
-        <w:bidi w:val="1"/>
         <w:spacing w:after="80"/>
         <w:ind w:left="283" w:right="283"/>
         <w:jc w:val="right"/>
@@ -2682,14 +2477,12 @@
     </w:p>
     <w:p>
       <w:pPr>
-        <w:bidi w:val="1"/>
         <w:spacing w:before="0" w:after="120"/>
         <w:jc w:val="right"/>
       </w:pPr>
     </w:p>
     <w:p>
       <w:pPr>
-        <w:bidi w:val="1"/>
         <w:spacing w:before="200" w:after="120"/>
         <w:jc w:val="right"/>
       </w:pPr>
@@ -2733,7 +2526,6 @@
           </w:tcPr>
           <w:p>
             <w:pPr>
-              <w:bidi w:val="1"/>
               <w:jc w:val="right"/>
             </w:pPr>
             <w:r>
@@ -2755,7 +2547,6 @@
           </w:tcPr>
           <w:p>
             <w:pPr>
-              <w:bidi w:val="1"/>
               <w:jc w:val="right"/>
             </w:pPr>
             <w:r>
@@ -2777,7 +2568,6 @@
           </w:tcPr>
           <w:p>
             <w:pPr>
-              <w:bidi w:val="1"/>
               <w:jc w:val="right"/>
             </w:pPr>
             <w:r>
@@ -2799,7 +2589,6 @@
           </w:tcPr>
           <w:p>
             <w:pPr>
-              <w:bidi w:val="1"/>
               <w:jc w:val="right"/>
             </w:pPr>
             <w:r>
@@ -2821,7 +2610,6 @@
           </w:tcPr>
           <w:p>
             <w:pPr>
-              <w:bidi w:val="1"/>
               <w:jc w:val="right"/>
             </w:pPr>
             <w:r>
@@ -2843,7 +2631,6 @@
           </w:tcPr>
           <w:p>
             <w:pPr>
-              <w:bidi w:val="1"/>
               <w:jc w:val="right"/>
             </w:pPr>
             <w:r>
@@ -2865,7 +2652,6 @@
           </w:tcPr>
           <w:p>
             <w:pPr>
-              <w:bidi w:val="1"/>
               <w:jc w:val="right"/>
             </w:pPr>
             <w:r>
@@ -2887,7 +2673,6 @@
           </w:tcPr>
           <w:p>
             <w:pPr>
-              <w:bidi w:val="1"/>
               <w:jc w:val="right"/>
             </w:pPr>
             <w:r>
@@ -2909,7 +2694,6 @@
           </w:tcPr>
           <w:p>
             <w:pPr>
-              <w:bidi w:val="1"/>
               <w:jc w:val="right"/>
             </w:pPr>
             <w:r>
@@ -2931,7 +2715,6 @@
           </w:tcPr>
           <w:p>
             <w:pPr>
-              <w:bidi w:val="1"/>
               <w:jc w:val="right"/>
             </w:pPr>
             <w:r>
@@ -2955,7 +2738,6 @@
           </w:tcPr>
           <w:p>
             <w:pPr>
-              <w:bidi w:val="1"/>
               <w:jc w:val="right"/>
             </w:pPr>
             <w:r>
@@ -2975,7 +2757,6 @@
           </w:tcPr>
           <w:p>
             <w:pPr>
-              <w:bidi w:val="1"/>
               <w:jc w:val="right"/>
             </w:pPr>
             <w:r>
@@ -2995,7 +2776,6 @@
           </w:tcPr>
           <w:p>
             <w:pPr>
-              <w:bidi w:val="1"/>
               <w:jc w:val="right"/>
             </w:pPr>
             <w:r>
@@ -3015,7 +2795,6 @@
           </w:tcPr>
           <w:p>
             <w:pPr>
-              <w:bidi w:val="1"/>
               <w:jc w:val="right"/>
             </w:pPr>
             <w:r>
@@ -3035,7 +2814,6 @@
           </w:tcPr>
           <w:p>
             <w:pPr>
-              <w:bidi w:val="1"/>
               <w:jc w:val="right"/>
             </w:pPr>
             <w:r>
@@ -3055,7 +2833,6 @@
           </w:tcPr>
           <w:p>
             <w:pPr>
-              <w:bidi w:val="1"/>
               <w:jc w:val="right"/>
             </w:pPr>
             <w:r>
@@ -3075,7 +2852,6 @@
           </w:tcPr>
           <w:p>
             <w:pPr>
-              <w:bidi w:val="1"/>
               <w:jc w:val="right"/>
             </w:pPr>
             <w:r>
@@ -3095,7 +2871,6 @@
           </w:tcPr>
           <w:p>
             <w:pPr>
-              <w:bidi w:val="1"/>
               <w:jc w:val="right"/>
             </w:pPr>
             <w:r>
@@ -3115,7 +2890,6 @@
           </w:tcPr>
           <w:p>
             <w:pPr>
-              <w:bidi w:val="1"/>
               <w:jc w:val="right"/>
             </w:pPr>
             <w:r>
@@ -3135,7 +2909,6 @@
           </w:tcPr>
           <w:p>
             <w:pPr>
-              <w:bidi w:val="1"/>
               <w:jc w:val="right"/>
             </w:pPr>
             <w:r>
@@ -3157,7 +2930,6 @@
           </w:tcPr>
           <w:p>
             <w:pPr>
-              <w:bidi w:val="1"/>
               <w:jc w:val="right"/>
             </w:pPr>
             <w:r>
@@ -3177,7 +2949,6 @@
           </w:tcPr>
           <w:p>
             <w:pPr>
-              <w:bidi w:val="1"/>
               <w:jc w:val="right"/>
             </w:pPr>
             <w:r>
@@ -3197,7 +2968,6 @@
           </w:tcPr>
           <w:p>
             <w:pPr>
-              <w:bidi w:val="1"/>
               <w:jc w:val="right"/>
             </w:pPr>
             <w:r>
@@ -3217,7 +2987,6 @@
           </w:tcPr>
           <w:p>
             <w:pPr>
-              <w:bidi w:val="1"/>
               <w:jc w:val="right"/>
             </w:pPr>
             <w:r>
@@ -3237,7 +3006,6 @@
           </w:tcPr>
           <w:p>
             <w:pPr>
-              <w:bidi w:val="1"/>
               <w:jc w:val="right"/>
             </w:pPr>
             <w:r>
@@ -3257,7 +3025,6 @@
           </w:tcPr>
           <w:p>
             <w:pPr>
-              <w:bidi w:val="1"/>
               <w:jc w:val="right"/>
             </w:pPr>
             <w:r>
@@ -3277,7 +3044,6 @@
           </w:tcPr>
           <w:p>
             <w:pPr>
-              <w:bidi w:val="1"/>
               <w:jc w:val="right"/>
             </w:pPr>
             <w:r>
@@ -3297,7 +3063,6 @@
           </w:tcPr>
           <w:p>
             <w:pPr>
-              <w:bidi w:val="1"/>
               <w:jc w:val="right"/>
             </w:pPr>
             <w:r>
@@ -3317,7 +3082,6 @@
           </w:tcPr>
           <w:p>
             <w:pPr>
-              <w:bidi w:val="1"/>
               <w:jc w:val="right"/>
             </w:pPr>
             <w:r>
@@ -3337,7 +3101,6 @@
           </w:tcPr>
           <w:p>
             <w:pPr>
-              <w:bidi w:val="1"/>
               <w:jc w:val="right"/>
             </w:pPr>
             <w:r>
@@ -3359,7 +3122,6 @@
           </w:tcPr>
           <w:p>
             <w:pPr>
-              <w:bidi w:val="1"/>
               <w:jc w:val="right"/>
             </w:pPr>
             <w:r>
@@ -3379,7 +3141,6 @@
           </w:tcPr>
           <w:p>
             <w:pPr>
-              <w:bidi w:val="1"/>
               <w:jc w:val="right"/>
             </w:pPr>
             <w:r>
@@ -3399,7 +3160,6 @@
           </w:tcPr>
           <w:p>
             <w:pPr>
-              <w:bidi w:val="1"/>
               <w:jc w:val="right"/>
             </w:pPr>
             <w:r>
@@ -3419,7 +3179,6 @@
           </w:tcPr>
           <w:p>
             <w:pPr>
-              <w:bidi w:val="1"/>
               <w:jc w:val="right"/>
             </w:pPr>
             <w:r>
@@ -3439,7 +3198,6 @@
           </w:tcPr>
           <w:p>
             <w:pPr>
-              <w:bidi w:val="1"/>
               <w:jc w:val="right"/>
             </w:pPr>
             <w:r>
@@ -3459,7 +3217,6 @@
           </w:tcPr>
           <w:p>
             <w:pPr>
-              <w:bidi w:val="1"/>
               <w:jc w:val="right"/>
             </w:pPr>
             <w:r>
@@ -3479,7 +3236,6 @@
           </w:tcPr>
           <w:p>
             <w:pPr>
-              <w:bidi w:val="1"/>
               <w:jc w:val="right"/>
             </w:pPr>
             <w:r>
@@ -3499,7 +3255,6 @@
           </w:tcPr>
           <w:p>
             <w:pPr>
-              <w:bidi w:val="1"/>
               <w:jc w:val="right"/>
             </w:pPr>
             <w:r>
@@ -3519,7 +3274,6 @@
           </w:tcPr>
           <w:p>
             <w:pPr>
-              <w:bidi w:val="1"/>
               <w:jc w:val="right"/>
             </w:pPr>
             <w:r>
@@ -3539,7 +3293,6 @@
           </w:tcPr>
           <w:p>
             <w:pPr>
-              <w:bidi w:val="1"/>
               <w:jc w:val="right"/>
             </w:pPr>
             <w:r>
@@ -3561,7 +3314,6 @@
           </w:tcPr>
           <w:p>
             <w:pPr>
-              <w:bidi w:val="1"/>
               <w:jc w:val="right"/>
             </w:pPr>
             <w:r>
@@ -3581,7 +3333,6 @@
           </w:tcPr>
           <w:p>
             <w:pPr>
-              <w:bidi w:val="1"/>
               <w:jc w:val="right"/>
             </w:pPr>
             <w:r>
@@ -3601,7 +3352,6 @@
           </w:tcPr>
           <w:p>
             <w:pPr>
-              <w:bidi w:val="1"/>
               <w:jc w:val="right"/>
             </w:pPr>
             <w:r>
@@ -3621,7 +3371,6 @@
           </w:tcPr>
           <w:p>
             <w:pPr>
-              <w:bidi w:val="1"/>
               <w:jc w:val="right"/>
             </w:pPr>
             <w:r>
@@ -3641,7 +3390,6 @@
           </w:tcPr>
           <w:p>
             <w:pPr>
-              <w:bidi w:val="1"/>
               <w:jc w:val="right"/>
             </w:pPr>
             <w:r>
@@ -3661,7 +3409,6 @@
           </w:tcPr>
           <w:p>
             <w:pPr>
-              <w:bidi w:val="1"/>
               <w:jc w:val="right"/>
             </w:pPr>
             <w:r>
@@ -3681,7 +3428,6 @@
           </w:tcPr>
           <w:p>
             <w:pPr>
-              <w:bidi w:val="1"/>
               <w:jc w:val="right"/>
             </w:pPr>
             <w:r>
@@ -3701,7 +3447,6 @@
           </w:tcPr>
           <w:p>
             <w:pPr>
-              <w:bidi w:val="1"/>
               <w:jc w:val="right"/>
             </w:pPr>
             <w:r>
@@ -3721,7 +3466,6 @@
           </w:tcPr>
           <w:p>
             <w:pPr>
-              <w:bidi w:val="1"/>
               <w:jc w:val="right"/>
             </w:pPr>
             <w:r>
@@ -3741,7 +3485,6 @@
           </w:tcPr>
           <w:p>
             <w:pPr>
-              <w:bidi w:val="1"/>
               <w:jc w:val="right"/>
             </w:pPr>
             <w:r>
@@ -3759,14 +3502,12 @@
     </w:tbl>
     <w:p>
       <w:pPr>
-        <w:bidi w:val="1"/>
         <w:spacing w:before="0" w:after="120"/>
         <w:jc w:val="right"/>
       </w:pPr>
     </w:p>
     <w:p>
       <w:pPr>
-        <w:bidi w:val="1"/>
         <w:spacing w:before="0" w:after="120"/>
         <w:jc w:val="right"/>
       </w:pPr>
@@ -3783,14 +3524,12 @@
     </w:p>
     <w:p>
       <w:pPr>
-        <w:bidi w:val="1"/>
         <w:spacing w:before="0" w:after="120"/>
         <w:jc w:val="right"/>
       </w:pPr>
     </w:p>
     <w:p>
       <w:pPr>
-        <w:bidi w:val="1"/>
         <w:spacing w:before="200" w:after="120"/>
         <w:jc w:val="right"/>
       </w:pPr>
@@ -3810,7 +3549,6 @@
     </w:p>
     <w:p>
       <w:pPr>
-        <w:bidi w:val="1"/>
         <w:spacing w:before="0" w:after="120"/>
         <w:jc w:val="right"/>
       </w:pPr>
@@ -3827,7 +3565,6 @@
     </w:p>
     <w:p>
       <w:pPr>
-        <w:bidi w:val="1"/>
         <w:spacing w:before="0" w:after="120"/>
         <w:jc w:val="right"/>
       </w:pPr>
@@ -3846,7 +3583,6 @@
     </w:p>
     <w:p>
       <w:pPr>
-        <w:bidi w:val="1"/>
         <w:spacing w:before="0" w:after="120"/>
         <w:jc w:val="right"/>
       </w:pPr>
@@ -3863,7 +3599,6 @@
     </w:p>
     <w:p>
       <w:pPr>
-        <w:bidi w:val="1"/>
         <w:spacing w:before="0" w:after="120"/>
         <w:jc w:val="right"/>
       </w:pPr>
@@ -3880,14 +3615,12 @@
     </w:p>
     <w:p>
       <w:pPr>
-        <w:bidi w:val="1"/>
         <w:spacing w:before="0" w:after="120"/>
         <w:jc w:val="right"/>
       </w:pPr>
     </w:p>
     <w:p>
       <w:pPr>
-        <w:bidi w:val="1"/>
         <w:spacing w:before="200" w:after="120"/>
         <w:jc w:val="right"/>
       </w:pPr>
@@ -3907,7 +3640,6 @@
     </w:p>
     <w:p>
       <w:pPr>
-        <w:bidi w:val="1"/>
         <w:spacing w:before="0" w:after="120"/>
         <w:jc w:val="right"/>
       </w:pPr>
@@ -3924,7 +3656,6 @@
     </w:p>
     <w:p>
       <w:pPr>
-        <w:bidi w:val="1"/>
         <w:spacing w:before="0" w:after="120"/>
         <w:jc w:val="right"/>
       </w:pPr>
@@ -3941,7 +3672,6 @@
     </w:p>
     <w:p>
       <w:pPr>
-        <w:bidi w:val="1"/>
         <w:spacing w:before="0" w:after="120"/>
         <w:jc w:val="right"/>
       </w:pPr>
@@ -3978,7 +3708,6 @@
   <w:p>
     <w:pPr>
       <w:pStyle w:val="Footer"/>
-      <w:bidi w:val="1"/>
       <w:jc w:val="center"/>
     </w:pPr>
   </w:p>
@@ -3990,7 +3719,6 @@
   <w:p>
     <w:pPr>
       <w:pStyle w:val="Footer"/>
-      <w:bidi w:val="1"/>
       <w:jc w:val="center"/>
     </w:pPr>
   </w:p>
@@ -4002,7 +3730,6 @@
   <w:p>
     <w:pPr>
       <w:pStyle w:val="Header"/>
-      <w:bidi w:val="1"/>
       <w:jc w:val="center"/>
     </w:pPr>
   </w:p>
@@ -4014,7 +3741,6 @@
   <w:p>
     <w:pPr>
       <w:pStyle w:val="Header"/>
-      <w:bidi w:val="1"/>
       <w:jc w:val="center"/>
     </w:pPr>
   </w:p>
@@ -4385,7 +4111,6 @@
     <w:qFormat/>
     <w:rsid w:val="00FC693F"/>
     <w:pPr>
-      <w:bidi w:val="1"/>
       <w:jc w:val="right"/>
     </w:pPr>
     <w:rPr>

</xml_diff>